<commit_message>
Halfway through heat for vertical farm
Working through calculations for the vertical farm. Halfway through.
</commit_message>
<xml_diff>
--- a/Documentation.docx
+++ b/Documentation.docx
@@ -5272,12 +5272,699 @@
         </w:rPr>
         <w:t xml:space="preserve"> and the heat loss can be calculated using the area, the temperature difference and the assumed U-Values.</w:t>
       </w:r>
+      <w:r>
+        <w:rPr>
+          <w:lang w:val="en-GB"/>
+        </w:rPr>
+        <w:t xml:space="preserve"> </w:t>
+      </w:r>
     </w:p>
     <w:p>
       <w:pPr>
         <w:pStyle w:val="berschrift2"/>
       </w:pPr>
+      <w:r>
+        <w:t>Vertical Farm Design</w:t>
+      </w:r>
+    </w:p>
+    <w:p>
+      <w:pPr>
+        <w:rPr>
+          <w:lang w:val="en-GB" w:eastAsia="en-US"/>
+        </w:rPr>
+      </w:pPr>
+      <w:r>
+        <w:rPr>
+          <w:lang w:val="en-GB" w:eastAsia="en-US"/>
+        </w:rPr>
+        <w:t>The vertical farm is designed by calculating the maximum volume from the maximum possible area. The maximum possible area is itself calculated form an assumed heat loss per area, a design temperature and the available excess heat after the heat-losses from the fish tank. The actual size of the greenhouse depends on the thermal capacity of the heat-storage. The calculation is based on the following assumptions/data:</w:t>
+      </w:r>
+    </w:p>
+    <w:p>
+      <w:pPr>
+        <w:pStyle w:val="Listenabsatz"/>
+        <w:numPr>
+          <w:ilvl w:val="0"/>
+          <w:numId w:val="27"/>
+        </w:numPr>
+        <w:ind w:right="-1"/>
+        <w:rPr>
+          <w:lang w:val="en-GB"/>
+        </w:rPr>
+      </w:pPr>
+      <w:r>
+        <w:rPr>
+          <w:lang w:val="en-GB" w:eastAsia="en-US"/>
+        </w:rPr>
+        <w:t xml:space="preserve">Although data on the design temperature in </w:t>
+      </w:r>
+      <w:proofErr w:type="spellStart"/>
+      <w:r>
+        <w:rPr>
+          <w:lang w:val="en-GB" w:eastAsia="en-US"/>
+        </w:rPr>
+        <w:t>Berlevag</w:t>
+      </w:r>
+      <w:proofErr w:type="spellEnd"/>
+      <w:r>
+        <w:rPr>
+          <w:lang w:val="en-GB" w:eastAsia="en-US"/>
+        </w:rPr>
+        <w:t xml:space="preserve"> could not be found, </w:t>
+      </w:r>
+      <m:oMath>
+        <m:r>
+          <w:rPr>
+            <w:rFonts w:ascii="Cambria Math" w:hAnsi="Cambria Math"/>
+            <w:lang w:val="en-GB"/>
+          </w:rPr>
+          <m:t>-14 °C</m:t>
+        </m:r>
+      </m:oMath>
+      <w:r>
+        <w:rPr>
+          <w:lang w:val="en-GB"/>
+        </w:rPr>
+        <w:t xml:space="preserve"> is selected as a conservative </w:t>
+      </w:r>
+      <w:r>
+        <w:rPr>
+          <w:lang w:val="en-GB"/>
+        </w:rPr>
+        <w:t xml:space="preserve">assumption, based on weather data from </w:t>
+      </w:r>
+      <w:r>
+        <w:rPr>
+          <w:lang w:val="en-GB"/>
+        </w:rPr>
+        <w:fldChar w:fldCharType="begin"/>
+      </w:r>
+      <w:r>
+        <w:rPr>
+          <w:lang w:val="en-GB"/>
+        </w:rPr>
+        <w:instrText xml:space="preserve"> ADDIN ZOTERO_ITEM CSL_CITATION {"citationID":"572OG7OJ","properties":{"formattedCitation":"[15]","plainCitation":"[15]","noteIndex":0},"citationItems":[{"id":384,"uris":["http://zotero.org/groups/6447497/items/P5NJIHDH"],"itemData":{"id":384,"type":"webpage","title":"Berlevåg Climate, Weather By Month, Average Temperature (Norway) - Weather Spark","URL":"https://weatherspark.com/y/96283/Average-Weather-in-Berlev%C3%A5g-Norway-Year-Round","accessed":{"date-parts":[["2026",3,22]]}}}],"schema":"https://github.com/citation-style-language/schema/raw/master/csl-citation.json"} </w:instrText>
+      </w:r>
+      <w:r>
+        <w:rPr>
+          <w:lang w:val="en-GB"/>
+        </w:rPr>
+        <w:fldChar w:fldCharType="separate"/>
+      </w:r>
+      <w:r>
+        <w:rPr>
+          <w:lang w:val="en-GB"/>
+        </w:rPr>
+        <w:t>[15]</w:t>
+      </w:r>
+      <w:r>
+        <w:rPr>
+          <w:lang w:val="en-GB"/>
+        </w:rPr>
+        <w:fldChar w:fldCharType="end"/>
+      </w:r>
+      <w:r>
+        <w:rPr>
+          <w:lang w:val="en-GB"/>
+        </w:rPr>
+        <w:t xml:space="preserve">. </w:t>
+      </w:r>
+    </w:p>
+    <w:p>
+      <w:pPr>
+        <w:pStyle w:val="Listenabsatz"/>
+        <w:numPr>
+          <w:ilvl w:val="1"/>
+          <w:numId w:val="27"/>
+        </w:numPr>
+        <w:ind w:right="-1"/>
+        <w:rPr>
+          <w:lang w:val="en-GB"/>
+        </w:rPr>
+      </w:pPr>
+      <w:r>
+        <w:rPr>
+          <w:lang w:val="en-GB"/>
+        </w:rPr>
+        <w:t xml:space="preserve">The simulation calculates a heat loss of </w:t>
+      </w:r>
+      <m:oMath>
+        <m:r>
+          <w:rPr>
+            <w:rFonts w:ascii="Cambria Math" w:hAnsi="Cambria Math"/>
+            <w:lang w:val="en-GB"/>
+          </w:rPr>
+          <m:t>0.</m:t>
+        </m:r>
+        <m:r>
+          <w:rPr>
+            <w:rFonts w:ascii="Cambria Math" w:hAnsi="Cambria Math"/>
+            <w:lang w:val="en-GB"/>
+          </w:rPr>
+          <m:t>133</m:t>
+        </m:r>
+        <m:r>
+          <w:rPr>
+            <w:rFonts w:ascii="Cambria Math" w:hAnsi="Cambria Math"/>
+            <w:lang w:val="en-GB"/>
+          </w:rPr>
+          <m:t>2</m:t>
+        </m:r>
+        <m:r>
+          <w:rPr>
+            <w:rFonts w:ascii="Cambria Math" w:hAnsi="Cambria Math"/>
+            <w:lang w:val="en-GB"/>
+          </w:rPr>
+          <m:t xml:space="preserve"> MW</m:t>
+        </m:r>
+      </m:oMath>
+      <w:r>
+        <w:rPr>
+          <w:lang w:val="en-GB"/>
+        </w:rPr>
+        <w:t xml:space="preserve"> </w:t>
+      </w:r>
+      <w:r>
+        <w:rPr>
+          <w:lang w:val="en-GB"/>
+        </w:rPr>
+        <w:t xml:space="preserve">at an outdoor temperature of </w:t>
+      </w:r>
+      <m:oMath>
+        <m:r>
+          <w:rPr>
+            <w:rFonts w:ascii="Cambria Math" w:hAnsi="Cambria Math"/>
+            <w:lang w:val="en-GB"/>
+          </w:rPr>
+          <m:t>-14 °C</m:t>
+        </m:r>
+      </m:oMath>
+      <w:r>
+        <w:rPr>
+          <w:lang w:val="en-GB"/>
+        </w:rPr>
+        <w:t xml:space="preserve"> for the fish tank</w:t>
+      </w:r>
+      <w:r>
+        <w:rPr>
+          <w:lang w:val="en-GB"/>
+        </w:rPr>
+        <w:t xml:space="preserve"> and a power input of </w:t>
+      </w:r>
+      <m:oMath>
+        <m:r>
+          <w:rPr>
+            <w:rFonts w:ascii="Cambria Math" w:hAnsi="Cambria Math"/>
+            <w:lang w:val="en-GB"/>
+          </w:rPr>
+          <m:t>1.305 MW</m:t>
+        </m:r>
+      </m:oMath>
+      <w:r>
+        <w:rPr>
+          <w:lang w:val="en-GB"/>
+        </w:rPr>
+        <w:t xml:space="preserve"> (the average power input based on </w:t>
+      </w:r>
+      <w:r>
+        <w:rPr>
+          <w:lang w:val="en-GB"/>
+        </w:rPr>
+        <w:t>capacity, capacity factor and efficiency)</w:t>
+      </w:r>
+      <w:r>
+        <w:rPr>
+          <w:lang w:val="en-GB"/>
+        </w:rPr>
+        <w:t xml:space="preserve"> , leaving</w:t>
+      </w:r>
+      <w:r>
+        <w:rPr>
+          <w:lang w:val="en-GB"/>
+        </w:rPr>
+        <w:t xml:space="preserve"> approximately</w:t>
+      </w:r>
+      <w:r>
+        <w:rPr>
+          <w:lang w:val="en-GB"/>
+        </w:rPr>
+        <w:t xml:space="preserve"> </w:t>
+      </w:r>
+      <m:oMath>
+        <m:r>
+          <w:rPr>
+            <w:rFonts w:ascii="Cambria Math" w:hAnsi="Cambria Math"/>
+            <w:lang w:val="en-GB"/>
+          </w:rPr>
+          <m:t>0.2582 MW</m:t>
+        </m:r>
+      </m:oMath>
+      <w:r>
+        <w:rPr>
+          <w:lang w:val="en-GB"/>
+        </w:rPr>
+        <w:t xml:space="preserve"> to be dissipated from the vertical farm (based on calculations in the simulation).</w:t>
+      </w:r>
+    </w:p>
+    <w:p>
+      <w:pPr>
+        <w:pStyle w:val="Listenabsatz"/>
+        <w:numPr>
+          <w:ilvl w:val="0"/>
+          <w:numId w:val="27"/>
+        </w:numPr>
+        <w:rPr>
+          <w:lang w:val="en-GB" w:eastAsia="en-US"/>
+        </w:rPr>
+      </w:pPr>
+      <w:r>
+        <w:rPr>
+          <w:lang w:val="en-GB" w:eastAsia="en-US"/>
+        </w:rPr>
+        <w:t>The</w:t>
+      </w:r>
+      <w:r>
+        <w:rPr>
+          <w:lang w:val="en-GB" w:eastAsia="en-US"/>
+        </w:rPr>
+        <w:t xml:space="preserve"> vertical farm is designed to grow lettuce, as is the case in the </w:t>
+      </w:r>
+      <w:proofErr w:type="spellStart"/>
+      <w:r>
+        <w:rPr>
+          <w:lang w:val="en-GB" w:eastAsia="en-US"/>
+        </w:rPr>
+        <w:t>Berlevag</w:t>
+      </w:r>
+      <w:proofErr w:type="spellEnd"/>
+      <w:r>
+        <w:rPr>
+          <w:lang w:val="en-GB" w:eastAsia="en-US"/>
+        </w:rPr>
+        <w:t xml:space="preserve"> project </w:t>
+      </w:r>
+      <w:r>
+        <w:rPr>
+          <w:lang w:val="en-GB" w:eastAsia="en-US"/>
+        </w:rPr>
+        <w:fldChar w:fldCharType="begin"/>
+      </w:r>
+      <w:r>
+        <w:rPr>
+          <w:lang w:val="en-GB" w:eastAsia="en-US"/>
+        </w:rPr>
+        <w:instrText xml:space="preserve"> ADDIN ZOTERO_ITEM CSL_CITATION {"citationID":"gAa51JEF","properties":{"formattedCitation":"[16]","plainCitation":"[16]","noteIndex":0},"citationItems":[{"id":386,"uris":["http://zotero.org/groups/6447497/items/WP4TGPHP"],"itemData":{"id":386,"type":"webpage","abstract":"Visiting Berlevåg: Winds of Change.","container-title":"Arctic Economic Council","language":"en-US","title":"Visiting Berlevåg: Winds of Change","title-short":"Visiting Berlevåg","URL":"https://arcticeconomiccouncil.com/news/winds-of-change/","accessed":{"date-parts":[["2026",3,22]]},"issued":{"date-parts":[["2021",8,24]]}}}],"schema":"https://github.com/citation-style-language/schema/raw/master/csl-citation.json"} </w:instrText>
+      </w:r>
+      <w:r>
+        <w:rPr>
+          <w:lang w:val="en-GB" w:eastAsia="en-US"/>
+        </w:rPr>
+        <w:fldChar w:fldCharType="separate"/>
+      </w:r>
+      <w:r>
+        <w:rPr>
+          <w:lang w:val="en-GB" w:eastAsia="en-US"/>
+        </w:rPr>
+        <w:t>[16]</w:t>
+      </w:r>
+      <w:r>
+        <w:rPr>
+          <w:lang w:val="en-GB" w:eastAsia="en-US"/>
+        </w:rPr>
+        <w:fldChar w:fldCharType="end"/>
+      </w:r>
+      <w:r>
+        <w:rPr>
+          <w:lang w:val="en-GB" w:eastAsia="en-US"/>
+        </w:rPr>
+        <w:t>.</w:t>
+      </w:r>
+    </w:p>
+    <w:p>
+      <w:pPr>
+        <w:pStyle w:val="Listenabsatz"/>
+        <w:numPr>
+          <w:ilvl w:val="1"/>
+          <w:numId w:val="27"/>
+        </w:numPr>
+        <w:rPr>
+          <w:lang w:val="en-GB" w:eastAsia="en-US"/>
+        </w:rPr>
+      </w:pPr>
+      <w:r>
+        <w:rPr>
+          <w:lang w:val="en-GB" w:eastAsia="en-US"/>
+        </w:rPr>
+        <w:lastRenderedPageBreak/>
+        <w:t xml:space="preserve">The optimal growing temperature for lettuce and thus the indoor temperature of the vertical farm is assumed to be </w:t>
+      </w:r>
+      <m:oMath>
+        <m:r>
+          <w:rPr>
+            <w:rFonts w:ascii="Cambria Math" w:hAnsi="Cambria Math"/>
+            <w:lang w:val="en-GB" w:eastAsia="en-US"/>
+          </w:rPr>
+          <m:t>17°C</m:t>
+        </m:r>
+      </m:oMath>
+      <w:r>
+        <w:rPr>
+          <w:lang w:val="en-GB" w:eastAsia="en-US"/>
+        </w:rPr>
+        <w:t xml:space="preserve"> </w:t>
+      </w:r>
+      <w:r>
+        <w:rPr>
+          <w:lang w:val="en-GB" w:eastAsia="en-US"/>
+        </w:rPr>
+        <w:fldChar w:fldCharType="begin"/>
+      </w:r>
+      <w:r>
+        <w:rPr>
+          <w:lang w:val="en-GB" w:eastAsia="en-US"/>
+        </w:rPr>
+        <w:instrText xml:space="preserve"> ADDIN ZOTERO_ITEM CSL_CITATION {"citationID":"hlnBWBkD","properties":{"formattedCitation":"[17]","plainCitation":"[17]","noteIndex":0},"citationItems":[{"id":388,"uris":["http://zotero.org/groups/6447497/items/Y5F88AU2"],"itemData":{"id":388,"type":"webpage","abstract":"&lt;table align=\"right\" width=\"300\"&gt;\n  &lt;tr&gt;\n    &lt;td&gt;&lt;table align=\"right\" width=\"300\" border=\"1\"&gt;  \n      &lt;tr&gt;\n        &lt;td&gt;&lt;a href=\"/products/buttercrunch-bibb-butterhead-lettuce/\"&gt;&lt;img src=\"/media/products/width-400/lettuce-buttercrunch-11c960c52a0868288a5bd1790802098f.jpg\" alt=\"Buttercrunch Bibb Lettuce\" width=\"300\" hspace=\"4\" vspace=\"4\" /&gt;&lt;/a&gt;&lt;/td&gt;\n       &lt;/tr&gt;\n    &lt;tr&gt;&lt;td&gt;&lt;i&gt;&lt;center&gt;&lt;a href=\"/products/buttercrunch-bibb-butterhead-lettuce/\" style=\"color:black;text-decoration:none\"&gt;Buttercrunch Bibb Lettuce&lt;/a&gt;&lt;/center&gt;&lt;/i&gt;&lt;/a&gt;&lt;/td&gt;&lt;/tr&gt;\n  &lt;/tr&gt;\n    &lt;/table&gt;&lt;/td&gt;\n&lt;tr&gt;\n&lt;td&gt;&lt;table align=\"right\" width=\"300\" border=\"1\"&gt;  \n\t&lt;tr&gt;&lt;td&gt;&lt;img src=\"/images/culture/seedlings/lettuce-seedlings.jpg\" alt=\"Lettuce Seedlings\" width=\"300\" hspace=\"4\" vspace=\"4\" /&gt;&lt;/td&gt;&lt;/tr&gt;\n  &lt;tr&gt;&lt;td&gt;&lt;i&gt;&lt;center&gt;&lt;span style=\"color:black;text-decoration:none\"&gt;The largest of these lettuce seedlings are developing their first true leaves.&lt;/span&gt;&lt;/center&gt;&lt;/i&gt;&lt;/td&gt;&lt;/tr&gt;\n\n&lt;/table&gt;\n&lt;/td&gt;\n&lt;/tr&gt;\n&lt;/table&gt;&lt;p&gt;&lt;em&gt;Lactuca sativa&lt;/em&gt;&lt;/p&gt;\n&lt;p&gt;&lt;b&gt;How to Grow:&lt;/b&gt; Lettuce is a cool-weather crop that thrives in the temperature range\n  60-65 degrees F, and if thoroughly hardened, most varieties survive temperatures as\n  low as 20 degrees F. Cold-adapted varieties survive much lower temperatures. Seed\n  germinates best at about 75 degrees F. Lettuce seed will germinate at a temperature\n  as low as 40 degrees F. Early spring plantings should be made as hardened transplants\n  from seed started one month before setting outdoors. Later plantings can be direct-seeded. Sow seed 1/4&amp;quot; deep and thin to 10-16&amp;quot; apart depending\n  on the variety. Loose-leaf varieties may be planted more closely but\n  good air circulation should be maintained around the plants. Soil should be\n  cool and moist during the germination period. &lt;/p&gt;\n&lt;p&gt;&lt;b&gt;Germination Notes:&lt;/b&gt; If the\n  temperature exceeds 80 degrees F lettuce will often fail to germinate. Lettuce can be\n  planted during late summer or early fall while the days are still hot provided\n  that the seeds are germinated in the refrigerator for 4-6 days. Another method\n  is to soak seed in 10% bleach for 2 hours at 40-60 degrees F followed by 4 water rinses.\n  This method enhances both the speed and amount of germination. One more\n  method is to keep soil cool with burlap or boards; remove cover promptly\n  after germination to keep grasshoppers and other pests from enjoying the\n  shaded tender sprouts! &lt;/p&gt;\n&lt;p&gt;&lt;b&gt;Bolt Resistance:&lt;/b&gt; Resistance to bolting is highest\n  with loose-leaf lettuce, followed in order by romaine, butterhead, and bibb,\n  and crisphead. Lettuce bolts more readily if exposed to temperatures below\n  50 degrees F during the 2- to 3-leaf stage (the first three weeks after germination).\n  Thus, spring lettuce is best started indoors and transplanted out at least 3\n  weeks after sowing. Before the days become hot, mulch the plants to keep\n  the root temperature cool. In deep summer heat it's difficult to mature quality lettuce--heads become smaller and less sweet--at that\ntime of year, cucumber and tomato salads are the easiest!&lt;/p&gt;\n&lt;p&gt;&lt;b&gt;Harvest and Flavor Notes:&lt;/b&gt; The glucose content\n  of lettuce harvested in the morning may be 2-1/2 times greater than lettuce\n  harvested in the early afternoon. For best quality and maximum sweetness\n  harvest by 7-8 am, especially in summer. &lt;/p&gt;\n&lt;p&gt;&lt;b&gt;Greenhouse Note:&lt;/b&gt; Use heat-tolerant, loose leaf or bibb\n  types. &lt;/p&gt;\n&lt;p&gt;&lt;b&gt;Insect Pests and Diseases:&lt;/b&gt; In the greenhouse, control aphids by means\n  of ladybugs, sticky yellow traps or by insecticidal soap. Maintain good air\n  circulation around plants to reduce disease. &lt;/p&gt;\n&lt;p&gt;&lt;b&gt;Maturity Dates:&lt;/b&gt; Dates are from\n  direct seeding. Subtract 15-20 days for dates from transplanting. &lt;/p&gt;\n&lt;p&gt;&lt;b&gt;Seed Savers:&lt;/b&gt;\n  Isolate varieties by a minimum of 12' for home use. For pure seed isolate\n  varieties a minimum of 25-50'. &lt;/p&gt;\n&lt;p&gt;&lt;b&gt;Packet:&lt;/b&gt; 0.5g unless stated (approximately 400-625\n  seeds, depending on variety) sows 30' direct seeded or 175' as transplants.&lt;/p&gt;\n&lt;p&gt;&lt;a href=\"/categories/lettuce/\"&gt;All Our Lettuce varieties&lt;/a&gt;&lt;/p&gt;\n&lt;p&gt;&lt;b&gt;Extend Your Lettuce Season&lt;/b&gt;: Begin lettuce production early and keep\n  it going later in the season by covering plants with a Reemay blanket\n  (p. 87). Extend your harvest into early summer with this technique:\n  plant tall vegetables in north-south rows and plant heat-resistant lettuce\n  underneath the leaf canopy so that it is shaded during the hottest portion\n  of the day. Corn planted in rows 4 feet apart or pole beans on a fence\n  or trellis is ideal. Interplanting lettuce with bush squash also gives good\n  results. Mulch the lettuce well, keep well watered and enjoy!&lt;/p&gt;\n&lt;hr&gt;\n&lt;p&gt;&lt;strong&gt;Romaine (Cos) Lettuce&lt;/strong&gt;&lt;/p&gt;\n&lt;p&gt;Romaine lettuce produces upright, elongated tall heads with thick succulent\n  ribs and distinctively flavored long thick crinkled leaves. Moderately\n  tolerant of heat and shade, romaine does best in a loose fertile soil, and\n  is the most nutritious type of lettuce.&lt;/p&gt;\n&lt;p&gt;Buttercos lettuce has the characteristics of both butterhead and cos.&lt;/p&gt;\n&lt;p&gt;&lt;a href=\"/categories/romaine-cos-lettuce/\"&gt;Romaine (Cos) Lettuce varieties&lt;/a&gt;&lt;/p&gt;\n&lt;p&gt;&lt;strong&gt;Loose-Leaf Lettuce&lt;/strong&gt;&lt;/p&gt;\n&lt;p&gt;Loose-leaf lettuce is a non-heading type of lettuce, second to romaine in\n  nutritional value, and generally the easiest type for gardeners to grow. As a\n  group it is the most forgiving of poor soil, is generally more heat-tolerant,\n  and contains the largest diversity of attractive heirlooms.&lt;/p&gt;\n&lt;p&gt;&lt;a href=\"/categories/loose-leaf-lettuce/\"&gt;Loose-Leaf Lettuce varieties&lt;/a&gt;&lt;/p&gt;\n&lt;p&gt;&lt;strong&gt;Bibb (Butterhead) Lettuce&lt;/strong&gt;&lt;/p&gt;\n&lt;p&gt;Bibb lettuce is more tolerant of hot weather than crisphead lettuce.\n  As a group it is best for cooler regions, with some notable exceptions.\n  Intermediate in nutritional value, it has small loose green heads with\n  blanched yellow interiors and thin, soft-textured leaves.&lt;/p&gt;\n&lt;p&gt;&lt;a href=\"/categories/bibb-butterhead-lettuce/\"&gt;Bibb (Butterhead) Lettuce varieties&lt;/a&gt;&lt;/p&gt;\n&lt;p&gt;&lt;strong&gt;Crisphead &amp;amp; Batavian Lettuce&lt;/strong&gt;&lt;/p&gt;\n&lt;p&gt;Crisphead lettuce is the most popular type, appreciated for its tightly\n  folded blanched crisp leaves, though less nutritious than other types.\n  Because it is harder to grow to perfection, we offer varieties that are more\n  adapted for hot regions. Crisphead lettuce should be set out early in the\n  season since it requires a long cool season. If heads have not formed\n  by late spring, shading with cheesecloth or screening is recommended.&lt;/p&gt;\n&lt;p&gt;&lt;a href=\"/categories/crisphead-batvian-lettuce/\"&gt;Crisphead &amp;amp; Batavian Lettuce varieties&lt;/a&gt;&lt;/p&gt;\n&lt;p&gt; &lt;a href=\"/growing-guides/\"&gt;All Our Growing Guides&lt;/a&gt;&lt;/p&gt;\n\n\n&lt;a href=\"http://www.southernexposure.com/index.php?main_page=product_info&amp;amp;cPath=3_57_138&amp;amp;products_id=978\"&gt;&lt;/a&gt;\n&lt;p&gt;","container-title":"Southern Exposure Seed Exchange","language":"en-US","title":"Lettuce Growing Guide","URL":"https://www.southernexposure.com/lettuce-growing-guide/","accessed":{"date-parts":[["2026",3,22]]}}}],"schema":"https://github.com/citation-style-language/schema/raw/master/csl-citation.json"} </w:instrText>
+      </w:r>
+      <w:r>
+        <w:rPr>
+          <w:lang w:val="en-GB" w:eastAsia="en-US"/>
+        </w:rPr>
+        <w:fldChar w:fldCharType="separate"/>
+      </w:r>
+      <w:r>
+        <w:rPr>
+          <w:lang w:val="en-GB" w:eastAsia="en-US"/>
+        </w:rPr>
+        <w:t>[17]</w:t>
+      </w:r>
+      <w:r>
+        <w:rPr>
+          <w:lang w:val="en-GB" w:eastAsia="en-US"/>
+        </w:rPr>
+        <w:fldChar w:fldCharType="end"/>
+      </w:r>
+      <w:r>
+        <w:rPr>
+          <w:lang w:val="en-GB" w:eastAsia="en-US"/>
+        </w:rPr>
+        <w:t xml:space="preserve"> </w:t>
+      </w:r>
+    </w:p>
+    <w:p>
+      <w:pPr>
+        <w:pStyle w:val="Listenabsatz"/>
+        <w:numPr>
+          <w:ilvl w:val="0"/>
+          <w:numId w:val="27"/>
+        </w:numPr>
+        <w:rPr>
+          <w:lang w:val="en-GB" w:eastAsia="en-US"/>
+        </w:rPr>
+      </w:pPr>
+      <w:r>
+        <w:rPr>
+          <w:lang w:val="en-GB" w:eastAsia="en-US"/>
+        </w:rPr>
+        <w:t xml:space="preserve">The U-Value is calculated based on data from </w:t>
+      </w:r>
+      <w:r>
+        <w:rPr>
+          <w:lang w:val="en-GB" w:eastAsia="en-US"/>
+        </w:rPr>
+        <w:fldChar w:fldCharType="begin"/>
+      </w:r>
+      <w:r>
+        <w:rPr>
+          <w:lang w:val="en-GB" w:eastAsia="en-US"/>
+        </w:rPr>
+        <w:instrText xml:space="preserve"> ADDIN ZOTERO_ITEM CSL_CITATION {"citationID":"X9bElBcj","properties":{"formattedCitation":"[18]","plainCitation":"[18]","noteIndex":0},"citationItems":[{"id":378,"uris":["http://zotero.org/groups/6447497/items/J8R7ICF8"],"itemData":{"id":378,"type":"article-journal","container-title":"Applied Thermal Engineering","DOI":"10.1016/j.applthermaleng.2025.127623","ISSN":"13594311","journalAbbreviation":"Applied Thermal Engineering","language":"en","page":"127623","source":"DOI.org (Crossref)","title":"Thermo-economic optimization of vertical farms exploring multiple design options for the built environment and HVAC system","volume":"279","author":[{"family":"Pelella","given":"Francesco"},{"family":"Viscito","given":"Luca"},{"family":"Napoli","given":"Giovanni"},{"family":"Tariello","given":"Francesco"},{"family":"Pantaleo","given":"Antonio Marco"},{"family":"Cabeza","given":"Luisa F."},{"family":"Mauro","given":"Alfonso William"}],"issued":{"date-parts":[["2025",11]]}}}],"schema":"https://github.com/citation-style-language/schema/raw/master/csl-citation.json"} </w:instrText>
+      </w:r>
+      <w:r>
+        <w:rPr>
+          <w:lang w:val="en-GB" w:eastAsia="en-US"/>
+        </w:rPr>
+        <w:fldChar w:fldCharType="separate"/>
+      </w:r>
+      <w:r>
+        <w:rPr>
+          <w:lang w:val="en-GB" w:eastAsia="en-US"/>
+        </w:rPr>
+        <w:t>[18]</w:t>
+      </w:r>
+      <w:r>
+        <w:rPr>
+          <w:lang w:val="en-GB" w:eastAsia="en-US"/>
+        </w:rPr>
+        <w:fldChar w:fldCharType="end"/>
+      </w:r>
+      <w:r>
+        <w:rPr>
+          <w:lang w:val="en-GB" w:eastAsia="en-US"/>
+        </w:rPr>
+        <w:t xml:space="preserve">, where investment cost and output of vertical farms are compared with a focus on the thermal properties of the envelope. It is assumed that similar insulation </w:t>
+      </w:r>
+      <w:r>
+        <w:rPr>
+          <w:lang w:val="en-GB" w:eastAsia="en-US"/>
+        </w:rPr>
+        <w:t>would be used in this project.</w:t>
+      </w:r>
+      <w:r>
+        <w:rPr>
+          <w:lang w:val="en-GB" w:eastAsia="en-US"/>
+        </w:rPr>
+        <w:t xml:space="preserve"> </w:t>
+      </w:r>
+    </w:p>
+    <w:p>
+      <w:pPr>
+        <w:pStyle w:val="Listenabsatz"/>
+        <w:numPr>
+          <w:ilvl w:val="1"/>
+          <w:numId w:val="27"/>
+        </w:numPr>
+        <w:rPr>
+          <w:lang w:val="en-GB" w:eastAsia="en-US"/>
+        </w:rPr>
+      </w:pPr>
+      <w:r>
+        <w:rPr>
+          <w:lang w:val="en-GB" w:eastAsia="en-US"/>
+        </w:rPr>
+        <w:t xml:space="preserve">For the climate zone of </w:t>
+      </w:r>
+      <w:proofErr w:type="gramStart"/>
+      <w:r>
+        <w:rPr>
+          <w:lang w:val="en-GB" w:eastAsia="en-US"/>
+        </w:rPr>
+        <w:t>Helsinki</w:t>
+      </w:r>
+      <w:proofErr w:type="gramEnd"/>
+      <w:r>
+        <w:rPr>
+          <w:lang w:val="en-GB" w:eastAsia="en-US"/>
+        </w:rPr>
+        <w:t xml:space="preserve"> the optimal </w:t>
+      </w:r>
+      <w:r>
+        <w:rPr>
+          <w:lang w:val="en-GB" w:eastAsia="en-US"/>
+        </w:rPr>
+        <w:t>insulation</w:t>
+      </w:r>
+      <w:r>
+        <w:rPr>
+          <w:lang w:val="en-GB" w:eastAsia="en-US"/>
+        </w:rPr>
+        <w:t xml:space="preserve"> material is </w:t>
+      </w:r>
+      <w:r>
+        <w:rPr>
+          <w:lang w:val="en-GB" w:eastAsia="en-US"/>
+        </w:rPr>
+        <w:t>Expanded Polystyrene (</w:t>
+      </w:r>
+      <w:r>
+        <w:rPr>
+          <w:lang w:val="en-GB" w:eastAsia="en-US"/>
+        </w:rPr>
+        <w:t>EPS</w:t>
+      </w:r>
+      <w:r>
+        <w:rPr>
+          <w:lang w:val="en-GB" w:eastAsia="en-US"/>
+        </w:rPr>
+        <w:t>)</w:t>
+      </w:r>
+    </w:p>
+    <w:p>
+      <w:pPr>
+        <w:pStyle w:val="Listenabsatz"/>
+        <w:numPr>
+          <w:ilvl w:val="1"/>
+          <w:numId w:val="27"/>
+        </w:numPr>
+        <w:rPr>
+          <w:lang w:val="en-GB" w:eastAsia="en-US"/>
+        </w:rPr>
+      </w:pPr>
+      <w:r>
+        <w:rPr>
+          <w:lang w:val="en-GB" w:eastAsia="en-US"/>
+        </w:rPr>
+        <w:t xml:space="preserve">The optimal </w:t>
+      </w:r>
+      <w:r>
+        <w:rPr>
+          <w:lang w:val="en-GB" w:eastAsia="en-US"/>
+        </w:rPr>
+        <w:t xml:space="preserve">insulation </w:t>
+      </w:r>
+      <w:r>
+        <w:rPr>
+          <w:lang w:val="en-GB" w:eastAsia="en-US"/>
+        </w:rPr>
+        <w:t xml:space="preserve">thickness is </w:t>
+      </w:r>
+      <w:r>
+        <w:rPr>
+          <w:lang w:val="en-GB" w:eastAsia="en-US"/>
+        </w:rPr>
+        <w:t>200 mm</w:t>
+      </w:r>
+    </w:p>
+    <w:p>
+      <w:pPr>
+        <w:pStyle w:val="Listenabsatz"/>
+        <w:numPr>
+          <w:ilvl w:val="1"/>
+          <w:numId w:val="27"/>
+        </w:numPr>
+        <w:rPr>
+          <w:lang w:val="en-GB" w:eastAsia="en-US"/>
+        </w:rPr>
+      </w:pPr>
+      <w:r>
+        <w:rPr>
+          <w:lang w:val="en-GB" w:eastAsia="en-US"/>
+        </w:rPr>
+        <w:t xml:space="preserve">Using an online U-value calculator, the resulting U-value is </w:t>
+      </w:r>
+      <m:oMath>
+        <m:r>
+          <w:rPr>
+            <w:rFonts w:ascii="Cambria Math" w:hAnsi="Cambria Math"/>
+            <w:lang w:val="en-GB" w:eastAsia="en-US"/>
+          </w:rPr>
+          <m:t>0.18</m:t>
+        </m:r>
+        <m:f>
+          <m:fPr>
+            <m:ctrlPr>
+              <w:rPr>
+                <w:rFonts w:ascii="Cambria Math" w:hAnsi="Cambria Math"/>
+                <w:i/>
+                <w:lang w:val="en-GB" w:eastAsia="en-US"/>
+              </w:rPr>
+            </m:ctrlPr>
+          </m:fPr>
+          <m:num>
+            <m:r>
+              <w:rPr>
+                <w:rFonts w:ascii="Cambria Math" w:hAnsi="Cambria Math"/>
+                <w:lang w:val="en-GB" w:eastAsia="en-US"/>
+              </w:rPr>
+              <m:t>W</m:t>
+            </m:r>
+          </m:num>
+          <m:den>
+            <m:sSup>
+              <m:sSupPr>
+                <m:ctrlPr>
+                  <w:rPr>
+                    <w:rFonts w:ascii="Cambria Math" w:hAnsi="Cambria Math"/>
+                    <w:i/>
+                    <w:lang w:val="en-GB" w:eastAsia="en-US"/>
+                  </w:rPr>
+                </m:ctrlPr>
+              </m:sSupPr>
+              <m:e>
+                <m:r>
+                  <w:rPr>
+                    <w:rFonts w:ascii="Cambria Math" w:hAnsi="Cambria Math"/>
+                    <w:lang w:val="en-GB" w:eastAsia="en-US"/>
+                  </w:rPr>
+                  <m:t>m</m:t>
+                </m:r>
+              </m:e>
+              <m:sup>
+                <m:r>
+                  <w:rPr>
+                    <w:rFonts w:ascii="Cambria Math" w:hAnsi="Cambria Math"/>
+                    <w:lang w:val="en-GB" w:eastAsia="en-US"/>
+                  </w:rPr>
+                  <m:t>2</m:t>
+                </m:r>
+              </m:sup>
+            </m:sSup>
+            <m:r>
+              <w:rPr>
+                <w:rFonts w:ascii="Cambria Math" w:hAnsi="Cambria Math"/>
+                <w:lang w:val="en-GB" w:eastAsia="en-US"/>
+              </w:rPr>
+              <m:t>K</m:t>
+            </m:r>
+          </m:den>
+        </m:f>
+      </m:oMath>
+      <w:r>
+        <w:rPr>
+          <w:lang w:val="en-GB" w:eastAsia="en-US"/>
+        </w:rPr>
+        <w:t xml:space="preserve"> </w:t>
+      </w:r>
+      <w:r>
+        <w:rPr>
+          <w:lang w:val="en-GB" w:eastAsia="en-US"/>
+        </w:rPr>
+        <w:fldChar w:fldCharType="begin"/>
+      </w:r>
+      <w:r>
+        <w:rPr>
+          <w:lang w:val="en-GB" w:eastAsia="en-US"/>
+        </w:rPr>
+        <w:instrText xml:space="preserve"> ADDIN ZOTERO_ITEM CSL_CITATION {"citationID":"XTGy8Y0k","properties":{"formattedCitation":"[19]","plainCitation":"[19]","noteIndex":0},"citationItems":[{"id":383,"uris":["http://zotero.org/groups/6447497/items/CVQLW26L"],"itemData":{"id":383,"type":"webpage","title":"U-Value Calculator : ChangePlan","URL":"https://www.changeplan.co.uk/u_value_calculator.php","accessed":{"date-parts":[["2026",3,22]]}}}],"schema":"https://github.com/citation-style-language/schema/raw/master/csl-citation.json"} </w:instrText>
+      </w:r>
+      <w:r>
+        <w:rPr>
+          <w:lang w:val="en-GB" w:eastAsia="en-US"/>
+        </w:rPr>
+        <w:fldChar w:fldCharType="separate"/>
+      </w:r>
+      <w:r>
+        <w:rPr>
+          <w:lang w:val="en-GB" w:eastAsia="en-US"/>
+        </w:rPr>
+        <w:t>[19]</w:t>
+      </w:r>
+      <w:r>
+        <w:rPr>
+          <w:lang w:val="en-GB" w:eastAsia="en-US"/>
+        </w:rPr>
+        <w:fldChar w:fldCharType="end"/>
+      </w:r>
+    </w:p>
+    <w:p>
+      <w:pPr>
+        <w:pStyle w:val="berschrift2"/>
+      </w:pPr>
       <w:bookmarkStart w:id="13" w:name="_Toc225009478"/>
+    </w:p>
+    <w:p>
+      <w:pPr>
+        <w:pStyle w:val="berschrift2"/>
+      </w:pPr>
       <w:r>
         <w:t>Parameters</w:t>
       </w:r>
@@ -5504,13 +6191,13 @@
               <w:rPr>
                 <w:lang w:val="en-GB"/>
               </w:rPr>
-              <w:instrText xml:space="preserve"> ADDIN ZOTERO_ITEM CSL_CITATION {"citationID":"DSsI2lzZ","properties":{"formattedCitation":"[15]","plainCitation":"[15]","noteIndex":0},"citationItems":[{"id":343,"uris":["http://zotero.org/groups/6447497/items/SRB46M8K"],"itemData":{"id":343,"type":"post-weblog","language":"en-GB","title":"Haeolus – Hydrogen-Aeolic Energy with Optimised eLectrolysers Upstream of Substation","URL":"https://haeolus.eu/","accessed":{"date-parts":[["2026",3,6]]},"issued":{"date-parts":[["2024",1,8]]}}}],"schema":"https://github.com/citation-style-language/schema/raw/master/csl-citation.json"} </w:instrText>
+              <w:instrText xml:space="preserve"> ADDIN ZOTERO_ITEM CSL_CITATION {"citationID":"DSsI2lzZ","properties":{"formattedCitation":"[20]","plainCitation":"[20]","noteIndex":0},"citationItems":[{"id":343,"uris":["http://zotero.org/groups/6447497/items/SRB46M8K"],"itemData":{"id":343,"type":"post-weblog","language":"en-GB","title":"Haeolus – Hydrogen-Aeolic Energy with Optimised eLectrolysers Upstream of Substation","URL":"https://haeolus.eu/","accessed":{"date-parts":[["2026",3,6]]},"issued":{"date-parts":[["2024",1,8]]}}}],"schema":"https://github.com/citation-style-language/schema/raw/master/csl-citation.json"} </w:instrText>
             </w:r>
             <w:r>
               <w:fldChar w:fldCharType="separate"/>
             </w:r>
             <w:r>
-              <w:t>[15]</w:t>
+              <w:t>[20]</w:t>
             </w:r>
             <w:r>
               <w:fldChar w:fldCharType="end"/>
@@ -5588,13 +6275,13 @@
               <w:rPr>
                 <w:lang w:val="en-GB"/>
               </w:rPr>
-              <w:instrText xml:space="preserve"> ADDIN ZOTERO_ITEM CSL_CITATION {"citationID":"gPCdkhXq","properties":{"formattedCitation":"[16]","plainCitation":"[16]","noteIndex":0},"citationItems":[{"id":359,"uris":["http://zotero.org/groups/6447497/items/SS8CMKJN"],"itemData":{"id":359,"type":"article-journal","abstract":"This study investigates the impact of including (or neglecting) the variable efficiency of hydrogen electrolyzers as a function of operating power in the modelling of green hydrogen produced from variable renewable energy sources. Results show that neglecting the variable electrolyzer efficiency, as is commonly done in studies of green hydrogen, leads to significant overestimation of hydrogen production in the range of 5–24%. The effects of the time resolution used in models are also investigated, as well as the impact of including the option for the electrolyzer to switch to stand-by mode instead of powering down and electrolyzer ramp rate constraints. Results indicate that these have a minor effect on overall hydrogen production, with the use of hour resolution data leading to overestimation in the range of 0.2–2%, relative to using 5-min data. This study used data from three solar farms and three wind in Australia, from which it is observed that wind farms produced 55% more hydrogen than the solar farms. The results in this study highlight the critical importance of including the variable efficiency of electrolyzers in the modelling of green hydrogen production. As this industry scales, continuing to neglect this effect would lead to the overestimation of hydrogen production by tens of megatonnes.","container-title":"International Journal of Hydrogen Energy","DOI":"10.1016/j.ijhydene.2024.05.360","ISSN":"0360-3199","journalAbbreviation":"International Journal of Hydrogen Energy","page":"49-59","source":"ScienceDirect","title":"Ignore variability, overestimate hydrogen production – Quantifying the effects of electrolyzer efficiency curves on hydrogen production from renewable energy sources","volume":"72","author":[{"family":"Virah-Sawmy","given":"Dan"},{"family":"Beck","given":"Fiona J."},{"family":"Sturmberg","given":"Bjorn"}],"issued":{"date-parts":[["2024",6,27]]}}}],"schema":"https://github.com/citation-style-language/schema/raw/master/csl-citation.json"} </w:instrText>
+              <w:instrText xml:space="preserve"> ADDIN ZOTERO_ITEM CSL_CITATION {"citationID":"gPCdkhXq","properties":{"formattedCitation":"[21]","plainCitation":"[21]","noteIndex":0},"citationItems":[{"id":359,"uris":["http://zotero.org/groups/6447497/items/SS8CMKJN"],"itemData":{"id":359,"type":"article-journal","abstract":"This study investigates the impact of including (or neglecting) the variable efficiency of hydrogen electrolyzers as a function of operating power in the modelling of green hydrogen produced from variable renewable energy sources. Results show that neglecting the variable electrolyzer efficiency, as is commonly done in studies of green hydrogen, leads to significant overestimation of hydrogen production in the range of 5–24%. The effects of the time resolution used in models are also investigated, as well as the impact of including the option for the electrolyzer to switch to stand-by mode instead of powering down and electrolyzer ramp rate constraints. Results indicate that these have a minor effect on overall hydrogen production, with the use of hour resolution data leading to overestimation in the range of 0.2–2%, relative to using 5-min data. This study used data from three solar farms and three wind in Australia, from which it is observed that wind farms produced 55% more hydrogen than the solar farms. The results in this study highlight the critical importance of including the variable efficiency of electrolyzers in the modelling of green hydrogen production. As this industry scales, continuing to neglect this effect would lead to the overestimation of hydrogen production by tens of megatonnes.","container-title":"International Journal of Hydrogen Energy","DOI":"10.1016/j.ijhydene.2024.05.360","ISSN":"0360-3199","journalAbbreviation":"International Journal of Hydrogen Energy","page":"49-59","source":"ScienceDirect","title":"Ignore variability, overestimate hydrogen production – Quantifying the effects of electrolyzer efficiency curves on hydrogen production from renewable energy sources","volume":"72","author":[{"family":"Virah-Sawmy","given":"Dan"},{"family":"Beck","given":"Fiona J."},{"family":"Sturmberg","given":"Bjorn"}],"issued":{"date-parts":[["2024",6,27]]}}}],"schema":"https://github.com/citation-style-language/schema/raw/master/csl-citation.json"} </w:instrText>
             </w:r>
             <w:r>
               <w:fldChar w:fldCharType="separate"/>
             </w:r>
             <w:r>
-              <w:t>[16]</w:t>
+              <w:t>[21]</w:t>
             </w:r>
             <w:r>
               <w:fldChar w:fldCharType="end"/>
@@ -5796,13 +6483,13 @@
               <w:rPr>
                 <w:lang w:val="en-GB"/>
               </w:rPr>
-              <w:instrText xml:space="preserve"> ADDIN ZOTERO_ITEM CSL_CITATION {"citationID":"eSBSfdEq","properties":{"formattedCitation":"[17]","plainCitation":"[17]","noteIndex":0},"citationItems":[{"id":358,"uris":["http://zotero.org/groups/6447497/items/ZK2PQ9AW"],"itemData":{"id":358,"type":"book","ISBN":"3-527-33342-8","language":"English","title":"Hydrogen Production by Electrolysis","author":[{"family":"Godula-Jopek","given":"Agata"}],"issued":{"date-parts":[["2015",7,7]]}}}],"schema":"https://github.com/citation-style-language/schema/raw/master/csl-citation.json"} </w:instrText>
+              <w:instrText xml:space="preserve"> ADDIN ZOTERO_ITEM CSL_CITATION {"citationID":"eSBSfdEq","properties":{"formattedCitation":"[22]","plainCitation":"[22]","noteIndex":0},"citationItems":[{"id":358,"uris":["http://zotero.org/groups/6447497/items/ZK2PQ9AW"],"itemData":{"id":358,"type":"book","ISBN":"3-527-33342-8","language":"English","title":"Hydrogen Production by Electrolysis","author":[{"family":"Godula-Jopek","given":"Agata"}],"issued":{"date-parts":[["2015",7,7]]}}}],"schema":"https://github.com/citation-style-language/schema/raw/master/csl-citation.json"} </w:instrText>
             </w:r>
             <w:r>
               <w:fldChar w:fldCharType="separate"/>
             </w:r>
             <w:r>
-              <w:t>[17]</w:t>
+              <w:t>[22]</w:t>
             </w:r>
             <w:r>
               <w:fldChar w:fldCharType="end"/>
@@ -6329,7 +7016,6 @@
             </w:pPr>
             <w:proofErr w:type="spellStart"/>
             <w:r>
-              <w:lastRenderedPageBreak/>
               <w:t>rho_air</w:t>
             </w:r>
             <w:proofErr w:type="spellEnd"/>
@@ -6548,6 +7234,7 @@
           <w:b/>
           <w:bCs/>
         </w:rPr>
+        <w:lastRenderedPageBreak/>
         <w:t>Stocks</w:t>
       </w:r>
     </w:p>
@@ -11386,42 +12073,98 @@
         <w:rPr>
           <w:rFonts w:ascii="Times New Roman" w:hAnsi="Times New Roman" w:cs="Times New Roman"/>
         </w:rPr>
-        <w:t>Haeolus</w:t>
+        <w:t>Berlevåg</w:t>
       </w:r>
       <w:proofErr w:type="spellEnd"/>
       <w:r>
         <w:rPr>
           <w:rFonts w:ascii="Times New Roman" w:hAnsi="Times New Roman" w:cs="Times New Roman"/>
         </w:rPr>
-        <w:t xml:space="preserve"> – Hydrogen-Aeolic Energy with </w:t>
+        <w:t xml:space="preserve"> Climate, Weather </w:t>
+      </w:r>
+      <w:proofErr w:type="gramStart"/>
+      <w:r>
+        <w:rPr>
+          <w:rFonts w:ascii="Times New Roman" w:hAnsi="Times New Roman" w:cs="Times New Roman"/>
+        </w:rPr>
+        <w:t>By</w:t>
+      </w:r>
+      <w:proofErr w:type="gramEnd"/>
+      <w:r>
+        <w:rPr>
+          <w:rFonts w:ascii="Times New Roman" w:hAnsi="Times New Roman" w:cs="Times New Roman"/>
+        </w:rPr>
+        <w:t xml:space="preserve"> Month, Average Temperature (Norway) - Weather Spark’. Accessed: Mar. 22, 2026. [Online]. Available: https://weatherspark.com/y/96283/Average-Weather-in-Berlev%C3%A5g-Norway-Year-Round</w:t>
+      </w:r>
+    </w:p>
+    <w:p>
+      <w:pPr>
+        <w:pStyle w:val="Literaturverzeichnis"/>
+        <w:rPr>
+          <w:rFonts w:ascii="Times New Roman" w:hAnsi="Times New Roman" w:cs="Times New Roman"/>
+        </w:rPr>
+      </w:pPr>
+      <w:r>
+        <w:rPr>
+          <w:rFonts w:ascii="Times New Roman" w:hAnsi="Times New Roman" w:cs="Times New Roman"/>
+        </w:rPr>
+        <w:t>[16]</w:t>
+      </w:r>
+      <w:r>
+        <w:rPr>
+          <w:rFonts w:ascii="Times New Roman" w:hAnsi="Times New Roman" w:cs="Times New Roman"/>
+        </w:rPr>
+        <w:tab/>
+        <w:t xml:space="preserve">‘Visiting </w:t>
       </w:r>
       <w:proofErr w:type="spellStart"/>
       <w:r>
         <w:rPr>
           <w:rFonts w:ascii="Times New Roman" w:hAnsi="Times New Roman" w:cs="Times New Roman"/>
         </w:rPr>
-        <w:t>Optimised</w:t>
+        <w:t>Berlevåg</w:t>
       </w:r>
       <w:proofErr w:type="spellEnd"/>
       <w:r>
         <w:rPr>
           <w:rFonts w:ascii="Times New Roman" w:hAnsi="Times New Roman" w:cs="Times New Roman"/>
         </w:rPr>
-        <w:t xml:space="preserve"> </w:t>
-      </w:r>
-      <w:proofErr w:type="spellStart"/>
-      <w:r>
+        <w:t>: Winds of Change’, Arctic Economic Council. Accessed: Mar. 22, 2026. [Online]. Available: https://arcticeconomiccouncil.com/news/winds-of-change/</w:t>
+      </w:r>
+    </w:p>
+    <w:p>
+      <w:pPr>
+        <w:pStyle w:val="Literaturverzeichnis"/>
         <w:rPr>
           <w:rFonts w:ascii="Times New Roman" w:hAnsi="Times New Roman" w:cs="Times New Roman"/>
         </w:rPr>
-        <w:t>eLectrolysers</w:t>
-      </w:r>
-      <w:proofErr w:type="spellEnd"/>
+      </w:pPr>
       <w:r>
         <w:rPr>
           <w:rFonts w:ascii="Times New Roman" w:hAnsi="Times New Roman" w:cs="Times New Roman"/>
         </w:rPr>
-        <w:t xml:space="preserve"> Upstream of Substation’. Accessed: Mar. 06, 2026. [Online]. Available: https://haeolus.eu/</w:t>
+        <w:t>[17</w:t>
+      </w:r>
+      <w:proofErr w:type="gramStart"/>
+      <w:r>
+        <w:rPr>
+          <w:rFonts w:ascii="Times New Roman" w:hAnsi="Times New Roman" w:cs="Times New Roman"/>
+        </w:rPr>
+        <w:t>]</w:t>
+      </w:r>
+      <w:r>
+        <w:rPr>
+          <w:rFonts w:ascii="Times New Roman" w:hAnsi="Times New Roman" w:cs="Times New Roman"/>
+        </w:rPr>
+        <w:tab/>
+        <w:t>‘</w:t>
+      </w:r>
+      <w:proofErr w:type="gramEnd"/>
+      <w:r>
+        <w:rPr>
+          <w:rFonts w:ascii="Times New Roman" w:hAnsi="Times New Roman" w:cs="Times New Roman"/>
+        </w:rPr>
+        <w:t>Lettuce Growing Guide’, Southern Exposure Seed Exchange. Accessed: Mar. 22, 2026. [Online]. Available: https://www.southernexposure.com/lettuce-growing-guide/</w:t>
       </w:r>
     </w:p>
     <w:p>
@@ -11435,56 +12178,14 @@
         <w:rPr>
           <w:rFonts w:ascii="Times New Roman" w:hAnsi="Times New Roman" w:cs="Times New Roman"/>
         </w:rPr>
-        <w:t>[16]</w:t>
+        <w:t>[18]</w:t>
       </w:r>
       <w:r>
         <w:rPr>
           <w:rFonts w:ascii="Times New Roman" w:hAnsi="Times New Roman" w:cs="Times New Roman"/>
         </w:rPr>
         <w:tab/>
-        <w:t xml:space="preserve">D. </w:t>
-      </w:r>
-      <w:proofErr w:type="spellStart"/>
-      <w:r>
-        <w:rPr>
-          <w:rFonts w:ascii="Times New Roman" w:hAnsi="Times New Roman" w:cs="Times New Roman"/>
-        </w:rPr>
-        <w:t>Virah</w:t>
-      </w:r>
-      <w:proofErr w:type="spellEnd"/>
-      <w:r>
-        <w:rPr>
-          <w:rFonts w:ascii="Times New Roman" w:hAnsi="Times New Roman" w:cs="Times New Roman"/>
-        </w:rPr>
-        <w:t xml:space="preserve">-Sawmy, F. J. Beck, and B. </w:t>
-      </w:r>
-      <w:proofErr w:type="spellStart"/>
-      <w:r>
-        <w:rPr>
-          <w:rFonts w:ascii="Times New Roman" w:hAnsi="Times New Roman" w:cs="Times New Roman"/>
-        </w:rPr>
-        <w:t>Sturmberg</w:t>
-      </w:r>
-      <w:proofErr w:type="spellEnd"/>
-      <w:r>
-        <w:rPr>
-          <w:rFonts w:ascii="Times New Roman" w:hAnsi="Times New Roman" w:cs="Times New Roman"/>
-        </w:rPr>
-        <w:t xml:space="preserve">, ‘Ignore variability, overestimate hydrogen production – Quantifying the effects of </w:t>
-      </w:r>
-      <w:proofErr w:type="spellStart"/>
-      <w:r>
-        <w:rPr>
-          <w:rFonts w:ascii="Times New Roman" w:hAnsi="Times New Roman" w:cs="Times New Roman"/>
-        </w:rPr>
-        <w:t>electrolyzer</w:t>
-      </w:r>
-      <w:proofErr w:type="spellEnd"/>
-      <w:r>
-        <w:rPr>
-          <w:rFonts w:ascii="Times New Roman" w:hAnsi="Times New Roman" w:cs="Times New Roman"/>
-        </w:rPr>
-        <w:t xml:space="preserve"> efficiency curves on hydrogen production from renewable energy sources’, </w:t>
+        <w:t xml:space="preserve">F. Pelella </w:t>
       </w:r>
       <w:r>
         <w:rPr>
@@ -11492,24 +12193,256 @@
           <w:i/>
           <w:iCs/>
         </w:rPr>
-        <w:t xml:space="preserve">Int. J. </w:t>
-      </w:r>
-      <w:proofErr w:type="spellStart"/>
+        <w:t>et al.</w:t>
+      </w:r>
+      <w:r>
+        <w:rPr>
+          <w:rFonts w:ascii="Times New Roman" w:hAnsi="Times New Roman" w:cs="Times New Roman"/>
+        </w:rPr>
+        <w:t xml:space="preserve">, ‘Thermo-economic optimization of vertical farms exploring multiple design options for the built environment and HVAC system’, </w:t>
+      </w:r>
       <w:r>
         <w:rPr>
           <w:rFonts w:ascii="Times New Roman" w:hAnsi="Times New Roman" w:cs="Times New Roman"/>
           <w:i/>
           <w:iCs/>
         </w:rPr>
-        <w:t>Hydrog</w:t>
+        <w:t>Appl. Therm. Eng.</w:t>
+      </w:r>
+      <w:r>
+        <w:rPr>
+          <w:rFonts w:ascii="Times New Roman" w:hAnsi="Times New Roman" w:cs="Times New Roman"/>
+        </w:rPr>
+        <w:t xml:space="preserve">, vol. 279, p. 127623, Nov. 2025, </w:t>
+      </w:r>
+      <w:proofErr w:type="spellStart"/>
+      <w:r>
+        <w:rPr>
+          <w:rFonts w:ascii="Times New Roman" w:hAnsi="Times New Roman" w:cs="Times New Roman"/>
+        </w:rPr>
+        <w:t>doi</w:t>
       </w:r>
       <w:proofErr w:type="spellEnd"/>
+      <w:r>
+        <w:rPr>
+          <w:rFonts w:ascii="Times New Roman" w:hAnsi="Times New Roman" w:cs="Times New Roman"/>
+        </w:rPr>
+        <w:t>: 10.1016/j.applthermaleng.2025.127623.</w:t>
+      </w:r>
+    </w:p>
+    <w:p>
+      <w:pPr>
+        <w:pStyle w:val="Literaturverzeichnis"/>
+        <w:rPr>
+          <w:rFonts w:ascii="Times New Roman" w:hAnsi="Times New Roman" w:cs="Times New Roman"/>
+        </w:rPr>
+      </w:pPr>
+      <w:r>
+        <w:rPr>
+          <w:rFonts w:ascii="Times New Roman" w:hAnsi="Times New Roman" w:cs="Times New Roman"/>
+        </w:rPr>
+        <w:lastRenderedPageBreak/>
+        <w:t>[19</w:t>
+      </w:r>
+      <w:proofErr w:type="gramStart"/>
+      <w:r>
+        <w:rPr>
+          <w:rFonts w:ascii="Times New Roman" w:hAnsi="Times New Roman" w:cs="Times New Roman"/>
+        </w:rPr>
+        <w:t>]</w:t>
+      </w:r>
+      <w:r>
+        <w:rPr>
+          <w:rFonts w:ascii="Times New Roman" w:hAnsi="Times New Roman" w:cs="Times New Roman"/>
+        </w:rPr>
+        <w:tab/>
+        <w:t>‘</w:t>
+      </w:r>
+      <w:proofErr w:type="gramEnd"/>
+      <w:r>
+        <w:rPr>
+          <w:rFonts w:ascii="Times New Roman" w:hAnsi="Times New Roman" w:cs="Times New Roman"/>
+        </w:rPr>
+        <w:t xml:space="preserve">U-Value </w:t>
+      </w:r>
+      <w:proofErr w:type="gramStart"/>
+      <w:r>
+        <w:rPr>
+          <w:rFonts w:ascii="Times New Roman" w:hAnsi="Times New Roman" w:cs="Times New Roman"/>
+        </w:rPr>
+        <w:t>Calculator :</w:t>
+      </w:r>
+      <w:proofErr w:type="gramEnd"/>
+      <w:r>
+        <w:rPr>
+          <w:rFonts w:ascii="Times New Roman" w:hAnsi="Times New Roman" w:cs="Times New Roman"/>
+        </w:rPr>
+        <w:t xml:space="preserve"> </w:t>
+      </w:r>
+      <w:proofErr w:type="spellStart"/>
+      <w:r>
+        <w:rPr>
+          <w:rFonts w:ascii="Times New Roman" w:hAnsi="Times New Roman" w:cs="Times New Roman"/>
+        </w:rPr>
+        <w:t>ChangePlan</w:t>
+      </w:r>
+      <w:proofErr w:type="spellEnd"/>
+      <w:r>
+        <w:rPr>
+          <w:rFonts w:ascii="Times New Roman" w:hAnsi="Times New Roman" w:cs="Times New Roman"/>
+        </w:rPr>
+        <w:t>’. Accessed: Mar. 22, 2026. [Online]. Available: https://www.changeplan.co.uk/u_value_calculator.php</w:t>
+      </w:r>
+    </w:p>
+    <w:p>
+      <w:pPr>
+        <w:pStyle w:val="Literaturverzeichnis"/>
+        <w:rPr>
+          <w:rFonts w:ascii="Times New Roman" w:hAnsi="Times New Roman" w:cs="Times New Roman"/>
+        </w:rPr>
+      </w:pPr>
+      <w:r>
+        <w:rPr>
+          <w:rFonts w:ascii="Times New Roman" w:hAnsi="Times New Roman" w:cs="Times New Roman"/>
+        </w:rPr>
+        <w:t>[20]</w:t>
+      </w:r>
+      <w:r>
+        <w:rPr>
+          <w:rFonts w:ascii="Times New Roman" w:hAnsi="Times New Roman" w:cs="Times New Roman"/>
+        </w:rPr>
+        <w:tab/>
+        <w:t>‘</w:t>
+      </w:r>
+      <w:proofErr w:type="spellStart"/>
+      <w:r>
+        <w:rPr>
+          <w:rFonts w:ascii="Times New Roman" w:hAnsi="Times New Roman" w:cs="Times New Roman"/>
+        </w:rPr>
+        <w:t>Haeolus</w:t>
+      </w:r>
+      <w:proofErr w:type="spellEnd"/>
+      <w:r>
+        <w:rPr>
+          <w:rFonts w:ascii="Times New Roman" w:hAnsi="Times New Roman" w:cs="Times New Roman"/>
+        </w:rPr>
+        <w:t xml:space="preserve"> – Hydrogen-Aeolic Energy with </w:t>
+      </w:r>
+      <w:proofErr w:type="spellStart"/>
+      <w:r>
+        <w:rPr>
+          <w:rFonts w:ascii="Times New Roman" w:hAnsi="Times New Roman" w:cs="Times New Roman"/>
+        </w:rPr>
+        <w:t>Optimised</w:t>
+      </w:r>
+      <w:proofErr w:type="spellEnd"/>
+      <w:r>
+        <w:rPr>
+          <w:rFonts w:ascii="Times New Roman" w:hAnsi="Times New Roman" w:cs="Times New Roman"/>
+        </w:rPr>
+        <w:t xml:space="preserve"> </w:t>
+      </w:r>
+      <w:proofErr w:type="spellStart"/>
+      <w:r>
+        <w:rPr>
+          <w:rFonts w:ascii="Times New Roman" w:hAnsi="Times New Roman" w:cs="Times New Roman"/>
+        </w:rPr>
+        <w:t>eLectrolysers</w:t>
+      </w:r>
+      <w:proofErr w:type="spellEnd"/>
+      <w:r>
+        <w:rPr>
+          <w:rFonts w:ascii="Times New Roman" w:hAnsi="Times New Roman" w:cs="Times New Roman"/>
+        </w:rPr>
+        <w:t xml:space="preserve"> Upstream of Substation’. Accessed: Mar. 06, 2026. [Online]. Available: https://haeolus.eu/</w:t>
+      </w:r>
+    </w:p>
+    <w:p>
+      <w:pPr>
+        <w:pStyle w:val="Literaturverzeichnis"/>
+        <w:rPr>
+          <w:rFonts w:ascii="Times New Roman" w:hAnsi="Times New Roman" w:cs="Times New Roman"/>
+        </w:rPr>
+      </w:pPr>
+      <w:r>
+        <w:rPr>
+          <w:rFonts w:ascii="Times New Roman" w:hAnsi="Times New Roman" w:cs="Times New Roman"/>
+        </w:rPr>
+        <w:t>[21]</w:t>
+      </w:r>
+      <w:r>
+        <w:rPr>
+          <w:rFonts w:ascii="Times New Roman" w:hAnsi="Times New Roman" w:cs="Times New Roman"/>
+        </w:rPr>
+        <w:tab/>
+        <w:t xml:space="preserve">D. </w:t>
+      </w:r>
+      <w:proofErr w:type="spellStart"/>
+      <w:r>
+        <w:rPr>
+          <w:rFonts w:ascii="Times New Roman" w:hAnsi="Times New Roman" w:cs="Times New Roman"/>
+        </w:rPr>
+        <w:t>Virah</w:t>
+      </w:r>
+      <w:proofErr w:type="spellEnd"/>
+      <w:r>
+        <w:rPr>
+          <w:rFonts w:ascii="Times New Roman" w:hAnsi="Times New Roman" w:cs="Times New Roman"/>
+        </w:rPr>
+        <w:t xml:space="preserve">-Sawmy, F. J. Beck, and B. </w:t>
+      </w:r>
+      <w:proofErr w:type="spellStart"/>
+      <w:r>
+        <w:rPr>
+          <w:rFonts w:ascii="Times New Roman" w:hAnsi="Times New Roman" w:cs="Times New Roman"/>
+        </w:rPr>
+        <w:t>Sturmberg</w:t>
+      </w:r>
+      <w:proofErr w:type="spellEnd"/>
+      <w:r>
+        <w:rPr>
+          <w:rFonts w:ascii="Times New Roman" w:hAnsi="Times New Roman" w:cs="Times New Roman"/>
+        </w:rPr>
+        <w:t xml:space="preserve">, ‘Ignore variability, overestimate hydrogen production – Quantifying the effects of </w:t>
+      </w:r>
+      <w:proofErr w:type="spellStart"/>
+      <w:r>
+        <w:rPr>
+          <w:rFonts w:ascii="Times New Roman" w:hAnsi="Times New Roman" w:cs="Times New Roman"/>
+        </w:rPr>
+        <w:t>electrolyzer</w:t>
+      </w:r>
+      <w:proofErr w:type="spellEnd"/>
+      <w:r>
+        <w:rPr>
+          <w:rFonts w:ascii="Times New Roman" w:hAnsi="Times New Roman" w:cs="Times New Roman"/>
+        </w:rPr>
+        <w:t xml:space="preserve"> efficiency curves on hydrogen production from renewable energy sources’, </w:t>
+      </w:r>
       <w:r>
         <w:rPr>
           <w:rFonts w:ascii="Times New Roman" w:hAnsi="Times New Roman" w:cs="Times New Roman"/>
           <w:i/>
           <w:iCs/>
         </w:rPr>
+        <w:t xml:space="preserve">Int. J. </w:t>
+      </w:r>
+      <w:proofErr w:type="spellStart"/>
+      <w:r>
+        <w:rPr>
+          <w:rFonts w:ascii="Times New Roman" w:hAnsi="Times New Roman" w:cs="Times New Roman"/>
+          <w:i/>
+          <w:iCs/>
+        </w:rPr>
+        <w:t>Hydrog</w:t>
+      </w:r>
+      <w:proofErr w:type="spellEnd"/>
+      <w:r>
+        <w:rPr>
+          <w:rFonts w:ascii="Times New Roman" w:hAnsi="Times New Roman" w:cs="Times New Roman"/>
+          <w:i/>
+          <w:iCs/>
+        </w:rPr>
         <w:t>. Energy</w:t>
       </w:r>
       <w:r>
@@ -11544,7 +12477,7 @@
         <w:rPr>
           <w:rFonts w:ascii="Times New Roman" w:hAnsi="Times New Roman" w:cs="Times New Roman"/>
         </w:rPr>
-        <w:t>[17]</w:t>
+        <w:t>[22]</w:t>
       </w:r>
       <w:r>
         <w:rPr>

</xml_diff>

<commit_message>
forgot to save assumed design temperature to model
</commit_message>
<xml_diff>
--- a/Documentation.docx
+++ b/Documentation.docx
@@ -5954,11 +5954,6 @@
         </w:rPr>
         <w:fldChar w:fldCharType="end"/>
       </w:r>
-    </w:p>
-    <w:p>
-      <w:pPr>
-        <w:pStyle w:val="berschrift2"/>
-      </w:pPr>
       <w:bookmarkStart w:id="13" w:name="_Toc225009478"/>
     </w:p>
     <w:p>

</xml_diff>

<commit_message>
Oxygen control strategy introduced
Also explained the black box storages
</commit_message>
<xml_diff>
--- a/Documentation.docx
+++ b/Documentation.docx
@@ -6531,7 +6531,6 @@
     <w:p>
       <w:pPr>
         <w:ind w:left="360"/>
-        <w:jc w:val="left"/>
         <w:rPr>
           <w:lang w:val="en-GB" w:eastAsia="en-US"/>
         </w:rPr>
@@ -7198,7 +7197,6 @@
     <w:p>
       <w:pPr>
         <w:ind w:left="360"/>
-        <w:jc w:val="left"/>
         <w:rPr>
           <w:lang w:val="en-GB" w:eastAsia="en-US"/>
         </w:rPr>
@@ -7274,7 +7272,6 @@
     </w:p>
     <w:p>
       <w:pPr>
-        <w:jc w:val="left"/>
         <w:rPr>
           <w:lang w:val="en-GB" w:eastAsia="en-US"/>
         </w:rPr>
@@ -7341,13 +7338,190 @@
         <w:rPr>
           <w:lang w:val="en-GB" w:eastAsia="en-US"/>
         </w:rPr>
-        <w:t xml:space="preserve">. This is used as the </w:t>
+        <w:t>. Th</w:t>
       </w:r>
       <w:r>
         <w:rPr>
           <w:lang w:val="en-GB" w:eastAsia="en-US"/>
         </w:rPr>
-        <w:t xml:space="preserve">constant term. The error is calculated form </w:t>
+        <w:t>ese values are</w:t>
+      </w:r>
+      <w:r>
+        <w:rPr>
+          <w:lang w:val="en-GB" w:eastAsia="en-US"/>
+        </w:rPr>
+        <w:t xml:space="preserve"> used as the </w:t>
+      </w:r>
+      <w:r>
+        <w:rPr>
+          <w:lang w:val="en-GB" w:eastAsia="en-US"/>
+        </w:rPr>
+        <w:t>constant term</w:t>
+      </w:r>
+      <w:r>
+        <w:rPr>
+          <w:lang w:val="en-GB" w:eastAsia="en-US"/>
+        </w:rPr>
+        <w:t xml:space="preserve">s, </w:t>
+      </w:r>
+      <m:oMath>
+        <m:sSub>
+          <m:sSubPr>
+            <m:ctrlPr>
+              <w:rPr>
+                <w:rFonts w:ascii="Cambria Math" w:hAnsi="Cambria Math"/>
+                <w:i/>
+                <w:lang w:val="en-GB" w:eastAsia="en-US"/>
+              </w:rPr>
+            </m:ctrlPr>
+          </m:sSubPr>
+          <m:e>
+            <m:sSub>
+              <m:sSubPr>
+                <m:ctrlPr>
+                  <w:rPr>
+                    <w:rFonts w:ascii="Cambria Math" w:hAnsi="Cambria Math"/>
+                    <w:i/>
+                    <w:lang w:val="en-GB" w:eastAsia="en-US"/>
+                  </w:rPr>
+                </m:ctrlPr>
+              </m:sSubPr>
+              <m:e>
+                <m:r>
+                  <w:rPr>
+                    <w:rFonts w:ascii="Cambria Math" w:hAnsi="Cambria Math"/>
+                    <w:lang w:val="en-GB" w:eastAsia="en-US"/>
+                  </w:rPr>
+                  <m:t>K</m:t>
+                </m:r>
+              </m:e>
+              <m:sub>
+                <m:r>
+                  <w:rPr>
+                    <w:rFonts w:ascii="Cambria Math" w:hAnsi="Cambria Math"/>
+                    <w:lang w:val="en-GB" w:eastAsia="en-US"/>
+                  </w:rPr>
+                  <m:t>p</m:t>
+                </m:r>
+              </m:sub>
+            </m:sSub>
+          </m:e>
+          <m:sub>
+            <m:r>
+              <w:rPr>
+                <w:rFonts w:ascii="Cambria Math" w:hAnsi="Cambria Math"/>
+                <w:lang w:val="en-GB" w:eastAsia="en-US"/>
+              </w:rPr>
+              <m:t>tank</m:t>
+            </m:r>
+          </m:sub>
+        </m:sSub>
+      </m:oMath>
+      <w:r>
+        <w:rPr>
+          <w:lang w:val="en-GB" w:eastAsia="en-US"/>
+        </w:rPr>
+        <w:t xml:space="preserve"> and </w:t>
+      </w:r>
+      <m:oMath>
+        <m:sSub>
+          <m:sSubPr>
+            <m:ctrlPr>
+              <w:rPr>
+                <w:rFonts w:ascii="Cambria Math" w:hAnsi="Cambria Math"/>
+                <w:i/>
+                <w:lang w:val="en-GB" w:eastAsia="en-US"/>
+              </w:rPr>
+            </m:ctrlPr>
+          </m:sSubPr>
+          <m:e>
+            <m:sSub>
+              <m:sSubPr>
+                <m:ctrlPr>
+                  <w:rPr>
+                    <w:rFonts w:ascii="Cambria Math" w:hAnsi="Cambria Math"/>
+                    <w:i/>
+                    <w:lang w:val="en-GB" w:eastAsia="en-US"/>
+                  </w:rPr>
+                </m:ctrlPr>
+              </m:sSubPr>
+              <m:e>
+                <m:r>
+                  <w:rPr>
+                    <w:rFonts w:ascii="Cambria Math" w:hAnsi="Cambria Math"/>
+                    <w:lang w:val="en-GB" w:eastAsia="en-US"/>
+                  </w:rPr>
+                  <m:t>K</m:t>
+                </m:r>
+              </m:e>
+              <m:sub>
+                <m:r>
+                  <w:rPr>
+                    <w:rFonts w:ascii="Cambria Math" w:hAnsi="Cambria Math"/>
+                    <w:lang w:val="en-GB" w:eastAsia="en-US"/>
+                  </w:rPr>
+                  <m:t>p</m:t>
+                </m:r>
+              </m:sub>
+            </m:sSub>
+          </m:e>
+          <m:sub>
+            <m:r>
+              <w:rPr>
+                <w:rFonts w:ascii="Cambria Math" w:hAnsi="Cambria Math"/>
+                <w:lang w:val="en-GB" w:eastAsia="en-US"/>
+              </w:rPr>
+              <m:t>greenhouse</m:t>
+            </m:r>
+          </m:sub>
+        </m:sSub>
+      </m:oMath>
+      <w:r>
+        <w:rPr>
+          <w:lang w:val="en-GB" w:eastAsia="en-US"/>
+        </w:rPr>
+        <w:t xml:space="preserve">. The error </w:t>
+      </w:r>
+      <m:oMath>
+        <m:r>
+          <w:rPr>
+            <w:rFonts w:ascii="Cambria Math" w:hAnsi="Cambria Math"/>
+            <w:lang w:val="en-GB" w:eastAsia="en-US"/>
+          </w:rPr>
+          <m:t>e</m:t>
+        </m:r>
+        <m:d>
+          <m:dPr>
+            <m:ctrlPr>
+              <w:rPr>
+                <w:rFonts w:ascii="Cambria Math" w:hAnsi="Cambria Math"/>
+                <w:i/>
+                <w:lang w:val="en-GB" w:eastAsia="en-US"/>
+              </w:rPr>
+            </m:ctrlPr>
+          </m:dPr>
+          <m:e>
+            <m:r>
+              <w:rPr>
+                <w:rFonts w:ascii="Cambria Math" w:hAnsi="Cambria Math"/>
+                <w:lang w:val="en-GB" w:eastAsia="en-US"/>
+              </w:rPr>
+              <m:t>t</m:t>
+            </m:r>
+          </m:e>
+        </m:d>
+      </m:oMath>
+      <w:r>
+        <w:rPr>
+          <w:lang w:val="en-GB" w:eastAsia="en-US"/>
+        </w:rPr>
+        <w:t xml:space="preserve"> </w:t>
+      </w:r>
+      <w:r>
+        <w:rPr>
+          <w:lang w:val="en-GB" w:eastAsia="en-US"/>
+        </w:rPr>
+        <w:t xml:space="preserve">is calculated form </w:t>
       </w:r>
       <m:oMath>
         <m:sSub>
@@ -7458,6 +7632,634 @@
           <w:lang w:val="en-GB" w:eastAsia="en-US"/>
         </w:rPr>
         <w:t xml:space="preserve"> being the temperature calculated for the fish tank/greenhouse in the simulation. </w:t>
+      </w:r>
+    </w:p>
+    <w:p>
+      <w:pPr>
+        <w:pStyle w:val="berschrift2"/>
+      </w:pPr>
+      <w:r>
+        <w:t xml:space="preserve">Control Strategy </w:t>
+      </w:r>
+      <w:r>
+        <w:t>Oxygen</w:t>
+      </w:r>
+    </w:p>
+    <w:p>
+      <w:pPr>
+        <w:rPr>
+          <w:lang w:val="en-GB" w:eastAsia="en-US"/>
+        </w:rPr>
+      </w:pPr>
+      <w:r>
+        <w:rPr>
+          <w:lang w:val="en-GB" w:eastAsia="en-US"/>
+        </w:rPr>
+        <w:t>The control strategy for oxygen works analogous to the control strategy for heat. The setpoint for oxygen concentration lies at</w:t>
+      </w:r>
+      <w:r>
+        <w:rPr>
+          <w:lang w:val="en-GB" w:eastAsia="en-US"/>
+        </w:rPr>
+        <w:t xml:space="preserve"> </w:t>
+      </w:r>
+      <m:oMath>
+        <m:r>
+          <w:rPr>
+            <w:rFonts w:ascii="Cambria Math" w:hAnsi="Cambria Math"/>
+            <w:lang w:val="en-GB" w:eastAsia="en-US"/>
+          </w:rPr>
+          <m:t>9</m:t>
+        </m:r>
+        <m:r>
+          <w:rPr>
+            <w:rFonts w:ascii="Cambria Math" w:hAnsi="Cambria Math"/>
+            <w:lang w:val="en-GB" w:eastAsia="en-US"/>
+          </w:rPr>
+          <m:t>.7</m:t>
+        </m:r>
+        <m:f>
+          <m:fPr>
+            <m:ctrlPr>
+              <w:rPr>
+                <w:rFonts w:ascii="Cambria Math" w:hAnsi="Cambria Math"/>
+                <w:i/>
+                <w:lang w:val="en-GB" w:eastAsia="en-US"/>
+              </w:rPr>
+            </m:ctrlPr>
+          </m:fPr>
+          <m:num>
+            <m:r>
+              <w:rPr>
+                <w:rFonts w:ascii="Cambria Math" w:hAnsi="Cambria Math"/>
+                <w:lang w:val="en-GB" w:eastAsia="en-US"/>
+              </w:rPr>
+              <m:t>mg</m:t>
+            </m:r>
+          </m:num>
+          <m:den>
+            <m:r>
+              <w:rPr>
+                <w:rFonts w:ascii="Cambria Math" w:hAnsi="Cambria Math"/>
+                <w:lang w:val="en-GB" w:eastAsia="en-US"/>
+              </w:rPr>
+              <m:t>L</m:t>
+            </m:r>
+          </m:den>
+        </m:f>
+      </m:oMath>
+      <w:r>
+        <w:rPr>
+          <w:lang w:val="en-GB" w:eastAsia="en-US"/>
+        </w:rPr>
+        <w:t xml:space="preserve">, the saturation-point at </w:t>
+      </w:r>
+      <m:oMath>
+        <m:r>
+          <w:rPr>
+            <w:rFonts w:ascii="Cambria Math" w:hAnsi="Cambria Math"/>
+            <w:lang w:val="en-GB" w:eastAsia="en-US"/>
+          </w:rPr>
+          <m:t>17</m:t>
+        </m:r>
+        <m:r>
+          <w:rPr>
+            <w:rFonts w:ascii="Cambria Math" w:hAnsi="Cambria Math"/>
+            <w:lang w:val="en-GB" w:eastAsia="en-US"/>
+          </w:rPr>
+          <m:t xml:space="preserve"> </m:t>
+        </m:r>
+        <m:r>
+          <w:rPr>
+            <w:rFonts w:ascii="Cambria Math" w:hAnsi="Cambria Math"/>
+            <w:lang w:val="en-GB" w:eastAsia="en-US"/>
+          </w:rPr>
+          <m:t>°C</m:t>
+        </m:r>
+      </m:oMath>
+      <w:r>
+        <w:rPr>
+          <w:lang w:val="en-GB" w:eastAsia="en-US"/>
+        </w:rPr>
+        <w:t xml:space="preserve"> </w:t>
+      </w:r>
+      <w:r>
+        <w:rPr>
+          <w:lang w:val="en-GB" w:eastAsia="en-US"/>
+        </w:rPr>
+        <w:fldChar w:fldCharType="begin"/>
+      </w:r>
+      <w:r>
+        <w:rPr>
+          <w:lang w:val="en-GB" w:eastAsia="en-US"/>
+        </w:rPr>
+        <w:instrText xml:space="preserve"> ADDIN ZOTERO_ITEM CSL_CITATION {"citationID":"oZDk9U7p","properties":{"formattedCitation":"[22]","plainCitation":"[22]","noteIndex":0},"citationItems":[{"id":395,"uris":["http://zotero.org/groups/6447497/items/TU978UF7"],"itemData":{"id":395,"type":"article-journal","abstract":"Water quality is a combination of chemical, physical and biological parameters that affect the growth and prosperity of cultured fish. The success of a commercial aquaculture activity depends on the optimal environment conditions for accelerated growth at the lowest cost of resources. Water quality affects the general condition of the cultured body as it determines the conditions of health and growth of the cultured fish. The water quality is, therefore, an essential factor to consider when planning a high aquaculture production.","language":"en","source":"Zotero","title":"Effect of water quality on rainbow trout performance","author":[{"family":"Dmitry","given":"Avkhimovich"}]}}],"schema":"https://github.com/citation-style-language/schema/raw/master/csl-citation.json"} </w:instrText>
+      </w:r>
+      <w:r>
+        <w:rPr>
+          <w:lang w:val="en-GB" w:eastAsia="en-US"/>
+        </w:rPr>
+        <w:fldChar w:fldCharType="separate"/>
+      </w:r>
+      <w:r>
+        <w:rPr>
+          <w:lang w:val="en-GB" w:eastAsia="en-US"/>
+        </w:rPr>
+        <w:t>[22]</w:t>
+      </w:r>
+      <w:r>
+        <w:rPr>
+          <w:lang w:val="en-GB" w:eastAsia="en-US"/>
+        </w:rPr>
+        <w:fldChar w:fldCharType="end"/>
+      </w:r>
+      <w:r>
+        <w:rPr>
+          <w:lang w:val="en-GB" w:eastAsia="en-US"/>
+        </w:rPr>
+        <w:t>.</w:t>
+      </w:r>
+      <w:r>
+        <w:rPr>
+          <w:lang w:val="en-GB" w:eastAsia="en-US"/>
+        </w:rPr>
+        <w:t xml:space="preserve"> </w:t>
+      </w:r>
+      <w:r>
+        <w:rPr>
+          <w:lang w:val="en-GB" w:eastAsia="en-US"/>
+        </w:rPr>
+        <w:t xml:space="preserve">The error, </w:t>
+      </w:r>
+      <m:oMath>
+        <m:r>
+          <w:rPr>
+            <w:rFonts w:ascii="Cambria Math" w:hAnsi="Cambria Math"/>
+            <w:lang w:val="en-GB" w:eastAsia="en-US"/>
+          </w:rPr>
+          <m:t>e(t)</m:t>
+        </m:r>
+      </m:oMath>
+      <w:r>
+        <w:rPr>
+          <w:lang w:val="en-GB" w:eastAsia="en-US"/>
+        </w:rPr>
+        <w:t xml:space="preserve">, is calculated by </w:t>
+      </w:r>
+      <m:oMath>
+        <m:sSub>
+          <m:sSubPr>
+            <m:ctrlPr>
+              <w:rPr>
+                <w:rFonts w:ascii="Cambria Math" w:hAnsi="Cambria Math"/>
+                <w:i/>
+                <w:lang w:val="en-GB" w:eastAsia="en-US"/>
+              </w:rPr>
+            </m:ctrlPr>
+          </m:sSubPr>
+          <m:e>
+            <m:r>
+              <w:rPr>
+                <w:rFonts w:ascii="Cambria Math" w:hAnsi="Cambria Math"/>
+                <w:lang w:val="en-GB" w:eastAsia="en-US"/>
+              </w:rPr>
+              <m:t>C</m:t>
+            </m:r>
+          </m:e>
+          <m:sub>
+            <m:r>
+              <w:rPr>
+                <w:rFonts w:ascii="Cambria Math" w:hAnsi="Cambria Math"/>
+                <w:lang w:val="en-GB" w:eastAsia="en-US"/>
+              </w:rPr>
+              <m:t>set</m:t>
+            </m:r>
+          </m:sub>
+        </m:sSub>
+        <m:r>
+          <w:rPr>
+            <w:rFonts w:ascii="Cambria Math" w:hAnsi="Cambria Math"/>
+            <w:lang w:val="en-GB" w:eastAsia="en-US"/>
+          </w:rPr>
+          <m:t>-</m:t>
+        </m:r>
+        <m:sSub>
+          <m:sSubPr>
+            <m:ctrlPr>
+              <w:rPr>
+                <w:rFonts w:ascii="Cambria Math" w:hAnsi="Cambria Math"/>
+                <w:i/>
+                <w:lang w:val="en-GB" w:eastAsia="en-US"/>
+              </w:rPr>
+            </m:ctrlPr>
+          </m:sSubPr>
+          <m:e>
+            <m:r>
+              <w:rPr>
+                <w:rFonts w:ascii="Cambria Math" w:hAnsi="Cambria Math"/>
+                <w:lang w:val="en-GB" w:eastAsia="en-US"/>
+              </w:rPr>
+              <m:t>C</m:t>
+            </m:r>
+          </m:e>
+          <m:sub>
+            <m:r>
+              <w:rPr>
+                <w:rFonts w:ascii="Cambria Math" w:hAnsi="Cambria Math"/>
+                <w:lang w:val="en-GB" w:eastAsia="en-US"/>
+              </w:rPr>
+              <m:t>measured</m:t>
+            </m:r>
+          </m:sub>
+        </m:sSub>
+      </m:oMath>
+      <w:r>
+        <w:rPr>
+          <w:lang w:val="en-GB" w:eastAsia="en-US"/>
+        </w:rPr>
+        <w:t xml:space="preserve">, with </w:t>
+      </w:r>
+      <m:oMath>
+        <m:sSub>
+          <m:sSubPr>
+            <m:ctrlPr>
+              <w:rPr>
+                <w:rFonts w:ascii="Cambria Math" w:hAnsi="Cambria Math"/>
+                <w:i/>
+                <w:lang w:val="en-GB" w:eastAsia="en-US"/>
+              </w:rPr>
+            </m:ctrlPr>
+          </m:sSubPr>
+          <m:e>
+            <m:r>
+              <w:rPr>
+                <w:rFonts w:ascii="Cambria Math" w:hAnsi="Cambria Math"/>
+                <w:lang w:val="en-GB" w:eastAsia="en-US"/>
+              </w:rPr>
+              <m:t>C</m:t>
+            </m:r>
+          </m:e>
+          <m:sub>
+            <m:r>
+              <w:rPr>
+                <w:rFonts w:ascii="Cambria Math" w:hAnsi="Cambria Math"/>
+                <w:lang w:val="en-GB" w:eastAsia="en-US"/>
+              </w:rPr>
+              <m:t>measured</m:t>
+            </m:r>
+          </m:sub>
+        </m:sSub>
+      </m:oMath>
+      <w:r>
+        <w:rPr>
+          <w:lang w:val="en-GB" w:eastAsia="en-US"/>
+        </w:rPr>
+        <w:t xml:space="preserve"> being the</w:t>
+      </w:r>
+      <w:r>
+        <w:rPr>
+          <w:lang w:val="en-GB" w:eastAsia="en-US"/>
+        </w:rPr>
+        <w:t xml:space="preserve"> oxygen</w:t>
+      </w:r>
+      <w:r>
+        <w:rPr>
+          <w:lang w:val="en-GB" w:eastAsia="en-US"/>
+        </w:rPr>
+        <w:t xml:space="preserve"> </w:t>
+      </w:r>
+      <w:r>
+        <w:rPr>
+          <w:lang w:val="en-GB" w:eastAsia="en-US"/>
+        </w:rPr>
+        <w:t>concentration</w:t>
+      </w:r>
+      <w:r>
+        <w:rPr>
+          <w:lang w:val="en-GB" w:eastAsia="en-US"/>
+        </w:rPr>
+        <w:t xml:space="preserve"> calculated for the</w:t>
+      </w:r>
+      <w:r>
+        <w:rPr>
+          <w:lang w:val="en-GB" w:eastAsia="en-US"/>
+        </w:rPr>
+        <w:t xml:space="preserve"> fish tank. The constant, </w:t>
+      </w:r>
+      <m:oMath>
+        <m:sSub>
+          <m:sSubPr>
+            <m:ctrlPr>
+              <w:rPr>
+                <w:rFonts w:ascii="Cambria Math" w:hAnsi="Cambria Math"/>
+                <w:i/>
+                <w:lang w:val="en-GB" w:eastAsia="en-US"/>
+              </w:rPr>
+            </m:ctrlPr>
+          </m:sSubPr>
+          <m:e>
+            <m:sSub>
+              <m:sSubPr>
+                <m:ctrlPr>
+                  <w:rPr>
+                    <w:rFonts w:ascii="Cambria Math" w:hAnsi="Cambria Math"/>
+                    <w:i/>
+                    <w:lang w:val="en-GB" w:eastAsia="en-US"/>
+                  </w:rPr>
+                </m:ctrlPr>
+              </m:sSubPr>
+              <m:e>
+                <m:r>
+                  <w:rPr>
+                    <w:rFonts w:ascii="Cambria Math" w:hAnsi="Cambria Math"/>
+                    <w:lang w:val="en-GB" w:eastAsia="en-US"/>
+                  </w:rPr>
+                  <m:t>K</m:t>
+                </m:r>
+              </m:e>
+              <m:sub>
+                <m:r>
+                  <w:rPr>
+                    <w:rFonts w:ascii="Cambria Math" w:hAnsi="Cambria Math"/>
+                    <w:lang w:val="en-GB" w:eastAsia="en-US"/>
+                  </w:rPr>
+                  <m:t>p</m:t>
+                </m:r>
+              </m:sub>
+            </m:sSub>
+          </m:e>
+          <m:sub>
+            <m:sSub>
+              <m:sSubPr>
+                <m:ctrlPr>
+                  <w:rPr>
+                    <w:rFonts w:ascii="Cambria Math" w:hAnsi="Cambria Math"/>
+                    <w:i/>
+                    <w:lang w:val="en-GB" w:eastAsia="en-US"/>
+                  </w:rPr>
+                </m:ctrlPr>
+              </m:sSubPr>
+              <m:e>
+                <m:r>
+                  <w:rPr>
+                    <w:rFonts w:ascii="Cambria Math" w:hAnsi="Cambria Math"/>
+                    <w:lang w:val="en-GB" w:eastAsia="en-US"/>
+                  </w:rPr>
+                  <m:t>O</m:t>
+                </m:r>
+              </m:e>
+              <m:sub>
+                <m:r>
+                  <w:rPr>
+                    <w:rFonts w:ascii="Cambria Math" w:hAnsi="Cambria Math"/>
+                    <w:lang w:val="en-GB" w:eastAsia="en-US"/>
+                  </w:rPr>
+                  <m:t>2</m:t>
+                </m:r>
+              </m:sub>
+            </m:sSub>
+          </m:sub>
+        </m:sSub>
+      </m:oMath>
+      <w:r>
+        <w:rPr>
+          <w:lang w:val="en-GB" w:eastAsia="en-US"/>
+        </w:rPr>
+        <w:t>, is the oxygen consumption of the entire fish stock</w:t>
+      </w:r>
+      <w:r>
+        <w:rPr>
+          <w:lang w:val="en-GB" w:eastAsia="en-US"/>
+        </w:rPr>
+        <w:t xml:space="preserve"> multiplied by </w:t>
+      </w:r>
+      <m:oMath>
+        <m:r>
+          <w:rPr>
+            <w:rFonts w:ascii="Cambria Math" w:hAnsi="Cambria Math"/>
+            <w:lang w:val="en-GB" w:eastAsia="en-US"/>
+          </w:rPr>
+          <m:t>5000</m:t>
+        </m:r>
+      </m:oMath>
+      <w:r>
+        <w:rPr>
+          <w:lang w:val="en-GB" w:eastAsia="en-US"/>
+        </w:rPr>
+        <w:t xml:space="preserve"> (this value is empirical from the simulation; it results from the small absolute value of </w:t>
+      </w:r>
+      <m:oMath>
+        <m:sSub>
+          <m:sSubPr>
+            <m:ctrlPr>
+              <w:rPr>
+                <w:rFonts w:ascii="Cambria Math" w:hAnsi="Cambria Math"/>
+                <w:i/>
+                <w:lang w:val="en-GB" w:eastAsia="en-US"/>
+              </w:rPr>
+            </m:ctrlPr>
+          </m:sSubPr>
+          <m:e>
+            <m:r>
+              <w:rPr>
+                <w:rFonts w:ascii="Cambria Math" w:hAnsi="Cambria Math"/>
+                <w:lang w:val="en-GB" w:eastAsia="en-US"/>
+              </w:rPr>
+              <m:t>C</m:t>
+            </m:r>
+          </m:e>
+          <m:sub>
+            <m:r>
+              <w:rPr>
+                <w:rFonts w:ascii="Cambria Math" w:hAnsi="Cambria Math"/>
+                <w:lang w:val="en-GB" w:eastAsia="en-US"/>
+              </w:rPr>
+              <m:t>set</m:t>
+            </m:r>
+          </m:sub>
+        </m:sSub>
+        <m:r>
+          <w:rPr>
+            <w:rFonts w:ascii="Cambria Math" w:hAnsi="Cambria Math"/>
+            <w:lang w:val="en-GB" w:eastAsia="en-US"/>
+          </w:rPr>
+          <m:t>-</m:t>
+        </m:r>
+        <m:sSub>
+          <m:sSubPr>
+            <m:ctrlPr>
+              <w:rPr>
+                <w:rFonts w:ascii="Cambria Math" w:hAnsi="Cambria Math"/>
+                <w:i/>
+                <w:lang w:val="en-GB" w:eastAsia="en-US"/>
+              </w:rPr>
+            </m:ctrlPr>
+          </m:sSubPr>
+          <m:e>
+            <m:r>
+              <w:rPr>
+                <w:rFonts w:ascii="Cambria Math" w:hAnsi="Cambria Math"/>
+                <w:lang w:val="en-GB" w:eastAsia="en-US"/>
+              </w:rPr>
+              <m:t>C</m:t>
+            </m:r>
+          </m:e>
+          <m:sub>
+            <m:r>
+              <w:rPr>
+                <w:rFonts w:ascii="Cambria Math" w:hAnsi="Cambria Math"/>
+                <w:lang w:val="en-GB" w:eastAsia="en-US"/>
+              </w:rPr>
+              <m:t>measured</m:t>
+            </m:r>
+          </m:sub>
+        </m:sSub>
+      </m:oMath>
+      <w:r>
+        <w:rPr>
+          <w:lang w:val="en-GB" w:eastAsia="en-US"/>
+        </w:rPr>
+        <w:t>)</w:t>
+      </w:r>
+      <w:r>
+        <w:rPr>
+          <w:lang w:val="en-GB" w:eastAsia="en-US"/>
+        </w:rPr>
+        <w:t>.</w:t>
+      </w:r>
+      <w:r>
+        <w:rPr>
+          <w:lang w:val="en-GB" w:eastAsia="en-US"/>
+        </w:rPr>
+        <w:t xml:space="preserve"> </w:t>
+      </w:r>
+    </w:p>
+    <w:p>
+      <w:pPr>
+        <w:pStyle w:val="berschrift2"/>
+      </w:pPr>
+      <w:r>
+        <w:t>Storage Tanks</w:t>
+      </w:r>
+    </w:p>
+    <w:p>
+      <w:pPr>
+        <w:rPr>
+          <w:lang w:val="en-GB" w:eastAsia="en-US"/>
+        </w:rPr>
+      </w:pPr>
+      <w:r>
+        <w:rPr>
+          <w:lang w:val="en-GB" w:eastAsia="en-US"/>
+        </w:rPr>
+        <w:t xml:space="preserve">The storage tanks </w:t>
+      </w:r>
+      <w:r>
+        <w:rPr>
+          <w:lang w:val="en-GB" w:eastAsia="en-US"/>
+        </w:rPr>
+        <w:t xml:space="preserve">can be understood as a black box. They </w:t>
+      </w:r>
+      <w:r>
+        <w:rPr>
+          <w:lang w:val="en-GB" w:eastAsia="en-US"/>
+        </w:rPr>
+        <w:t xml:space="preserve">are neither defined nor sized. Researching materials and sizes would have been beyond the scope of the project. However, the simulation offers an excellent tool for the sizing of the storage tanks. Sizing the heat storage </w:t>
+      </w:r>
+      <w:r>
+        <w:rPr>
+          <w:lang w:val="en-GB" w:eastAsia="en-US"/>
+        </w:rPr>
+        <w:lastRenderedPageBreak/>
+        <w:t>and introducing a heat pump can change the sizing of the greenhouse</w:t>
+      </w:r>
+      <w:r>
+        <w:rPr>
+          <w:lang w:val="en-GB" w:eastAsia="en-US"/>
+        </w:rPr>
+        <w:t>. This results in an optimization problem, where the benefits of high temperature storage need to be weighed against the increased heat losses resulting from the greater temperature gradient. The optimization is likely iterative, with many simulations being required to determine optimal storage size.</w:t>
+      </w:r>
+    </w:p>
+    <w:p>
+      <w:pPr>
+        <w:rPr>
+          <w:lang w:val="en-GB" w:eastAsia="en-US"/>
+        </w:rPr>
+      </w:pPr>
+      <w:r>
+        <w:rPr>
+          <w:lang w:val="en-GB" w:eastAsia="en-US"/>
+        </w:rPr>
+        <w:t>In the current model, t</w:t>
+      </w:r>
+      <w:r>
+        <w:rPr>
+          <w:lang w:val="en-GB" w:eastAsia="en-US"/>
+        </w:rPr>
+        <w:t xml:space="preserve">he </w:t>
+      </w:r>
+      <w:r>
+        <w:rPr>
+          <w:lang w:val="en-GB" w:eastAsia="en-US"/>
+        </w:rPr>
+        <w:t xml:space="preserve">heat </w:t>
+      </w:r>
+      <w:r>
+        <w:rPr>
+          <w:lang w:val="en-GB" w:eastAsia="en-US"/>
+        </w:rPr>
+        <w:t xml:space="preserve">storage tanks are defined as infinitely large, with no losses. </w:t>
+      </w:r>
+      <w:r>
+        <w:rPr>
+          <w:lang w:val="en-GB" w:eastAsia="en-US"/>
+        </w:rPr>
+        <w:t>The entire stretch from the electrolyzer to the fish tank/greenhouse can encompass a heat pump, a heat storage of any size or material and pipes.</w:t>
+      </w:r>
+      <w:r>
+        <w:rPr>
+          <w:lang w:val="en-GB" w:eastAsia="en-US"/>
+        </w:rPr>
+        <w:t xml:space="preserve"> There is no potential variable (temperature) determining flow to or from the storage tank. The assumption is that all the heat is stored at a sufficiently high temperature level for a gradient to exist between the heat storage and the greenhouse/fish tank, </w:t>
+      </w:r>
+      <w:proofErr w:type="gramStart"/>
+      <w:r>
+        <w:rPr>
+          <w:lang w:val="en-GB" w:eastAsia="en-US"/>
+        </w:rPr>
+        <w:t>at all times</w:t>
+      </w:r>
+      <w:proofErr w:type="gramEnd"/>
+      <w:r>
+        <w:rPr>
+          <w:lang w:val="en-GB" w:eastAsia="en-US"/>
+        </w:rPr>
+        <w:t xml:space="preserve">. Heat transfer from and to the storage is assumed to be ideal (the tank can run empty). There is currently no measure to prevent negative values in the </w:t>
+      </w:r>
+      <w:r>
+        <w:rPr>
+          <w:lang w:val="en-GB" w:eastAsia="en-US"/>
+        </w:rPr>
+        <w:t xml:space="preserve">heat </w:t>
+      </w:r>
+      <w:r>
+        <w:rPr>
+          <w:lang w:val="en-GB" w:eastAsia="en-US"/>
+        </w:rPr>
+        <w:t xml:space="preserve">storage tank. </w:t>
+      </w:r>
+    </w:p>
+    <w:p>
+      <w:pPr>
+        <w:rPr>
+          <w:lang w:val="en-GB" w:eastAsia="en-US"/>
+        </w:rPr>
+      </w:pPr>
+      <w:r>
+        <w:rPr>
+          <w:lang w:val="en-GB" w:eastAsia="en-US"/>
+        </w:rPr>
+        <w:t xml:space="preserve">The oxygen tank is similarly undefined, with no potential variable (pressure), pumps, piping, material or dimension. Oxygen is assumed to dissolve in tank water entirely with no losses. There is currently no measure to prevent emptying or negative values in the oxygen tank. </w:t>
       </w:r>
     </w:p>
     <w:p>
@@ -7690,13 +8492,13 @@
               <w:rPr>
                 <w:lang w:val="en-GB"/>
               </w:rPr>
-              <w:instrText xml:space="preserve"> ADDIN ZOTERO_ITEM CSL_CITATION {"citationID":"DSsI2lzZ","properties":{"formattedCitation":"[22]","plainCitation":"[22]","noteIndex":0},"citationItems":[{"id":343,"uris":["http://zotero.org/groups/6447497/items/SRB46M8K"],"itemData":{"id":343,"type":"post-weblog","language":"en-GB","title":"Haeolus – Hydrogen-Aeolic Energy with Optimised eLectrolysers Upstream of Substation","URL":"https://haeolus.eu/","accessed":{"date-parts":[["2026",3,6]]},"issued":{"date-parts":[["2024",1,8]]}}}],"schema":"https://github.com/citation-style-language/schema/raw/master/csl-citation.json"} </w:instrText>
+              <w:instrText xml:space="preserve"> ADDIN ZOTERO_ITEM CSL_CITATION {"citationID":"DSsI2lzZ","properties":{"formattedCitation":"[23]","plainCitation":"[23]","noteIndex":0},"citationItems":[{"id":343,"uris":["http://zotero.org/groups/6447497/items/SRB46M8K"],"itemData":{"id":343,"type":"post-weblog","language":"en-GB","title":"Haeolus – Hydrogen-Aeolic Energy with Optimised eLectrolysers Upstream of Substation","URL":"https://haeolus.eu/","accessed":{"date-parts":[["2026",3,6]]},"issued":{"date-parts":[["2024",1,8]]}}}],"schema":"https://github.com/citation-style-language/schema/raw/master/csl-citation.json"} </w:instrText>
             </w:r>
             <w:r>
               <w:fldChar w:fldCharType="separate"/>
             </w:r>
             <w:r>
-              <w:t>[22]</w:t>
+              <w:t>[23]</w:t>
             </w:r>
             <w:r>
               <w:fldChar w:fldCharType="end"/>
@@ -7774,13 +8576,13 @@
               <w:rPr>
                 <w:lang w:val="en-GB"/>
               </w:rPr>
-              <w:instrText xml:space="preserve"> ADDIN ZOTERO_ITEM CSL_CITATION {"citationID":"gPCdkhXq","properties":{"formattedCitation":"[23]","plainCitation":"[23]","noteIndex":0},"citationItems":[{"id":359,"uris":["http://zotero.org/groups/6447497/items/SS8CMKJN"],"itemData":{"id":359,"type":"article-journal","abstract":"This study investigates the impact of including (or neglecting) the variable efficiency of hydrogen electrolyzers as a function of operating power in the modelling of green hydrogen produced from variable renewable energy sources. Results show that neglecting the variable electrolyzer efficiency, as is commonly done in studies of green hydrogen, leads to significant overestimation of hydrogen production in the range of 5–24%. The effects of the time resolution used in models are also investigated, as well as the impact of including the option for the electrolyzer to switch to stand-by mode instead of powering down and electrolyzer ramp rate constraints. Results indicate that these have a minor effect on overall hydrogen production, with the use of hour resolution data leading to overestimation in the range of 0.2–2%, relative to using 5-min data. This study used data from three solar farms and three wind in Australia, from which it is observed that wind farms produced 55% more hydrogen than the solar farms. The results in this study highlight the critical importance of including the variable efficiency of electrolyzers in the modelling of green hydrogen production. As this industry scales, continuing to neglect this effect would lead to the overestimation of hydrogen production by tens of megatonnes.","container-title":"International Journal of Hydrogen Energy","DOI":"10.1016/j.ijhydene.2024.05.360","ISSN":"0360-3199","journalAbbreviation":"International Journal of Hydrogen Energy","page":"49-59","source":"ScienceDirect","title":"Ignore variability, overestimate hydrogen production – Quantifying the effects of electrolyzer efficiency curves on hydrogen production from renewable energy sources","volume":"72","author":[{"family":"Virah-Sawmy","given":"Dan"},{"family":"Beck","given":"Fiona J."},{"family":"Sturmberg","given":"Bjorn"}],"issued":{"date-parts":[["2024",6,27]]}}}],"schema":"https://github.com/citation-style-language/schema/raw/master/csl-citation.json"} </w:instrText>
+              <w:instrText xml:space="preserve"> ADDIN ZOTERO_ITEM CSL_CITATION {"citationID":"gPCdkhXq","properties":{"formattedCitation":"[24]","plainCitation":"[24]","noteIndex":0},"citationItems":[{"id":359,"uris":["http://zotero.org/groups/6447497/items/SS8CMKJN"],"itemData":{"id":359,"type":"article-journal","abstract":"This study investigates the impact of including (or neglecting) the variable efficiency of hydrogen electrolyzers as a function of operating power in the modelling of green hydrogen produced from variable renewable energy sources. Results show that neglecting the variable electrolyzer efficiency, as is commonly done in studies of green hydrogen, leads to significant overestimation of hydrogen production in the range of 5–24%. The effects of the time resolution used in models are also investigated, as well as the impact of including the option for the electrolyzer to switch to stand-by mode instead of powering down and electrolyzer ramp rate constraints. Results indicate that these have a minor effect on overall hydrogen production, with the use of hour resolution data leading to overestimation in the range of 0.2–2%, relative to using 5-min data. This study used data from three solar farms and three wind in Australia, from which it is observed that wind farms produced 55% more hydrogen than the solar farms. The results in this study highlight the critical importance of including the variable efficiency of electrolyzers in the modelling of green hydrogen production. As this industry scales, continuing to neglect this effect would lead to the overestimation of hydrogen production by tens of megatonnes.","container-title":"International Journal of Hydrogen Energy","DOI":"10.1016/j.ijhydene.2024.05.360","ISSN":"0360-3199","journalAbbreviation":"International Journal of Hydrogen Energy","page":"49-59","source":"ScienceDirect","title":"Ignore variability, overestimate hydrogen production – Quantifying the effects of electrolyzer efficiency curves on hydrogen production from renewable energy sources","volume":"72","author":[{"family":"Virah-Sawmy","given":"Dan"},{"family":"Beck","given":"Fiona J."},{"family":"Sturmberg","given":"Bjorn"}],"issued":{"date-parts":[["2024",6,27]]}}}],"schema":"https://github.com/citation-style-language/schema/raw/master/csl-citation.json"} </w:instrText>
             </w:r>
             <w:r>
               <w:fldChar w:fldCharType="separate"/>
             </w:r>
             <w:r>
-              <w:t>[23]</w:t>
+              <w:t>[24]</w:t>
             </w:r>
             <w:r>
               <w:fldChar w:fldCharType="end"/>
@@ -7982,13 +8784,13 @@
               <w:rPr>
                 <w:lang w:val="en-GB"/>
               </w:rPr>
-              <w:instrText xml:space="preserve"> ADDIN ZOTERO_ITEM CSL_CITATION {"citationID":"eSBSfdEq","properties":{"formattedCitation":"[24]","plainCitation":"[24]","noteIndex":0},"citationItems":[{"id":358,"uris":["http://zotero.org/groups/6447497/items/ZK2PQ9AW"],"itemData":{"id":358,"type":"book","ISBN":"3-527-33342-8","language":"English","title":"Hydrogen Production by Electrolysis","author":[{"family":"Godula-Jopek","given":"Agata"}],"issued":{"date-parts":[["2015",7,7]]}}}],"schema":"https://github.com/citation-style-language/schema/raw/master/csl-citation.json"} </w:instrText>
+              <w:instrText xml:space="preserve"> ADDIN ZOTERO_ITEM CSL_CITATION {"citationID":"eSBSfdEq","properties":{"formattedCitation":"[25]","plainCitation":"[25]","noteIndex":0},"citationItems":[{"id":358,"uris":["http://zotero.org/groups/6447497/items/ZK2PQ9AW"],"itemData":{"id":358,"type":"book","ISBN":"3-527-33342-8","language":"English","title":"Hydrogen Production by Electrolysis","author":[{"family":"Godula-Jopek","given":"Agata"}],"issued":{"date-parts":[["2015",7,7]]}}}],"schema":"https://github.com/citation-style-language/schema/raw/master/csl-citation.json"} </w:instrText>
             </w:r>
             <w:r>
               <w:fldChar w:fldCharType="separate"/>
             </w:r>
             <w:r>
-              <w:t>[24]</w:t>
+              <w:t>[25]</w:t>
             </w:r>
             <w:r>
               <w:fldChar w:fldCharType="end"/>
@@ -8418,6 +9220,7 @@
               <w:jc w:val="center"/>
             </w:pPr>
             <w:r>
+              <w:lastRenderedPageBreak/>
               <w:t>O2_consum_fish</w:t>
             </w:r>
           </w:p>
@@ -8515,7 +9318,6 @@
             </w:pPr>
             <w:proofErr w:type="spellStart"/>
             <w:r>
-              <w:lastRenderedPageBreak/>
               <w:t>rho_air</w:t>
             </w:r>
             <w:proofErr w:type="spellEnd"/>
@@ -10086,7 +10888,6 @@
           <w:sz w:val="32"/>
           <w:szCs w:val="32"/>
         </w:rPr>
-        <w:lastRenderedPageBreak/>
         <w:drawing>
           <wp:inline distT="0" distB="0" distL="0" distR="0" wp14:anchorId="41237A98" wp14:editId="0922E739">
             <wp:extent cx="5731510" cy="6144260"/>
@@ -10229,7 +11030,14 @@
         <w:rPr>
           <w:lang w:val="en-GB"/>
         </w:rPr>
-        <w:t xml:space="preserve">. The equation is described shortly and the section of the model where it can be found is named. The variables for the equations below are listed under </w:t>
+        <w:t xml:space="preserve">. The equation is described </w:t>
+      </w:r>
+      <w:r>
+        <w:rPr>
+          <w:lang w:val="en-GB"/>
+        </w:rPr>
+        <w:lastRenderedPageBreak/>
+        <w:t xml:space="preserve">shortly and the section of the model where it can be found is named. The variables for the equations below are listed under </w:t>
       </w:r>
       <w:r>
         <w:rPr>
@@ -10258,7 +11066,6 @@
       <w:bookmarkStart w:id="15" w:name="_Toc225009480"/>
       <w:proofErr w:type="spellStart"/>
       <w:r>
-        <w:lastRenderedPageBreak/>
         <w:t>Variables</w:t>
       </w:r>
       <w:bookmarkEnd w:id="15"/>
@@ -11398,6 +12205,7 @@
       </w:pPr>
       <w:bookmarkStart w:id="16" w:name="_Toc225009481"/>
       <w:r>
+        <w:lastRenderedPageBreak/>
         <w:t>Hydrogen Production Rate</w:t>
       </w:r>
       <w:bookmarkEnd w:id="16"/>
@@ -11666,7 +12474,6 @@
       </w:pPr>
       <w:bookmarkStart w:id="17" w:name="_Toc225009482"/>
       <w:r>
-        <w:lastRenderedPageBreak/>
         <w:t>Oxygen Production Rate</w:t>
       </w:r>
       <w:bookmarkEnd w:id="17"/>
@@ -12930,6 +13737,7 @@
           <w:rFonts w:eastAsiaTheme="minorEastAsia"/>
           <w:lang w:val="en-GB"/>
         </w:rPr>
+        <w:lastRenderedPageBreak/>
         <w:t>This function of the simulation is incomplete, as there are no temperature gradients determining the heat flow.</w:t>
       </w:r>
     </w:p>
@@ -13889,6 +14697,41 @@
           <w:rFonts w:ascii="Times New Roman" w:hAnsi="Times New Roman" w:cs="Times New Roman"/>
         </w:rPr>
         <w:tab/>
+        <w:t xml:space="preserve">A. </w:t>
+      </w:r>
+      <w:proofErr w:type="gramStart"/>
+      <w:r>
+        <w:rPr>
+          <w:rFonts w:ascii="Times New Roman" w:hAnsi="Times New Roman" w:cs="Times New Roman"/>
+        </w:rPr>
+        <w:t>Dmitry, ‘</w:t>
+      </w:r>
+      <w:proofErr w:type="gramEnd"/>
+      <w:r>
+        <w:rPr>
+          <w:rFonts w:ascii="Times New Roman" w:hAnsi="Times New Roman" w:cs="Times New Roman"/>
+        </w:rPr>
+        <w:t>Effect of water quality on rainbow trout performance’.</w:t>
+      </w:r>
+    </w:p>
+    <w:p>
+      <w:pPr>
+        <w:pStyle w:val="Literaturverzeichnis"/>
+        <w:rPr>
+          <w:rFonts w:ascii="Times New Roman" w:hAnsi="Times New Roman" w:cs="Times New Roman"/>
+        </w:rPr>
+      </w:pPr>
+      <w:r>
+        <w:rPr>
+          <w:rFonts w:ascii="Times New Roman" w:hAnsi="Times New Roman" w:cs="Times New Roman"/>
+        </w:rPr>
+        <w:t>[23]</w:t>
+      </w:r>
+      <w:r>
+        <w:rPr>
+          <w:rFonts w:ascii="Times New Roman" w:hAnsi="Times New Roman" w:cs="Times New Roman"/>
+        </w:rPr>
+        <w:tab/>
         <w:t>‘</w:t>
       </w:r>
       <w:proofErr w:type="spellStart"/>
@@ -13945,7 +14788,7 @@
         <w:rPr>
           <w:rFonts w:ascii="Times New Roman" w:hAnsi="Times New Roman" w:cs="Times New Roman"/>
         </w:rPr>
-        <w:t>[23]</w:t>
+        <w:t>[24]</w:t>
       </w:r>
       <w:r>
         <w:rPr>
@@ -14054,7 +14897,7 @@
         <w:rPr>
           <w:rFonts w:ascii="Times New Roman" w:hAnsi="Times New Roman" w:cs="Times New Roman"/>
         </w:rPr>
-        <w:t>[24]</w:t>
+        <w:t>[25]</w:t>
       </w:r>
       <w:r>
         <w:rPr>

</xml_diff>

<commit_message>
removed digital twim from documentation
</commit_message>
<xml_diff>
--- a/Documentation.docx
+++ b/Documentation.docx
@@ -1226,19 +1226,21 @@
           <w:rFonts w:asciiTheme="minorHAnsi" w:eastAsiaTheme="minorEastAsia" w:hAnsiTheme="minorHAnsi" w:cstheme="minorBidi"/>
           <w:noProof/>
           <w:kern w:val="2"/>
-          <w:lang w:val="de-DE" w:eastAsia="de-DE"/>
+          <w:lang w:val="en-GB" w:eastAsia="de-DE"/>
           <w14:ligatures w14:val="standardContextual"/>
         </w:rPr>
       </w:pPr>
       <w:r>
         <w:rPr>
           <w:noProof/>
+          <w:lang w:val="en-GB"/>
         </w:rPr>
         <w:t>3.4.7 Fish Tank Temperature</w:t>
       </w:r>
       <w:r>
         <w:rPr>
           <w:noProof/>
+          <w:lang w:val="en-GB"/>
         </w:rPr>
         <w:tab/>
       </w:r>
@@ -1251,6 +1253,7 @@
       <w:r>
         <w:rPr>
           <w:noProof/>
+          <w:lang w:val="en-GB"/>
         </w:rPr>
         <w:instrText xml:space="preserve"> PAGEREF _Toc225009486 \h </w:instrText>
       </w:r>
@@ -1268,6 +1271,7 @@
       <w:r>
         <w:rPr>
           <w:noProof/>
+          <w:lang w:val="en-GB"/>
         </w:rPr>
         <w:t>12</w:t>
       </w:r>
@@ -1284,7 +1288,7 @@
         <w:rPr>
           <w:rFonts w:asciiTheme="minorHAnsi" w:eastAsiaTheme="minorEastAsia" w:hAnsiTheme="minorHAnsi" w:cstheme="minorBidi"/>
           <w:kern w:val="2"/>
-          <w:lang w:val="de-DE" w:eastAsia="de-DE"/>
+          <w:lang w:val="en-GB" w:eastAsia="de-DE"/>
           <w14:ligatures w14:val="standardContextual"/>
         </w:rPr>
       </w:pPr>
@@ -1299,7 +1303,7 @@
         <w:rPr>
           <w:rFonts w:asciiTheme="minorHAnsi" w:eastAsiaTheme="minorEastAsia" w:hAnsiTheme="minorHAnsi" w:cstheme="minorBidi"/>
           <w:kern w:val="2"/>
-          <w:lang w:val="de-DE" w:eastAsia="de-DE"/>
+          <w:lang w:val="en-GB" w:eastAsia="de-DE"/>
           <w14:ligatures w14:val="standardContextual"/>
         </w:rPr>
         <w:tab/>
@@ -1312,18 +1316,27 @@
         <w:t>Bibliography</w:t>
       </w:r>
       <w:r>
+        <w:rPr>
+          <w:lang w:val="en-GB"/>
+        </w:rPr>
         <w:tab/>
       </w:r>
       <w:r>
         <w:fldChar w:fldCharType="begin"/>
       </w:r>
       <w:r>
+        <w:rPr>
+          <w:lang w:val="en-GB"/>
+        </w:rPr>
         <w:instrText xml:space="preserve"> PAGEREF _Toc225009487 \h </w:instrText>
       </w:r>
       <w:r>
         <w:fldChar w:fldCharType="separate"/>
       </w:r>
       <w:r>
+        <w:rPr>
+          <w:lang w:val="en-GB"/>
+        </w:rPr>
         <w:t>13</w:t>
       </w:r>
       <w:r>
@@ -1398,79 +1411,44 @@
         <w:rPr>
           <w:lang w:val="en-GB"/>
         </w:rPr>
-        <w:t xml:space="preserve">The </w:t>
-      </w:r>
-      <w:proofErr w:type="spellStart"/>
-      <w:r>
-        <w:rPr>
-          <w:lang w:val="en-GB"/>
-        </w:rPr>
-        <w:t>Superfarm</w:t>
-      </w:r>
-      <w:proofErr w:type="spellEnd"/>
-      <w:r>
-        <w:rPr>
-          <w:lang w:val="en-GB"/>
-        </w:rPr>
-        <w:t xml:space="preserve"> project represents a transition from traditional linear industrial models to a circular "Waste-to-Value" framework. The project’s core philosophy, "Using Waste to Grow Fish and Plants," addresses the inherent inefficiencies in green hydrogen production, where byproduct oxygen and thermal energy are often treated as secondary waste streams rather than valuable resources.</w:t>
+        <w:t>The Superfarm project represents a transition from traditional linear industrial models to a circular "Waste-to-Value" framework. The project’s core philosophy, "Using Waste to Grow Fish and Plants," addresses the inherent inefficiencies in green hydrogen production, where byproduct oxygen and thermal energy are often treated as secondary waste streams rather than valuable resources.</w:t>
       </w:r>
     </w:p>
     <w:p>
       <w:pPr>
         <w:ind w:right="-1"/>
-      </w:pPr>
-      <w:r>
-        <w:rPr>
-          <w:lang w:val="en-GB"/>
-        </w:rPr>
-        <w:t xml:space="preserve">This simulation acts as a Digital Twin, providing a high-fidelity environment to validate the technical and economic viability of integrating electrolysis with localized agriculture. </w:t>
-      </w:r>
-      <w:proofErr w:type="spellStart"/>
-      <w:r>
-        <w:t>The</w:t>
-      </w:r>
-      <w:proofErr w:type="spellEnd"/>
-      <w:r>
-        <w:t xml:space="preserve"> </w:t>
-      </w:r>
-      <w:proofErr w:type="spellStart"/>
-      <w:r>
-        <w:t>primary</w:t>
-      </w:r>
-      <w:proofErr w:type="spellEnd"/>
-      <w:r>
-        <w:t xml:space="preserve"> </w:t>
-      </w:r>
-      <w:proofErr w:type="spellStart"/>
-      <w:r>
-        <w:t>objectives</w:t>
-      </w:r>
-      <w:proofErr w:type="spellEnd"/>
-      <w:r>
-        <w:t xml:space="preserve"> of </w:t>
-      </w:r>
-      <w:proofErr w:type="spellStart"/>
-      <w:r>
-        <w:t>the</w:t>
-      </w:r>
-      <w:proofErr w:type="spellEnd"/>
-      <w:r>
-        <w:t xml:space="preserve"> </w:t>
-      </w:r>
-      <w:proofErr w:type="spellStart"/>
-      <w:r>
-        <w:t>model</w:t>
-      </w:r>
-      <w:proofErr w:type="spellEnd"/>
-      <w:r>
-        <w:t xml:space="preserve"> </w:t>
-      </w:r>
-      <w:proofErr w:type="spellStart"/>
-      <w:r>
-        <w:t>are</w:t>
-      </w:r>
-      <w:proofErr w:type="spellEnd"/>
-      <w:r>
+        <w:rPr>
+          <w:lang w:val="en-GB"/>
+        </w:rPr>
+      </w:pPr>
+      <w:r>
+        <w:rPr>
+          <w:lang w:val="en-GB"/>
+        </w:rPr>
+        <w:t xml:space="preserve">This simulation </w:t>
+      </w:r>
+      <w:r>
+        <w:rPr>
+          <w:lang w:val="en-GB"/>
+        </w:rPr>
+        <w:t>is intended</w:t>
+      </w:r>
+      <w:r>
+        <w:rPr>
+          <w:lang w:val="en-GB"/>
+        </w:rPr>
+        <w:t xml:space="preserve"> to validate the technical and economic viability of integrating electrolysis with localized agriculture. </w:t>
+      </w:r>
+      <w:r>
+        <w:rPr>
+          <w:lang w:val="en-GB"/>
+        </w:rPr>
+        <w:t>The primary objectives of the model are</w:t>
+      </w:r>
+      <w:r>
+        <w:rPr>
+          <w:lang w:val="en-GB"/>
+        </w:rPr>
         <w:t>:</w:t>
       </w:r>
     </w:p>
@@ -1683,157 +1661,45 @@
         <w:rPr>
           <w:lang w:val="en-US" w:eastAsia="en-US"/>
         </w:rPr>
-        <w:t xml:space="preserve">Figure 1: System Dynamics Architecture of the </w:t>
-      </w:r>
-      <w:proofErr w:type="spellStart"/>
-      <w:r>
+        <w:t>Figure 1: System Dynamics Architecture of the Superfarm Digital Twin in AnyLogic.</w:t>
+      </w:r>
+    </w:p>
+    <w:p>
+      <w:pPr>
+        <w:ind w:right="-1"/>
         <w:rPr>
           <w:lang w:val="en-US" w:eastAsia="en-US"/>
         </w:rPr>
-        <w:t>Superfarm</w:t>
-      </w:r>
-      <w:proofErr w:type="spellEnd"/>
+      </w:pPr>
       <w:r>
         <w:rPr>
           <w:lang w:val="en-US" w:eastAsia="en-US"/>
         </w:rPr>
-        <w:t xml:space="preserve"> Digital Twin in </w:t>
-      </w:r>
-      <w:proofErr w:type="spellStart"/>
-      <w:r>
+        <w:t>To ensure a high-fidelity representation of the Superfarm system, the model employs a multilayered modular design:</w:t>
+      </w:r>
+    </w:p>
+    <w:p>
+      <w:pPr>
+        <w:pStyle w:val="berschrift2"/>
+      </w:pPr>
+      <w:bookmarkStart w:id="6" w:name="_Toc225009470"/>
+      <w:r>
+        <w:t>The Core: Electrolyzer Unit</w:t>
+      </w:r>
+      <w:bookmarkEnd w:id="6"/>
+    </w:p>
+    <w:p>
+      <w:pPr>
+        <w:ind w:right="-1"/>
         <w:rPr>
           <w:lang w:val="en-US" w:eastAsia="en-US"/>
         </w:rPr>
-        <w:t>AnyLogic</w:t>
-      </w:r>
-      <w:proofErr w:type="spellEnd"/>
+      </w:pPr>
       <w:r>
         <w:rPr>
           <w:lang w:val="en-US" w:eastAsia="en-US"/>
         </w:rPr>
-        <w:t>.</w:t>
-      </w:r>
-    </w:p>
-    <w:p>
-      <w:pPr>
-        <w:ind w:right="-1"/>
-        <w:rPr>
-          <w:lang w:val="en-US" w:eastAsia="en-US"/>
-        </w:rPr>
-      </w:pPr>
-      <w:r>
-        <w:rPr>
-          <w:lang w:val="en-US" w:eastAsia="en-US"/>
-        </w:rPr>
-        <w:t xml:space="preserve">To ensure a high-fidelity representation of the </w:t>
-      </w:r>
-      <w:proofErr w:type="spellStart"/>
-      <w:r>
-        <w:rPr>
-          <w:lang w:val="en-US" w:eastAsia="en-US"/>
-        </w:rPr>
-        <w:t>Superfarm</w:t>
-      </w:r>
-      <w:proofErr w:type="spellEnd"/>
-      <w:r>
-        <w:rPr>
-          <w:lang w:val="en-US" w:eastAsia="en-US"/>
-        </w:rPr>
-        <w:t xml:space="preserve"> system, the model employs a multilayered modular design:</w:t>
-      </w:r>
-    </w:p>
-    <w:p>
-      <w:pPr>
-        <w:pStyle w:val="berschrift2"/>
-      </w:pPr>
-      <w:bookmarkStart w:id="6" w:name="_Toc225009470"/>
-      <w:r>
-        <w:t>The Core: Electrolyzer Unit</w:t>
-      </w:r>
-      <w:bookmarkEnd w:id="6"/>
-    </w:p>
-    <w:p>
-      <w:pPr>
-        <w:ind w:right="-1"/>
-        <w:rPr>
-          <w:lang w:val="en-US" w:eastAsia="en-US"/>
-        </w:rPr>
-      </w:pPr>
-      <w:r>
-        <w:rPr>
-          <w:lang w:val="en-US" w:eastAsia="en-US"/>
-        </w:rPr>
-        <w:t xml:space="preserve">The </w:t>
-      </w:r>
-      <w:proofErr w:type="spellStart"/>
-      <w:r>
-        <w:rPr>
-          <w:lang w:val="en-US" w:eastAsia="en-US"/>
-        </w:rPr>
-        <w:t>electrolyzer</w:t>
-      </w:r>
-      <w:proofErr w:type="spellEnd"/>
-      <w:r>
-        <w:rPr>
-          <w:lang w:val="en-US" w:eastAsia="en-US"/>
-        </w:rPr>
-        <w:t xml:space="preserve"> acts as the primary source node in the simulation. It takes electrical power input (</w:t>
-      </w:r>
-      <w:proofErr w:type="spellStart"/>
-      <w:r>
-        <w:rPr>
-          <w:lang w:val="en-US" w:eastAsia="en-US"/>
-        </w:rPr>
-        <w:t>P_Electrolyzer</w:t>
-      </w:r>
-      <w:proofErr w:type="spellEnd"/>
-      <w:r>
-        <w:rPr>
-          <w:lang w:val="en-US" w:eastAsia="en-US"/>
-        </w:rPr>
-        <w:t>) and, based on the reaction enthalpy (</w:t>
-      </w:r>
-      <w:proofErr w:type="spellStart"/>
-      <w:r>
-        <w:rPr>
-          <w:lang w:val="en-US" w:eastAsia="en-US"/>
-        </w:rPr>
-        <w:t>Delta_h</w:t>
-      </w:r>
-      <w:proofErr w:type="spellEnd"/>
-      <w:r>
-        <w:rPr>
-          <w:lang w:val="en-US" w:eastAsia="en-US"/>
-        </w:rPr>
-        <w:t>) and efficiency (</w:t>
-      </w:r>
-      <w:proofErr w:type="spellStart"/>
-      <w:r>
-        <w:rPr>
-          <w:lang w:val="en-US" w:eastAsia="en-US"/>
-        </w:rPr>
-        <w:t>Eff_Electrolyzer</w:t>
-      </w:r>
-      <w:proofErr w:type="spellEnd"/>
-      <w:r>
-        <w:rPr>
-          <w:lang w:val="en-US" w:eastAsia="en-US"/>
-        </w:rPr>
-        <w:t>), generates three simultaneous outputs: Hydrogen gas, Oxygen gas, and Dissipated Heat (</w:t>
-      </w:r>
-      <w:proofErr w:type="spellStart"/>
-      <w:r>
-        <w:rPr>
-          <w:lang w:val="en-US" w:eastAsia="en-US"/>
-        </w:rPr>
-        <w:t>Q_prod</w:t>
-      </w:r>
-      <w:proofErr w:type="spellEnd"/>
-      <w:r>
-        <w:rPr>
-          <w:lang w:val="en-US" w:eastAsia="en-US"/>
-        </w:rPr>
-        <w:t>)</w:t>
+        <w:t>The electrolyzer acts as the primary source node in the simulation. It takes electrical power input (P_Electrolyzer) and, based on the reaction enthalpy (Delta_h) and efficiency (Eff_Electrolyzer), generates three simultaneous outputs: Hydrogen gas, Oxygen gas, and Dissipated Heat (Q_prod)</w:t>
       </w:r>
       <w:r>
         <w:rPr>
@@ -2141,35 +2007,7 @@
         <w:rPr>
           <w:lang w:val="en-US" w:eastAsia="en-US"/>
         </w:rPr>
-        <w:t>The dissipated heat (</w:t>
-      </w:r>
-      <w:proofErr w:type="spellStart"/>
-      <w:r>
-        <w:rPr>
-          <w:lang w:val="en-US" w:eastAsia="en-US"/>
-        </w:rPr>
-        <w:t>Q_prod</w:t>
-      </w:r>
-      <w:proofErr w:type="spellEnd"/>
-      <w:r>
-        <w:rPr>
-          <w:lang w:val="en-US" w:eastAsia="en-US"/>
-        </w:rPr>
-        <w:t>) is captured and stored in a central energy storage unit (</w:t>
-      </w:r>
-      <w:proofErr w:type="spellStart"/>
-      <w:r>
-        <w:rPr>
-          <w:lang w:val="en-US" w:eastAsia="en-US"/>
-        </w:rPr>
-        <w:t>Q_store</w:t>
-      </w:r>
-      <w:proofErr w:type="spellEnd"/>
-      <w:r>
-        <w:rPr>
-          <w:lang w:val="en-US" w:eastAsia="en-US"/>
-        </w:rPr>
-        <w:t>)</w:t>
+        <w:t>The dissipated heat (Q_prod) is captured and stored in a central energy storage unit (Q_store)</w:t>
       </w:r>
       <w:r>
         <w:rPr>
@@ -2220,14 +2058,12 @@
         </w:rPr>
         <w:t xml:space="preserve"> (</w:t>
       </w:r>
-      <w:proofErr w:type="spellStart"/>
       <w:r>
         <w:rPr>
           <w:lang w:val="en-US" w:eastAsia="en-US"/>
         </w:rPr>
         <w:t>Q_tank_in</w:t>
       </w:r>
-      <w:proofErr w:type="spellEnd"/>
       <w:r>
         <w:rPr>
           <w:lang w:val="en-US" w:eastAsia="en-US"/>
@@ -2238,92 +2074,74 @@
         <w:rPr>
           <w:lang w:val="en-US" w:eastAsia="en-US"/>
         </w:rPr>
-        <w:t xml:space="preserve"> to regulate the fish tank temperature (</w:t>
-      </w:r>
-      <w:proofErr w:type="spellStart"/>
+        <w:t xml:space="preserve"> to regulate the fish tank temperature (T_tank), </w:t>
+      </w:r>
       <w:r>
         <w:rPr>
           <w:lang w:val="en-US" w:eastAsia="en-US"/>
         </w:rPr>
-        <w:t>T_tank</w:t>
-      </w:r>
-      <w:proofErr w:type="spellEnd"/>
+        <w:t>considering water properties such as density</w:t>
+      </w:r>
       <w:r>
         <w:rPr>
           <w:lang w:val="en-US" w:eastAsia="en-US"/>
         </w:rPr>
-        <w:t xml:space="preserve">), </w:t>
+        <w:t xml:space="preserve"> </w:t>
       </w:r>
       <w:r>
         <w:rPr>
           <w:lang w:val="en-US" w:eastAsia="en-US"/>
         </w:rPr>
-        <w:t>considering water properties such as density</w:t>
+        <w:t>(</w:t>
       </w:r>
       <w:r>
         <w:rPr>
           <w:lang w:val="en-US" w:eastAsia="en-US"/>
         </w:rPr>
+        <w:t>rho_water</w:t>
+      </w:r>
+      <w:r>
+        <w:rPr>
+          <w:lang w:val="en-US" w:eastAsia="en-US"/>
+        </w:rPr>
+        <w:t>)</w:t>
+      </w:r>
+      <w:r>
+        <w:rPr>
+          <w:lang w:val="en-US" w:eastAsia="en-US"/>
+        </w:rPr>
+        <w:t xml:space="preserve"> and</w:t>
+      </w:r>
+      <w:r>
+        <w:rPr>
+          <w:lang w:val="en-US" w:eastAsia="en-US"/>
+        </w:rPr>
         <w:t xml:space="preserve"> </w:t>
       </w:r>
       <w:r>
         <w:rPr>
           <w:lang w:val="en-US" w:eastAsia="en-US"/>
         </w:rPr>
+        <w:t>specific heat capacity</w:t>
+      </w:r>
+      <w:r>
+        <w:rPr>
+          <w:lang w:val="en-US" w:eastAsia="en-US"/>
+        </w:rPr>
+        <w:t xml:space="preserve"> </w:t>
+      </w:r>
+      <w:r>
+        <w:rPr>
+          <w:lang w:val="en-US" w:eastAsia="en-US"/>
+        </w:rPr>
         <w:t>(</w:t>
       </w:r>
-      <w:proofErr w:type="spellStart"/>
       <w:r>
         <w:rPr>
           <w:lang w:val="en-US" w:eastAsia="en-US"/>
         </w:rPr>
-        <w:t>rho_water</w:t>
-      </w:r>
-      <w:proofErr w:type="spellEnd"/>
-      <w:r>
-        <w:rPr>
-          <w:lang w:val="en-US" w:eastAsia="en-US"/>
-        </w:rPr>
-        <w:t>)</w:t>
-      </w:r>
-      <w:r>
-        <w:rPr>
-          <w:lang w:val="en-US" w:eastAsia="en-US"/>
-        </w:rPr>
-        <w:t xml:space="preserve"> and</w:t>
-      </w:r>
-      <w:r>
-        <w:rPr>
-          <w:lang w:val="en-US" w:eastAsia="en-US"/>
-        </w:rPr>
-        <w:t xml:space="preserve"> </w:t>
-      </w:r>
-      <w:r>
-        <w:rPr>
-          <w:lang w:val="en-US" w:eastAsia="en-US"/>
-        </w:rPr>
-        <w:t>specific heat capacity</w:t>
-      </w:r>
-      <w:r>
-        <w:rPr>
-          <w:lang w:val="en-US" w:eastAsia="en-US"/>
-        </w:rPr>
-        <w:t xml:space="preserve"> </w:t>
-      </w:r>
-      <w:r>
-        <w:rPr>
-          <w:lang w:val="en-US" w:eastAsia="en-US"/>
-        </w:rPr>
-        <w:t>(</w:t>
-      </w:r>
-      <w:proofErr w:type="spellStart"/>
-      <w:r>
-        <w:rPr>
-          <w:lang w:val="en-US" w:eastAsia="en-US"/>
-        </w:rPr>
         <w:t>cp_water</w:t>
       </w:r>
-      <w:proofErr w:type="spellEnd"/>
       <w:r>
         <w:rPr>
           <w:lang w:val="en-US" w:eastAsia="en-US"/>
@@ -2353,30 +2171,8 @@
         <w:rPr>
           <w:lang w:val="en-US" w:eastAsia="en-US"/>
         </w:rPr>
-        <w:t>Greenhouse Heating: Simultaneously, heat is transferred through a heat flow (</w:t>
-      </w:r>
-      <w:proofErr w:type="spellStart"/>
-      <w:r>
-        <w:rPr>
-          <w:lang w:val="en-US" w:eastAsia="en-US"/>
-        </w:rPr>
-        <w:t>Q_greenhouse_in</w:t>
-      </w:r>
-      <w:proofErr w:type="spellEnd"/>
-      <w:r>
-        <w:rPr>
-          <w:lang w:val="en-US" w:eastAsia="en-US"/>
-        </w:rPr>
-        <w:t>) to the vertical farm module to maintain the greenhouse temperature (</w:t>
-      </w:r>
-      <w:proofErr w:type="spellStart"/>
-      <w:r>
-        <w:rPr>
-          <w:lang w:val="en-US" w:eastAsia="en-US"/>
-        </w:rPr>
-        <w:t>T_greenhouse</w:t>
-      </w:r>
-      <w:proofErr w:type="spellEnd"/>
+        <w:t>Greenhouse Heating: Simultaneously, heat is transferred through a heat flow (Q_greenhouse_in) to the vertical farm module to maintain the greenhouse temperature (T_greenhouse</w:t>
+      </w:r>
       <w:r>
         <w:rPr>
           <w:lang w:val="en-US" w:eastAsia="en-US"/>
@@ -2408,70 +2204,68 @@
         </w:rPr>
         <w:t>two heat flows (</w:t>
       </w:r>
-      <w:proofErr w:type="spellStart"/>
       <w:r>
         <w:rPr>
           <w:lang w:val="en-US" w:eastAsia="en-US"/>
         </w:rPr>
-        <w:t>Q_diss_tank</w:t>
-      </w:r>
-      <w:proofErr w:type="spellEnd"/>
+        <w:t>Q_diss_tank and Q_diss_greenhouse</w:t>
+      </w:r>
       <w:r>
         <w:rPr>
           <w:lang w:val="en-US" w:eastAsia="en-US"/>
         </w:rPr>
-        <w:t xml:space="preserve"> and </w:t>
-      </w:r>
-      <w:proofErr w:type="spellStart"/>
+        <w:t>)</w:t>
+      </w:r>
       <w:r>
         <w:rPr>
           <w:lang w:val="en-US" w:eastAsia="en-US"/>
         </w:rPr>
-        <w:t>Q_</w:t>
-      </w:r>
-      <w:proofErr w:type="gramStart"/>
+        <w:t xml:space="preserve"> to </w:t>
+      </w:r>
+      <w:r>
+        <w:rPr>
+          <w:lang w:val="en-GB" w:eastAsia="en-US"/>
+        </w:rPr>
+        <w:t xml:space="preserve">evaluate </w:t>
+      </w:r>
       <w:r>
         <w:rPr>
           <w:lang w:val="en-US" w:eastAsia="en-US"/>
         </w:rPr>
-        <w:t>diss</w:t>
-      </w:r>
-      <w:proofErr w:type="gramEnd"/>
+        <w:t>the system's thermal efficiency</w:t>
+      </w:r>
       <w:r>
         <w:rPr>
           <w:lang w:val="en-US" w:eastAsia="en-US"/>
         </w:rPr>
-        <w:t>_greenhouse</w:t>
-      </w:r>
-      <w:proofErr w:type="spellEnd"/>
+        <w:t>.</w:t>
+      </w:r>
+    </w:p>
+    <w:p>
+      <w:pPr>
+        <w:pStyle w:val="berschrift2"/>
+      </w:pPr>
+      <w:r>
+        <w:t>Model Parameters and Logic</w:t>
+      </w:r>
+    </w:p>
+    <w:p>
+      <w:pPr>
+        <w:ind w:right="-1"/>
+        <w:rPr>
+          <w:lang w:val="en-GB"/>
+        </w:rPr>
+      </w:pPr>
       <w:r>
         <w:rPr>
           <w:lang w:val="en-US" w:eastAsia="en-US"/>
         </w:rPr>
-        <w:t>)</w:t>
+        <w:t>The model is of a hypothetical hydrogen plant with PEM electrolyzers. The power for plant operation comes from an islanded wind farm with a similar capacity. It is assumed that the heat output of the electrolyzer is very large compared with the oxygen output. Therefore, the fish farm is sized first, based on the oxygen output, and the greenhouse is sized based on the heat remaining after the fish farm demand has been calculated</w:t>
       </w:r>
       <w:r>
         <w:rPr>
           <w:lang w:val="en-US" w:eastAsia="en-US"/>
         </w:rPr>
-        <w:t xml:space="preserve"> to </w:t>
-      </w:r>
-      <w:r>
-        <w:rPr>
-          <w:lang w:val="en-GB" w:eastAsia="en-US"/>
-        </w:rPr>
-        <w:t xml:space="preserve">evaluate </w:t>
-      </w:r>
-      <w:r>
-        <w:rPr>
-          <w:lang w:val="en-US" w:eastAsia="en-US"/>
-        </w:rPr>
-        <w:t>the system's thermal efficiency</w:t>
-      </w:r>
-      <w:r>
-        <w:rPr>
-          <w:lang w:val="en-US" w:eastAsia="en-US"/>
-        </w:rPr>
         <w:t>.</w:t>
       </w:r>
     </w:p>
@@ -2479,80 +2273,16 @@
       <w:pPr>
         <w:pStyle w:val="berschrift2"/>
       </w:pPr>
-      <w:r>
-        <w:t>Model Parameters and Logic</w:t>
-      </w:r>
+      <w:bookmarkStart w:id="9" w:name="_Toc225009474"/>
+      <w:r>
+        <w:t>Wind Farm (P_electrolyzer)</w:t>
+      </w:r>
+      <w:bookmarkEnd w:id="9"/>
     </w:p>
     <w:p>
       <w:pPr>
         <w:ind w:right="-1"/>
         <w:rPr>
-          <w:lang w:val="en-GB"/>
-        </w:rPr>
-      </w:pPr>
-      <w:r>
-        <w:rPr>
-          <w:lang w:val="en-US" w:eastAsia="en-US"/>
-        </w:rPr>
-        <w:t xml:space="preserve">The model is of a hypothetical hydrogen plant with PEM </w:t>
-      </w:r>
-      <w:proofErr w:type="spellStart"/>
-      <w:r>
-        <w:rPr>
-          <w:lang w:val="en-US" w:eastAsia="en-US"/>
-        </w:rPr>
-        <w:t>electrolyzers</w:t>
-      </w:r>
-      <w:proofErr w:type="spellEnd"/>
-      <w:r>
-        <w:rPr>
-          <w:lang w:val="en-US" w:eastAsia="en-US"/>
-        </w:rPr>
-        <w:t xml:space="preserve">. The power for plant operation comes from an islanded wind farm with a similar capacity. It is assumed that the heat output of the </w:t>
-      </w:r>
-      <w:proofErr w:type="spellStart"/>
-      <w:r>
-        <w:rPr>
-          <w:lang w:val="en-US" w:eastAsia="en-US"/>
-        </w:rPr>
-        <w:t>electrolyzer</w:t>
-      </w:r>
-      <w:proofErr w:type="spellEnd"/>
-      <w:r>
-        <w:rPr>
-          <w:lang w:val="en-US" w:eastAsia="en-US"/>
-        </w:rPr>
-        <w:t xml:space="preserve"> is very large compared with the oxygen output. Therefore, the fish farm is sized first, based on the oxygen output, and the greenhouse is sized based on the heat remaining after the fish farm demand has been calculated</w:t>
-      </w:r>
-      <w:r>
-        <w:rPr>
-          <w:lang w:val="en-US" w:eastAsia="en-US"/>
-        </w:rPr>
-        <w:t>.</w:t>
-      </w:r>
-    </w:p>
-    <w:p>
-      <w:pPr>
-        <w:pStyle w:val="berschrift2"/>
-      </w:pPr>
-      <w:bookmarkStart w:id="9" w:name="_Toc225009474"/>
-      <w:r>
-        <w:t>Wind Farm (</w:t>
-      </w:r>
-      <w:proofErr w:type="spellStart"/>
-      <w:r>
-        <w:t>P_electrolyzer</w:t>
-      </w:r>
-      <w:proofErr w:type="spellEnd"/>
-      <w:r>
-        <w:t>)</w:t>
-      </w:r>
-      <w:bookmarkEnd w:id="9"/>
-    </w:p>
-    <w:p>
-      <w:pPr>
-        <w:ind w:right="-1"/>
-        <w:rPr>
           <w:rFonts w:cs="Calibri"/>
         </w:rPr>
       </w:pPr>
@@ -2608,148 +2338,52 @@
           <w:lang w:val="en-GB"/>
         </w:rPr>
         <w:lastRenderedPageBreak/>
-        <w:t xml:space="preserve">hours was scaled to data from </w:t>
-      </w:r>
-      <w:proofErr w:type="spellStart"/>
+        <w:t xml:space="preserve">hours was scaled to data from Fingrid </w:t>
+      </w:r>
       <w:r>
         <w:rPr>
           <w:rFonts w:cs="Calibri"/>
-          <w:lang w:val="en-GB"/>
-        </w:rPr>
-        <w:t>Fingrid</w:t>
-      </w:r>
-      <w:proofErr w:type="spellEnd"/>
+        </w:rPr>
+        <w:fldChar w:fldCharType="begin"/>
+      </w:r>
       <w:r>
         <w:rPr>
           <w:rFonts w:cs="Calibri"/>
           <w:lang w:val="en-GB"/>
         </w:rPr>
-        <w:t xml:space="preserve"> </w:t>
+        <w:instrText xml:space="preserve"> ADDIN ZOTERO_ITEM CSL_CITATION {"citationID":"XfvlAsyt","properties":{"formattedCitation":"[2]","plainCitation":"[2]","noteIndex":0},"citationItems":[{"id":356,"uris":["http://zotero.org/groups/6447497/items/9ELM3ZNS"],"itemData":{"id":356,"type":"webpage","title":"Download datasets","URL":"https://data.fingrid.fi/en/data?datasets=181","accessed":{"date-parts":[["2026",3,9]]}}}],"schema":"https://github.com/citation-style-language/schema/raw/master/csl-citation.json"} </w:instrText>
       </w:r>
       <w:r>
         <w:rPr>
           <w:rFonts w:cs="Calibri"/>
         </w:rPr>
-        <w:fldChar w:fldCharType="begin"/>
+        <w:fldChar w:fldCharType="separate"/>
+      </w:r>
+      <w:r>
+        <w:rPr>
+          <w:rFonts w:ascii="Aptos" w:hAnsi="Aptos"/>
+          <w:lang w:val="en-GB"/>
+        </w:rPr>
+        <w:t>[2]</w:t>
       </w:r>
       <w:r>
         <w:rPr>
           <w:rFonts w:cs="Calibri"/>
-          <w:lang w:val="en-GB"/>
-        </w:rPr>
-        <w:instrText xml:space="preserve"> ADDIN ZOTERO_ITEM CSL_CITATION {"citationID":"XfvlAsyt","properties":{"formattedCitation":"[2]","plainCitation":"[2]","noteIndex":0},"citationItems":[{"id":356,"uris":["http://zotero.org/groups/6447497/items/9ELM3ZNS"],"itemData":{"id":356,"type":"webpage","title":"Download datasets","URL":"https://data.fingrid.fi/en/data?datasets=181","accessed":{"date-parts":[["2026",3,9]]}}}],"schema":"https://github.com/citation-style-language/schema/raw/master/csl-citation.json"} </w:instrText>
+        </w:rPr>
+        <w:fldChar w:fldCharType="end"/>
       </w:r>
       <w:r>
         <w:rPr>
           <w:rFonts w:cs="Calibri"/>
-        </w:rPr>
-        <w:fldChar w:fldCharType="separate"/>
-      </w:r>
-      <w:r>
-        <w:rPr>
-          <w:rFonts w:ascii="Aptos" w:hAnsi="Aptos"/>
-          <w:lang w:val="en-GB"/>
-        </w:rPr>
-        <w:t>[2]</w:t>
+          <w:lang w:val="en-GB"/>
+        </w:rPr>
+        <w:t xml:space="preserve">. Although Fingrid data is for all of Finland, data for specific wind farms is not easily found. Therefore, the profile is the best approximation for our project. </w:t>
       </w:r>
       <w:r>
         <w:rPr>
           <w:rFonts w:cs="Calibri"/>
         </w:rPr>
-        <w:fldChar w:fldCharType="end"/>
-      </w:r>
-      <w:r>
-        <w:rPr>
-          <w:rFonts w:cs="Calibri"/>
-          <w:lang w:val="en-GB"/>
-        </w:rPr>
-        <w:t xml:space="preserve">. Although </w:t>
-      </w:r>
-      <w:proofErr w:type="spellStart"/>
-      <w:r>
-        <w:rPr>
-          <w:rFonts w:cs="Calibri"/>
-          <w:lang w:val="en-GB"/>
-        </w:rPr>
-        <w:t>Fingrid</w:t>
-      </w:r>
-      <w:proofErr w:type="spellEnd"/>
-      <w:r>
-        <w:rPr>
-          <w:rFonts w:cs="Calibri"/>
-          <w:lang w:val="en-GB"/>
-        </w:rPr>
-        <w:t xml:space="preserve"> data is for all of Finland, data for specific wind farms is not easily found. Therefore, the profile is the best approximation for our project. </w:t>
-      </w:r>
-      <w:proofErr w:type="spellStart"/>
-      <w:r>
-        <w:rPr>
-          <w:rFonts w:cs="Calibri"/>
-        </w:rPr>
-        <w:t>The</w:t>
-      </w:r>
-      <w:proofErr w:type="spellEnd"/>
-      <w:r>
-        <w:rPr>
-          <w:rFonts w:cs="Calibri"/>
-        </w:rPr>
-        <w:t xml:space="preserve"> </w:t>
-      </w:r>
-      <w:proofErr w:type="spellStart"/>
-      <w:r>
-        <w:rPr>
-          <w:rFonts w:cs="Calibri"/>
-        </w:rPr>
-        <w:t>power</w:t>
-      </w:r>
-      <w:proofErr w:type="spellEnd"/>
-      <w:r>
-        <w:rPr>
-          <w:rFonts w:cs="Calibri"/>
-        </w:rPr>
-        <w:t xml:space="preserve"> output </w:t>
-      </w:r>
-      <w:proofErr w:type="spellStart"/>
-      <w:r>
-        <w:rPr>
-          <w:rFonts w:cs="Calibri"/>
-        </w:rPr>
-        <w:t>was</w:t>
-      </w:r>
-      <w:proofErr w:type="spellEnd"/>
-      <w:r>
-        <w:rPr>
-          <w:rFonts w:cs="Calibri"/>
-        </w:rPr>
-        <w:t xml:space="preserve"> </w:t>
-      </w:r>
-      <w:proofErr w:type="spellStart"/>
-      <w:r>
-        <w:rPr>
-          <w:rFonts w:cs="Calibri"/>
-        </w:rPr>
-        <w:t>scaled</w:t>
-      </w:r>
-      <w:proofErr w:type="spellEnd"/>
-      <w:r>
-        <w:rPr>
-          <w:rFonts w:cs="Calibri"/>
-        </w:rPr>
-        <w:t xml:space="preserve"> as </w:t>
-      </w:r>
-      <w:proofErr w:type="spellStart"/>
-      <w:r>
-        <w:rPr>
-          <w:rFonts w:cs="Calibri"/>
-        </w:rPr>
-        <w:t>follows</w:t>
-      </w:r>
-      <w:proofErr w:type="spellEnd"/>
-      <w:r>
-        <w:rPr>
-          <w:rFonts w:cs="Calibri"/>
-        </w:rPr>
-        <w:t>:</w:t>
+        <w:t>The power output was scaled as follows:</w:t>
       </w:r>
     </w:p>
     <w:p>
@@ -2768,21 +2402,7 @@
         <w:rPr>
           <w:lang w:val="en-GB"/>
         </w:rPr>
-        <w:t xml:space="preserve">Hourly Averaging: The raw 3-minute real-time production data from </w:t>
-      </w:r>
-      <w:proofErr w:type="spellStart"/>
-      <w:r>
-        <w:rPr>
-          <w:lang w:val="en-GB"/>
-        </w:rPr>
-        <w:t>Fingrid</w:t>
-      </w:r>
-      <w:proofErr w:type="spellEnd"/>
-      <w:r>
-        <w:rPr>
-          <w:lang w:val="en-GB"/>
-        </w:rPr>
-        <w:t xml:space="preserve"> (March 6th-7th) was aggregated into hourly mean values to provide a consistent daily profile.</w:t>
+        <w:t>Hourly Averaging: The raw 3-minute real-time production data from Fingrid (March 6th-7th) was aggregated into hourly mean values to provide a consistent daily profile.</w:t>
       </w:r>
     </w:p>
     <w:p>
@@ -3058,73 +2678,21 @@
           <w:numId w:val="0"/>
         </w:numPr>
         <w:ind w:left="624" w:hanging="624"/>
+        <w:rPr>
+          <w:lang w:val="en-GB"/>
+        </w:rPr>
       </w:pPr>
       <w:bookmarkStart w:id="11" w:name="_Toc225009476"/>
-      <w:proofErr w:type="spellStart"/>
       <w:r>
         <w:rPr>
           <w:rStyle w:val="Fett"/>
           <w:b/>
           <w:bCs/>
-        </w:rPr>
-        <w:t>Sizing</w:t>
-      </w:r>
-      <w:proofErr w:type="spellEnd"/>
-      <w:r>
-        <w:rPr>
-          <w:rStyle w:val="Fett"/>
-          <w:b/>
-          <w:bCs/>
-        </w:rPr>
-        <w:t xml:space="preserve"> </w:t>
-      </w:r>
-      <w:proofErr w:type="spellStart"/>
-      <w:r>
-        <w:rPr>
-          <w:rStyle w:val="Fett"/>
-          <w:b/>
-          <w:bCs/>
-        </w:rPr>
-        <w:t>the</w:t>
-      </w:r>
-      <w:proofErr w:type="spellEnd"/>
-      <w:r>
-        <w:rPr>
-          <w:rStyle w:val="Fett"/>
-          <w:b/>
-          <w:bCs/>
-        </w:rPr>
-        <w:t xml:space="preserve"> </w:t>
-      </w:r>
-      <w:proofErr w:type="spellStart"/>
-      <w:r>
-        <w:rPr>
-          <w:rStyle w:val="Fett"/>
-          <w:b/>
-          <w:bCs/>
-        </w:rPr>
-        <w:t>Fish</w:t>
-      </w:r>
-      <w:proofErr w:type="spellEnd"/>
-      <w:r>
-        <w:rPr>
-          <w:rStyle w:val="Fett"/>
-          <w:b/>
-          <w:bCs/>
-        </w:rPr>
-        <w:t xml:space="preserve"> </w:t>
-      </w:r>
-      <w:proofErr w:type="spellStart"/>
-      <w:r>
-        <w:rPr>
-          <w:rStyle w:val="Fett"/>
-          <w:b/>
-          <w:bCs/>
-        </w:rPr>
-        <w:t>Tank</w:t>
+          <w:lang w:val="en-GB"/>
+        </w:rPr>
+        <w:t>Sizing the Fish Tank</w:t>
       </w:r>
       <w:bookmarkEnd w:id="11"/>
-      <w:proofErr w:type="spellEnd"/>
     </w:p>
     <w:p>
       <w:pPr>
@@ -4349,74 +3917,20 @@
           <w:rStyle w:val="Fett"/>
           <w:b/>
           <w:bCs/>
+          <w:lang w:val="en-GB"/>
         </w:rPr>
       </w:pPr>
       <w:bookmarkStart w:id="12" w:name="_Toc225009477"/>
-      <w:proofErr w:type="spellStart"/>
       <w:r>
         <w:rPr>
           <w:rStyle w:val="Fett"/>
           <w:b/>
           <w:bCs/>
-        </w:rPr>
-        <w:t>Fish</w:t>
-      </w:r>
-      <w:proofErr w:type="spellEnd"/>
-      <w:r>
-        <w:rPr>
-          <w:rStyle w:val="Fett"/>
-          <w:b/>
-          <w:bCs/>
-        </w:rPr>
-        <w:t xml:space="preserve"> </w:t>
-      </w:r>
-      <w:proofErr w:type="spellStart"/>
-      <w:r>
-        <w:rPr>
-          <w:rStyle w:val="Fett"/>
-          <w:b/>
-          <w:bCs/>
-        </w:rPr>
-        <w:t>Tank</w:t>
-      </w:r>
-      <w:proofErr w:type="spellEnd"/>
-      <w:r>
-        <w:rPr>
-          <w:rStyle w:val="Fett"/>
-          <w:b/>
-          <w:bCs/>
-        </w:rPr>
-        <w:t xml:space="preserve"> </w:t>
-      </w:r>
-      <w:proofErr w:type="spellStart"/>
-      <w:r>
-        <w:rPr>
-          <w:rStyle w:val="Fett"/>
-          <w:b/>
-          <w:bCs/>
-        </w:rPr>
-        <w:t>Heat</w:t>
-      </w:r>
-      <w:proofErr w:type="spellEnd"/>
-      <w:r>
-        <w:rPr>
-          <w:rStyle w:val="Fett"/>
-          <w:b/>
-          <w:bCs/>
-        </w:rPr>
-        <w:t xml:space="preserve"> </w:t>
-      </w:r>
-      <w:proofErr w:type="spellStart"/>
-      <w:r>
-        <w:rPr>
-          <w:rStyle w:val="Fett"/>
-          <w:b/>
-          <w:bCs/>
-        </w:rPr>
-        <w:t>Losses</w:t>
+          <w:lang w:val="en-GB"/>
+        </w:rPr>
+        <w:t>Fish Tank Heat Losses</w:t>
       </w:r>
       <w:bookmarkEnd w:id="12"/>
-      <w:proofErr w:type="spellEnd"/>
     </w:p>
     <w:p>
       <w:pPr>
@@ -4718,21 +4232,7 @@
             <w:rFonts w:ascii="Cambria Math" w:hAnsi="Cambria Math"/>
             <w:lang w:val="en-GB"/>
           </w:rPr>
-          <m:t>12</m:t>
-        </m:r>
-        <m:r>
-          <w:rPr>
-            <w:rFonts w:ascii="Cambria Math" w:hAnsi="Cambria Math"/>
-            <w:lang w:val="en-GB"/>
-          </w:rPr>
-          <m:t xml:space="preserve"> </m:t>
-        </m:r>
-        <m:r>
-          <w:rPr>
-            <w:rFonts w:ascii="Cambria Math" w:hAnsi="Cambria Math"/>
-            <w:lang w:val="en-GB"/>
-          </w:rPr>
-          <m:t>°C</m:t>
+          <m:t>12 °C</m:t>
         </m:r>
       </m:oMath>
       <w:r>
@@ -4915,21 +4415,7 @@
           <w:lang w:val="en-GB"/>
         </w:rPr>
         <w:lastRenderedPageBreak/>
-        <w:t xml:space="preserve">The thermal mass of the fish is assumed to be </w:t>
-      </w:r>
-      <w:proofErr w:type="gramStart"/>
-      <w:r>
-        <w:rPr>
-          <w:lang w:val="en-GB"/>
-        </w:rPr>
-        <w:t>similar to</w:t>
-      </w:r>
-      <w:proofErr w:type="gramEnd"/>
-      <w:r>
-        <w:rPr>
-          <w:lang w:val="en-GB"/>
-        </w:rPr>
-        <w:t xml:space="preserve"> that of water and is thus neglected.</w:t>
+        <w:t>The thermal mass of the fish is assumed to be similar to that of water and is thus neglected.</w:t>
       </w:r>
     </w:p>
     <w:p>
@@ -5083,14 +4569,7 @@
               <w:rFonts w:ascii="Cambria Math" w:hAnsi="Cambria Math"/>
               <w:lang w:val="en-GB"/>
             </w:rPr>
-            <m:t>=</m:t>
-          </m:r>
-          <m:r>
-            <w:rPr>
-              <w:rFonts w:ascii="Cambria Math" w:hAnsi="Cambria Math"/>
-              <w:lang w:val="en-GB"/>
-            </w:rPr>
-            <m:t xml:space="preserve">21 046.86 </m:t>
+            <m:t xml:space="preserve">=21 046.86 </m:t>
           </m:r>
           <m:sSup>
             <m:sSupPr>
@@ -5176,14 +4655,7 @@
                       <w:rFonts w:ascii="Cambria Math" w:hAnsi="Cambria Math"/>
                       <w:lang w:val="en-GB"/>
                     </w:rPr>
-                    <m:t>21046.86</m:t>
-                  </m:r>
-                  <m:r>
-                    <w:rPr>
-                      <w:rFonts w:ascii="Cambria Math" w:hAnsi="Cambria Math"/>
-                      <w:lang w:val="en-GB"/>
-                    </w:rPr>
-                    <m:t xml:space="preserve"> </m:t>
+                    <m:t xml:space="preserve">21046.86 </m:t>
                   </m:r>
                   <m:sSup>
                     <m:sSupPr>
@@ -5232,42 +4704,7 @@
               <w:rFonts w:ascii="Cambria Math" w:hAnsi="Cambria Math"/>
               <w:lang w:val="en-GB"/>
             </w:rPr>
-            <m:t>=6.41</m:t>
-          </m:r>
-          <m:r>
-            <w:rPr>
-              <w:rFonts w:ascii="Cambria Math" w:hAnsi="Cambria Math"/>
-              <w:lang w:val="en-GB"/>
-            </w:rPr>
-            <m:t xml:space="preserve"> m</m:t>
-          </m:r>
-          <m:r>
-            <w:rPr>
-              <w:rFonts w:ascii="Cambria Math" w:hAnsi="Cambria Math"/>
-              <w:lang w:val="en-GB"/>
-            </w:rPr>
-            <m:t>;W=25.63</m:t>
-          </m:r>
-          <m:r>
-            <w:rPr>
-              <w:rFonts w:ascii="Cambria Math" w:hAnsi="Cambria Math"/>
-              <w:lang w:val="en-GB"/>
-            </w:rPr>
-            <m:t xml:space="preserve"> m</m:t>
-          </m:r>
-          <m:r>
-            <w:rPr>
-              <w:rFonts w:ascii="Cambria Math" w:hAnsi="Cambria Math"/>
-              <w:lang w:val="en-GB"/>
-            </w:rPr>
-            <m:t>;L=128.15</m:t>
-          </m:r>
-          <m:r>
-            <w:rPr>
-              <w:rFonts w:ascii="Cambria Math" w:hAnsi="Cambria Math"/>
-              <w:lang w:val="en-GB"/>
-            </w:rPr>
-            <m:t xml:space="preserve"> m</m:t>
+            <m:t>=6.41 m;W=25.63 m;L=128.15 m</m:t>
           </m:r>
         </m:oMath>
       </m:oMathPara>
@@ -5291,21 +4728,7 @@
         <w:rPr>
           <w:lang w:val="en-GB"/>
         </w:rPr>
-        <w:t xml:space="preserve">The area is calculated from the length of the </w:t>
-      </w:r>
-      <w:proofErr w:type="gramStart"/>
-      <w:r>
-        <w:rPr>
-          <w:lang w:val="en-GB"/>
-        </w:rPr>
-        <w:t>sides</w:t>
-      </w:r>
-      <w:proofErr w:type="gramEnd"/>
-      <w:r>
-        <w:rPr>
-          <w:lang w:val="en-GB"/>
-        </w:rPr>
-        <w:t xml:space="preserve"> and the heat loss can be calculated using the area, the temperature difference and the assumed U-Values.</w:t>
+        <w:t>The area is calculated from the length of the sides and the heat loss can be calculated using the area, the temperature difference and the assumed U-Values.</w:t>
       </w:r>
       <w:r>
         <w:rPr>
@@ -5423,21 +4846,7 @@
         <w:rPr>
           <w:lang w:val="en-GB" w:eastAsia="en-US"/>
         </w:rPr>
-        <w:t xml:space="preserve">Although data on the design temperature in </w:t>
-      </w:r>
-      <w:proofErr w:type="spellStart"/>
-      <w:r>
-        <w:rPr>
-          <w:lang w:val="en-GB" w:eastAsia="en-US"/>
-        </w:rPr>
-        <w:t>Berlevag</w:t>
-      </w:r>
-      <w:proofErr w:type="spellEnd"/>
-      <w:r>
-        <w:rPr>
-          <w:lang w:val="en-GB" w:eastAsia="en-US"/>
-        </w:rPr>
-        <w:t xml:space="preserve"> could not be found, </w:t>
+        <w:t xml:space="preserve">Although data on the design temperature in Berlevag could not be found, </w:t>
       </w:r>
       <m:oMath>
         <m:r>
@@ -5521,28 +4930,7 @@
             <w:rFonts w:ascii="Cambria Math" w:hAnsi="Cambria Math"/>
             <w:lang w:val="en-GB"/>
           </w:rPr>
-          <m:t>0.</m:t>
-        </m:r>
-        <m:r>
-          <w:rPr>
-            <w:rFonts w:ascii="Cambria Math" w:hAnsi="Cambria Math"/>
-            <w:lang w:val="en-GB"/>
-          </w:rPr>
-          <m:t>133</m:t>
-        </m:r>
-        <m:r>
-          <w:rPr>
-            <w:rFonts w:ascii="Cambria Math" w:hAnsi="Cambria Math"/>
-            <w:lang w:val="en-GB"/>
-          </w:rPr>
-          <m:t>2</m:t>
-        </m:r>
-        <m:r>
-          <w:rPr>
-            <w:rFonts w:ascii="Cambria Math" w:hAnsi="Cambria Math"/>
-            <w:lang w:val="en-GB"/>
-          </w:rPr>
-          <m:t xml:space="preserve"> MW</m:t>
+          <m:t>0.1332 MW</m:t>
         </m:r>
       </m:oMath>
       <w:r>
@@ -5655,21 +5043,7 @@
         <w:rPr>
           <w:lang w:val="en-GB" w:eastAsia="en-US"/>
         </w:rPr>
-        <w:t xml:space="preserve"> vertical farm is designed to grow lettuce, as is the case in the </w:t>
-      </w:r>
-      <w:proofErr w:type="spellStart"/>
-      <w:r>
-        <w:rPr>
-          <w:lang w:val="en-GB" w:eastAsia="en-US"/>
-        </w:rPr>
-        <w:t>Berlevag</w:t>
-      </w:r>
-      <w:proofErr w:type="spellEnd"/>
-      <w:r>
-        <w:rPr>
-          <w:lang w:val="en-GB" w:eastAsia="en-US"/>
-        </w:rPr>
-        <w:t xml:space="preserve"> project </w:t>
+        <w:t xml:space="preserve"> vertical farm is designed to grow lettuce, as is the case in the Berlevag project </w:t>
       </w:r>
       <w:r>
         <w:rPr>
@@ -5852,21 +5226,7 @@
         <w:rPr>
           <w:lang w:val="en-GB" w:eastAsia="en-US"/>
         </w:rPr>
-        <w:t xml:space="preserve">For the climate zone of </w:t>
-      </w:r>
-      <w:proofErr w:type="gramStart"/>
-      <w:r>
-        <w:rPr>
-          <w:lang w:val="en-GB" w:eastAsia="en-US"/>
-        </w:rPr>
-        <w:t>Helsinki</w:t>
-      </w:r>
-      <w:proofErr w:type="gramEnd"/>
-      <w:r>
-        <w:rPr>
-          <w:lang w:val="en-GB" w:eastAsia="en-US"/>
-        </w:rPr>
-        <w:t xml:space="preserve"> the optimal </w:t>
+        <w:t xml:space="preserve">For the climate zone of Helsinki the optimal </w:t>
       </w:r>
       <w:r>
         <w:rPr>
@@ -6551,19 +5911,7 @@
         <w:rPr>
           <w:lang w:val="en-GB" w:eastAsia="en-US"/>
         </w:rPr>
-        <w:t xml:space="preserve">of a </w:t>
-      </w:r>
-      <w:r>
-        <w:rPr>
-          <w:lang w:val="en-GB" w:eastAsia="en-US"/>
-        </w:rPr>
-        <w:t>rectangular</w:t>
-      </w:r>
-      <w:r>
-        <w:rPr>
-          <w:lang w:val="en-GB" w:eastAsia="en-US"/>
-        </w:rPr>
-        <w:t xml:space="preserve"> prism </w:t>
+        <w:t xml:space="preserve">of a rectangular prism </w:t>
       </w:r>
       <w:r>
         <w:rPr>
@@ -6583,14 +5931,7 @@
             <w:rFonts w:ascii="Cambria Math" w:hAnsi="Cambria Math"/>
             <w:lang w:val="en-GB" w:eastAsia="en-US"/>
           </w:rPr>
-          <m:t>87.83</m:t>
-        </m:r>
-        <m:r>
-          <w:rPr>
-            <w:rFonts w:ascii="Cambria Math" w:hAnsi="Cambria Math"/>
-            <w:lang w:val="en-GB" w:eastAsia="en-US"/>
-          </w:rPr>
-          <m:t xml:space="preserve"> m</m:t>
+          <m:t>87.83 m</m:t>
         </m:r>
       </m:oMath>
       <w:r>
@@ -6627,83 +5968,55 @@
         <w:rPr>
           <w:lang w:val="en-GB" w:eastAsia="en-US"/>
         </w:rPr>
-        <w:t xml:space="preserve">, the </w:t>
-      </w:r>
-      <w:proofErr w:type="spellStart"/>
+        <w:t>, the Greenphyto Innovation Centre in Singapore,</w:t>
+      </w:r>
       <w:r>
         <w:rPr>
           <w:lang w:val="en-GB" w:eastAsia="en-US"/>
         </w:rPr>
-        <w:t>Greenphyto</w:t>
-      </w:r>
-      <w:proofErr w:type="spellEnd"/>
+        <w:t xml:space="preserve"> is 23.3m tall </w:t>
+      </w:r>
       <w:r>
         <w:rPr>
           <w:lang w:val="en-GB" w:eastAsia="en-US"/>
         </w:rPr>
-        <w:t xml:space="preserve"> Innovation Centre in Singapore,</w:t>
+        <w:fldChar w:fldCharType="begin"/>
       </w:r>
       <w:r>
         <w:rPr>
           <w:lang w:val="en-GB" w:eastAsia="en-US"/>
         </w:rPr>
-        <w:t xml:space="preserve"> is 23.3m tall </w:t>
+        <w:instrText xml:space="preserve"> ADDIN ZOTERO_ITEM CSL_CITATION {"citationID":"ZTp3ho2N","properties":{"formattedCitation":"[20]","plainCitation":"[20]","noteIndex":0},"citationItems":[{"id":390,"uris":["http://zotero.org/groups/6447497/items/HW3DZH35"],"itemData":{"id":390,"type":"webpage","abstract":"Greenphyto’s vision is to be the World’s premier Farms of the Future, enabling security of sustainable food supplies for nations, through innovative, automated and weather independent farming solutions.","container-title":"Greenphyto","language":"en-US","title":"Home","URL":"https://greenphyto.com/","accessed":{"date-parts":[["2026",3,25]]}}}],"schema":"https://github.com/citation-style-language/schema/raw/master/csl-citation.json"} </w:instrText>
       </w:r>
       <w:r>
         <w:rPr>
           <w:lang w:val="en-GB" w:eastAsia="en-US"/>
         </w:rPr>
-        <w:fldChar w:fldCharType="begin"/>
+        <w:fldChar w:fldCharType="separate"/>
       </w:r>
       <w:r>
         <w:rPr>
           <w:lang w:val="en-GB" w:eastAsia="en-US"/>
         </w:rPr>
-        <w:instrText xml:space="preserve"> ADDIN ZOTERO_ITEM CSL_CITATION {"citationID":"ZTp3ho2N","properties":{"formattedCitation":"[20]","plainCitation":"[20]","noteIndex":0},"citationItems":[{"id":390,"uris":["http://zotero.org/groups/6447497/items/HW3DZH35"],"itemData":{"id":390,"type":"webpage","abstract":"Greenphyto’s vision is to be the World’s premier Farms of the Future, enabling security of sustainable food supplies for nations, through innovative, automated and weather independent farming solutions.","container-title":"Greenphyto","language":"en-US","title":"Home","URL":"https://greenphyto.com/","accessed":{"date-parts":[["2026",3,25]]}}}],"schema":"https://github.com/citation-style-language/schema/raw/master/csl-citation.json"} </w:instrText>
+        <w:t>[20]</w:t>
       </w:r>
       <w:r>
         <w:rPr>
           <w:lang w:val="en-GB" w:eastAsia="en-US"/>
         </w:rPr>
-        <w:fldChar w:fldCharType="separate"/>
+        <w:fldChar w:fldCharType="end"/>
       </w:r>
       <w:r>
         <w:rPr>
           <w:lang w:val="en-GB" w:eastAsia="en-US"/>
         </w:rPr>
-        <w:t>[20]</w:t>
+        <w:t>. Google earth images show that the proportion of the length to width of th</w:t>
       </w:r>
       <w:r>
         <w:rPr>
           <w:lang w:val="en-GB" w:eastAsia="en-US"/>
         </w:rPr>
-        <w:fldChar w:fldCharType="end"/>
-      </w:r>
-      <w:r>
-        <w:rPr>
-          <w:lang w:val="en-GB" w:eastAsia="en-US"/>
-        </w:rPr>
-        <w:t>. Google earth images show that the proportion of the length to width of th</w:t>
-      </w:r>
-      <w:r>
-        <w:rPr>
-          <w:lang w:val="en-GB" w:eastAsia="en-US"/>
-        </w:rPr>
-        <w:t xml:space="preserve">e </w:t>
-      </w:r>
-      <w:proofErr w:type="spellStart"/>
-      <w:r>
-        <w:rPr>
-          <w:lang w:val="en-GB" w:eastAsia="en-US"/>
-        </w:rPr>
-        <w:t>Greenphyto</w:t>
-      </w:r>
-      <w:proofErr w:type="spellEnd"/>
-      <w:r>
-        <w:rPr>
-          <w:lang w:val="en-GB" w:eastAsia="en-US"/>
-        </w:rPr>
-        <w:t xml:space="preserve"> vertical farm are 5:1</w:t>
+        <w:t>e Greenphyto vertical farm are 5:1</w:t>
       </w:r>
       <w:r>
         <w:rPr>
@@ -6788,28 +6101,7 @@
               <w:lang w:val="en-GB"/>
             </w:rPr>
             <w:lastRenderedPageBreak/>
-            <m:t>H=</m:t>
-          </m:r>
-          <m:r>
-            <w:rPr>
-              <w:rFonts w:ascii="Cambria Math" w:hAnsi="Cambria Math"/>
-              <w:lang w:val="en-GB"/>
-            </w:rPr>
-            <m:t>20 m;5W</m:t>
-          </m:r>
-          <m:r>
-            <w:rPr>
-              <w:rFonts w:ascii="Cambria Math" w:hAnsi="Cambria Math"/>
-              <w:lang w:val="en-GB"/>
-            </w:rPr>
-            <m:t>=</m:t>
-          </m:r>
-          <m:r>
-            <w:rPr>
-              <w:rFonts w:ascii="Cambria Math" w:hAnsi="Cambria Math"/>
-              <w:lang w:val="en-GB"/>
-            </w:rPr>
-            <m:t>L</m:t>
+            <m:t>H=20 m;5W=L</m:t>
           </m:r>
         </m:oMath>
       </m:oMathPara>
@@ -6828,56 +6120,7 @@
               <w:rFonts w:ascii="Cambria Math" w:hAnsi="Cambria Math"/>
               <w:lang w:val="en-GB"/>
             </w:rPr>
-            <m:t>2H⋅</m:t>
-          </m:r>
-          <m:r>
-            <w:rPr>
-              <w:rFonts w:ascii="Cambria Math" w:hAnsi="Cambria Math"/>
-              <w:lang w:val="en-GB"/>
-            </w:rPr>
-            <m:t>W</m:t>
-          </m:r>
-          <m:r>
-            <w:rPr>
-              <w:rFonts w:ascii="Cambria Math" w:hAnsi="Cambria Math"/>
-              <w:lang w:val="en-GB"/>
-            </w:rPr>
-            <m:t>+2H⋅L+2W⋅</m:t>
-          </m:r>
-          <m:r>
-            <w:rPr>
-              <w:rFonts w:ascii="Cambria Math" w:hAnsi="Cambria Math"/>
-              <w:lang w:val="en-GB"/>
-            </w:rPr>
-            <m:t>L=</m:t>
-          </m:r>
-          <m:r>
-            <w:rPr>
-              <w:rFonts w:ascii="Cambria Math" w:hAnsi="Cambria Math"/>
-              <w:lang w:val="en-GB"/>
-            </w:rPr>
-            <m:t>2</m:t>
-          </m:r>
-          <m:r>
-            <w:rPr>
-              <w:rFonts w:ascii="Cambria Math" w:hAnsi="Cambria Math"/>
-              <w:lang w:val="en-GB"/>
-            </w:rPr>
-            <m:t>40</m:t>
-          </m:r>
-          <m:r>
-            <w:rPr>
-              <w:rFonts w:ascii="Cambria Math" w:hAnsi="Cambria Math"/>
-              <w:lang w:val="en-GB"/>
-            </w:rPr>
-            <m:t xml:space="preserve"> m⋅W+</m:t>
-          </m:r>
-          <m:r>
-            <w:rPr>
-              <w:rFonts w:ascii="Cambria Math" w:hAnsi="Cambria Math"/>
-              <w:lang w:val="en-GB"/>
-            </w:rPr>
-            <m:t>10⋅</m:t>
+            <m:t>2H⋅W+2H⋅L+2W⋅L=240 m⋅W+10⋅</m:t>
           </m:r>
           <m:sSup>
             <m:sSupPr>
@@ -6913,21 +6156,7 @@
               <w:rFonts w:ascii="Cambria Math" w:hAnsi="Cambria Math"/>
               <w:lang w:val="en-GB"/>
             </w:rPr>
-            <m:t>=</m:t>
-          </m:r>
-          <m:r>
-            <w:rPr>
-              <w:rFonts w:ascii="Cambria Math" w:hAnsi="Cambria Math"/>
-              <w:lang w:val="en-GB"/>
-            </w:rPr>
-            <m:t>46284.829</m:t>
-          </m:r>
-          <m:r>
-            <w:rPr>
-              <w:rFonts w:ascii="Cambria Math" w:hAnsi="Cambria Math"/>
-              <w:lang w:val="en-GB"/>
-            </w:rPr>
-            <m:t xml:space="preserve"> </m:t>
+            <m:t xml:space="preserve">=46284.829 </m:t>
           </m:r>
           <m:sSup>
             <m:sSupPr>
@@ -6975,21 +6204,7 @@
               <w:rFonts w:ascii="Cambria Math" w:hAnsi="Cambria Math"/>
               <w:lang w:val="en-GB"/>
             </w:rPr>
-            <m:t>W</m:t>
-          </m:r>
-          <m:r>
-            <w:rPr>
-              <w:rFonts w:ascii="Cambria Math" w:hAnsi="Cambria Math"/>
-              <w:lang w:val="en-GB"/>
-            </w:rPr>
-            <m:t>=</m:t>
-          </m:r>
-          <m:r>
-            <w:rPr>
-              <w:rFonts w:ascii="Cambria Math" w:hAnsi="Cambria Math"/>
-              <w:lang w:val="en-GB"/>
-            </w:rPr>
-            <m:t>-12 m+</m:t>
+            <m:t>W=-12 m+</m:t>
           </m:r>
           <m:rad>
             <m:radPr>
@@ -7096,91 +6311,7 @@
               <w:rFonts w:ascii="Cambria Math" w:hAnsi="Cambria Math"/>
               <w:lang w:val="en-GB"/>
             </w:rPr>
-            <m:t>=</m:t>
-          </m:r>
-          <m:r>
-            <w:rPr>
-              <w:rFonts w:ascii="Cambria Math" w:hAnsi="Cambria Math"/>
-              <w:lang w:val="en-GB"/>
-            </w:rPr>
-            <m:t>57</m:t>
-          </m:r>
-          <m:r>
-            <w:rPr>
-              <w:rFonts w:ascii="Cambria Math" w:hAnsi="Cambria Math"/>
-              <w:lang w:val="en-GB"/>
-            </w:rPr>
-            <m:t>.083</m:t>
-          </m:r>
-          <m:r>
-            <w:rPr>
-              <w:rFonts w:ascii="Cambria Math" w:hAnsi="Cambria Math"/>
-              <w:lang w:val="en-GB"/>
-            </w:rPr>
-            <m:t xml:space="preserve"> m</m:t>
-          </m:r>
-          <m:r>
-            <w:rPr>
-              <w:rFonts w:ascii="Cambria Math" w:hAnsi="Cambria Math"/>
-              <w:lang w:val="en-GB"/>
-            </w:rPr>
-            <m:t>;</m:t>
-          </m:r>
-          <m:r>
-            <w:rPr>
-              <w:rFonts w:ascii="Cambria Math" w:hAnsi="Cambria Math"/>
-              <w:lang w:val="en-GB"/>
-            </w:rPr>
-            <m:t>L</m:t>
-          </m:r>
-          <m:r>
-            <w:rPr>
-              <w:rFonts w:ascii="Cambria Math" w:hAnsi="Cambria Math"/>
-              <w:lang w:val="en-GB"/>
-            </w:rPr>
-            <m:t>=</m:t>
-          </m:r>
-          <m:r>
-            <w:rPr>
-              <w:rFonts w:ascii="Cambria Math" w:hAnsi="Cambria Math"/>
-              <w:lang w:val="en-GB"/>
-            </w:rPr>
-            <m:t>285.416</m:t>
-          </m:r>
-          <m:r>
-            <w:rPr>
-              <w:rFonts w:ascii="Cambria Math" w:hAnsi="Cambria Math"/>
-              <w:lang w:val="en-GB"/>
-            </w:rPr>
-            <m:t xml:space="preserve"> m</m:t>
-          </m:r>
-          <m:r>
-            <w:rPr>
-              <w:rFonts w:ascii="Cambria Math" w:hAnsi="Cambria Math"/>
-              <w:lang w:val="en-GB"/>
-            </w:rPr>
-            <m:t>;</m:t>
-          </m:r>
-          <m:r>
-            <w:rPr>
-              <w:rFonts w:ascii="Cambria Math" w:hAnsi="Cambria Math"/>
-              <w:lang w:val="en-GB"/>
-            </w:rPr>
-            <m:t>H</m:t>
-          </m:r>
-          <m:r>
-            <w:rPr>
-              <w:rFonts w:ascii="Cambria Math" w:hAnsi="Cambria Math"/>
-              <w:lang w:val="en-GB"/>
-            </w:rPr>
-            <m:t>=</m:t>
-          </m:r>
-          <m:r>
-            <w:rPr>
-              <w:rFonts w:ascii="Cambria Math" w:hAnsi="Cambria Math"/>
-              <w:lang w:val="en-GB"/>
-            </w:rPr>
-            <m:t>20 m</m:t>
+            <m:t>=57.083 m;L=285.416 m;H=20 m</m:t>
           </m:r>
         </m:oMath>
       </m:oMathPara>
@@ -7324,14 +6455,7 @@
             <w:rFonts w:ascii="Cambria Math" w:hAnsi="Cambria Math"/>
             <w:lang w:val="en-GB" w:eastAsia="en-US"/>
           </w:rPr>
-          <m:t>2</m:t>
-        </m:r>
-        <m:r>
-          <w:rPr>
-            <w:rFonts w:ascii="Cambria Math" w:hAnsi="Cambria Math"/>
-            <w:lang w:val="en-GB" w:eastAsia="en-US"/>
-          </w:rPr>
-          <m:t xml:space="preserve"> °C</m:t>
+          <m:t>2 °C</m:t>
         </m:r>
       </m:oMath>
       <w:r>
@@ -7639,10 +6763,7 @@
         <w:pStyle w:val="berschrift2"/>
       </w:pPr>
       <w:r>
-        <w:t xml:space="preserve">Control Strategy </w:t>
-      </w:r>
-      <w:r>
-        <w:t>Oxygen</w:t>
+        <w:t>Control Strategy Oxygen</w:t>
       </w:r>
     </w:p>
     <w:p>
@@ -7669,14 +6790,7 @@
             <w:rFonts w:ascii="Cambria Math" w:hAnsi="Cambria Math"/>
             <w:lang w:val="en-GB" w:eastAsia="en-US"/>
           </w:rPr>
-          <m:t>9</m:t>
-        </m:r>
-        <m:r>
-          <w:rPr>
-            <w:rFonts w:ascii="Cambria Math" w:hAnsi="Cambria Math"/>
-            <w:lang w:val="en-GB" w:eastAsia="en-US"/>
-          </w:rPr>
-          <m:t>.7</m:t>
+          <m:t>9.7</m:t>
         </m:r>
         <m:f>
           <m:fPr>
@@ -7720,21 +6834,7 @@
             <w:rFonts w:ascii="Cambria Math" w:hAnsi="Cambria Math"/>
             <w:lang w:val="en-GB" w:eastAsia="en-US"/>
           </w:rPr>
-          <m:t>17</m:t>
-        </m:r>
-        <m:r>
-          <w:rPr>
-            <w:rFonts w:ascii="Cambria Math" w:hAnsi="Cambria Math"/>
-            <w:lang w:val="en-GB" w:eastAsia="en-US"/>
-          </w:rPr>
-          <m:t xml:space="preserve"> </m:t>
-        </m:r>
-        <m:r>
-          <w:rPr>
-            <w:rFonts w:ascii="Cambria Math" w:hAnsi="Cambria Math"/>
-            <w:lang w:val="en-GB" w:eastAsia="en-US"/>
-          </w:rPr>
-          <m:t>°C</m:t>
+          <m:t>17 °C</m:t>
         </m:r>
       </m:oMath>
       <w:r>
@@ -7914,37 +7014,7 @@
         <w:rPr>
           <w:lang w:val="en-GB" w:eastAsia="en-US"/>
         </w:rPr>
-        <w:t xml:space="preserve"> being the</w:t>
-      </w:r>
-      <w:r>
-        <w:rPr>
-          <w:lang w:val="en-GB" w:eastAsia="en-US"/>
-        </w:rPr>
-        <w:t xml:space="preserve"> oxygen</w:t>
-      </w:r>
-      <w:r>
-        <w:rPr>
-          <w:lang w:val="en-GB" w:eastAsia="en-US"/>
-        </w:rPr>
-        <w:t xml:space="preserve"> </w:t>
-      </w:r>
-      <w:r>
-        <w:rPr>
-          <w:lang w:val="en-GB" w:eastAsia="en-US"/>
-        </w:rPr>
-        <w:t>concentration</w:t>
-      </w:r>
-      <w:r>
-        <w:rPr>
-          <w:lang w:val="en-GB" w:eastAsia="en-US"/>
-        </w:rPr>
-        <w:t xml:space="preserve"> calculated for the</w:t>
-      </w:r>
-      <w:r>
-        <w:rPr>
-          <w:lang w:val="en-GB" w:eastAsia="en-US"/>
-        </w:rPr>
-        <w:t xml:space="preserve"> fish tank. The constant, </w:t>
+        <w:t xml:space="preserve"> being the oxygen concentration calculated for the fish tank. The constant, </w:t>
       </w:r>
       <m:oMath>
         <m:sSub>
@@ -8208,33 +7278,7 @@
         <w:rPr>
           <w:lang w:val="en-GB" w:eastAsia="en-US"/>
         </w:rPr>
-        <w:t xml:space="preserve">storage tanks are defined as infinitely large, with no losses. </w:t>
-      </w:r>
-      <w:r>
-        <w:rPr>
-          <w:lang w:val="en-GB" w:eastAsia="en-US"/>
-        </w:rPr>
-        <w:t>The entire stretch from the electrolyzer to the fish tank/greenhouse can encompass a heat pump, a heat storage of any size or material and pipes.</w:t>
-      </w:r>
-      <w:r>
-        <w:rPr>
-          <w:lang w:val="en-GB" w:eastAsia="en-US"/>
-        </w:rPr>
-        <w:t xml:space="preserve"> There is no potential variable (temperature) determining flow to or from the storage tank. The assumption is that all the heat is stored at a sufficiently high temperature level for a gradient to exist between the heat storage and the greenhouse/fish tank, </w:t>
-      </w:r>
-      <w:proofErr w:type="gramStart"/>
-      <w:r>
-        <w:rPr>
-          <w:lang w:val="en-GB" w:eastAsia="en-US"/>
-        </w:rPr>
-        <w:t>at all times</w:t>
-      </w:r>
-      <w:proofErr w:type="gramEnd"/>
-      <w:r>
-        <w:rPr>
-          <w:lang w:val="en-GB" w:eastAsia="en-US"/>
-        </w:rPr>
-        <w:t xml:space="preserve">. Heat transfer from and to the storage is assumed to be ideal (the tank can run empty). There is currently no measure to prevent negative values in the </w:t>
+        <w:t xml:space="preserve">storage tanks are defined as infinitely large, with no losses. The entire stretch from the electrolyzer to the fish tank/greenhouse can encompass a heat pump, a heat storage of any size or material and pipes. There is no potential variable (temperature) determining flow to or from the storage tank. The assumption is that all the heat is stored at a sufficiently high temperature level for a gradient to exist between the heat storage and the greenhouse/fish tank, at all times. Heat transfer from and to the storage is assumed to be ideal (the tank can run empty). There is currently no measure to prevent negative values in the </w:t>
       </w:r>
       <w:r>
         <w:rPr>
@@ -8305,7 +7349,6 @@
                 <w:bCs/>
               </w:rPr>
             </w:pPr>
-            <w:proofErr w:type="spellStart"/>
             <w:r>
               <w:rPr>
                 <w:b/>
@@ -8320,7 +7363,6 @@
               </w:rPr>
               <w:t>s</w:t>
             </w:r>
-            <w:proofErr w:type="spellEnd"/>
           </w:p>
         </w:tc>
         <w:tc>
@@ -8344,17 +7386,8 @@
                 <w:b/>
                 <w:bCs/>
               </w:rPr>
-              <w:t>Value/</w:t>
+              <w:t>Value/Unit</w:t>
             </w:r>
-            <w:proofErr w:type="spellStart"/>
-            <w:r>
-              <w:rPr>
-                <w:b/>
-                <w:bCs/>
-              </w:rPr>
-              <w:t>Unit</w:t>
-            </w:r>
-            <w:proofErr w:type="spellEnd"/>
           </w:p>
         </w:tc>
         <w:tc>
@@ -8373,7 +7406,6 @@
                 <w:bCs/>
               </w:rPr>
             </w:pPr>
-            <w:proofErr w:type="spellStart"/>
             <w:r>
               <w:rPr>
                 <w:b/>
@@ -8381,7 +7413,6 @@
               </w:rPr>
               <w:t>Description</w:t>
             </w:r>
-            <w:proofErr w:type="spellEnd"/>
           </w:p>
         </w:tc>
       </w:tr>
@@ -8401,11 +7432,9 @@
               <w:ind w:right="-1"/>
               <w:jc w:val="center"/>
             </w:pPr>
-            <w:proofErr w:type="spellStart"/>
             <w:r>
               <w:t>P_Electrolyzer</w:t>
             </w:r>
-            <w:proofErr w:type="spellEnd"/>
           </w:p>
         </w:tc>
         <w:tc>
@@ -8419,11 +7448,9 @@
               <w:ind w:right="-1"/>
               <w:jc w:val="center"/>
             </w:pPr>
-            <w:proofErr w:type="spellStart"/>
             <w:r>
               <w:t>variable</w:t>
             </w:r>
-            <w:proofErr w:type="spellEnd"/>
           </w:p>
         </w:tc>
         <w:tc>
@@ -8522,11 +7549,9 @@
               <w:ind w:right="-1"/>
               <w:jc w:val="center"/>
             </w:pPr>
-            <w:proofErr w:type="spellStart"/>
             <w:r>
               <w:t>Eff_Electrolyzer</w:t>
             </w:r>
-            <w:proofErr w:type="spellEnd"/>
           </w:p>
         </w:tc>
         <w:tc>
@@ -8606,11 +7631,9 @@
               <w:ind w:right="-1"/>
               <w:jc w:val="center"/>
             </w:pPr>
-            <w:proofErr w:type="spellStart"/>
             <w:r>
               <w:t>Delta_h</w:t>
             </w:r>
-            <w:proofErr w:type="spellEnd"/>
           </w:p>
         </w:tc>
         <w:tc>
@@ -8814,11 +7837,9 @@
               <w:ind w:right="-1"/>
               <w:jc w:val="center"/>
             </w:pPr>
-            <w:proofErr w:type="spellStart"/>
             <w:r>
               <w:t>V_tank</w:t>
             </w:r>
-            <w:proofErr w:type="spellEnd"/>
           </w:p>
         </w:tc>
         <w:tc>
@@ -8888,21 +7909,7 @@
               <w:rPr>
                 <w:lang w:val="en-GB"/>
               </w:rPr>
-              <w:t xml:space="preserve">Calculated from Oxygen production, oxygen consumption of fish and space required for resulting </w:t>
-            </w:r>
-            <w:proofErr w:type="gramStart"/>
-            <w:r>
-              <w:rPr>
-                <w:lang w:val="en-GB"/>
-              </w:rPr>
-              <w:t>amount</w:t>
-            </w:r>
-            <w:proofErr w:type="gramEnd"/>
-            <w:r>
-              <w:rPr>
-                <w:lang w:val="en-GB"/>
-              </w:rPr>
-              <w:t xml:space="preserve"> of fish.</w:t>
+              <w:t>Calculated from Oxygen production, oxygen consumption of fish and space required for resulting amount of fish.</w:t>
             </w:r>
           </w:p>
         </w:tc>
@@ -8923,11 +7930,9 @@
               <w:ind w:right="-1"/>
               <w:jc w:val="center"/>
             </w:pPr>
-            <w:proofErr w:type="spellStart"/>
             <w:r>
               <w:t>V_greenhouse</w:t>
             </w:r>
-            <w:proofErr w:type="spellEnd"/>
           </w:p>
         </w:tc>
         <w:tc>
@@ -8995,21 +8000,8 @@
               <w:jc w:val="center"/>
             </w:pPr>
             <w:r>
-              <w:t xml:space="preserve">Volume of </w:t>
+              <w:t>Volume of the greenhouse</w:t>
             </w:r>
-            <w:proofErr w:type="spellStart"/>
-            <w:r>
-              <w:t>the</w:t>
-            </w:r>
-            <w:proofErr w:type="spellEnd"/>
-            <w:r>
-              <w:t xml:space="preserve"> </w:t>
-            </w:r>
-            <w:proofErr w:type="spellStart"/>
-            <w:r>
-              <w:t>greenhouse</w:t>
-            </w:r>
-            <w:proofErr w:type="spellEnd"/>
           </w:p>
         </w:tc>
       </w:tr>
@@ -9029,11 +8021,9 @@
               <w:ind w:right="-1"/>
               <w:jc w:val="center"/>
             </w:pPr>
-            <w:proofErr w:type="spellStart"/>
             <w:r>
               <w:t>cp_water</w:t>
             </w:r>
-            <w:proofErr w:type="spellEnd"/>
           </w:p>
         </w:tc>
         <w:tc>
@@ -9124,11 +8114,9 @@
               <w:ind w:right="-1"/>
               <w:jc w:val="center"/>
             </w:pPr>
-            <w:proofErr w:type="spellStart"/>
             <w:r>
               <w:t>cp_air</w:t>
             </w:r>
-            <w:proofErr w:type="spellEnd"/>
           </w:p>
         </w:tc>
         <w:tc>
@@ -9316,11 +8304,9 @@
               <w:ind w:right="-1"/>
               <w:jc w:val="center"/>
             </w:pPr>
-            <w:proofErr w:type="spellStart"/>
             <w:r>
               <w:t>rho_air</w:t>
             </w:r>
-            <w:proofErr w:type="spellEnd"/>
           </w:p>
         </w:tc>
         <w:tc>
@@ -10006,11 +8992,9 @@
               <w:ind w:right="-1"/>
               <w:jc w:val="center"/>
             </w:pPr>
-            <w:proofErr w:type="spellStart"/>
             <w:r>
               <w:t>T_greenhouse</w:t>
             </w:r>
-            <w:proofErr w:type="spellEnd"/>
           </w:p>
         </w:tc>
         <w:tc>
@@ -10102,7 +9086,6 @@
                 <w:bCs/>
               </w:rPr>
             </w:pPr>
-            <w:proofErr w:type="spellStart"/>
             <w:r>
               <w:rPr>
                 <w:b/>
@@ -10110,7 +9093,6 @@
               </w:rPr>
               <w:t>Flow</w:t>
             </w:r>
-            <w:proofErr w:type="spellEnd"/>
           </w:p>
         </w:tc>
         <w:tc>
@@ -10429,11 +9411,9 @@
               <w:ind w:right="-1"/>
               <w:jc w:val="center"/>
             </w:pPr>
-            <w:proofErr w:type="spellStart"/>
             <w:r>
               <w:t>Q_diss_greenhouse</w:t>
             </w:r>
-            <w:proofErr w:type="spellEnd"/>
           </w:p>
         </w:tc>
         <w:tc>
@@ -10518,11 +9498,9 @@
               <w:ind w:right="-1"/>
               <w:jc w:val="center"/>
             </w:pPr>
-            <w:proofErr w:type="spellStart"/>
             <w:r>
               <w:t>Q_diss_tank</w:t>
             </w:r>
-            <w:proofErr w:type="spellEnd"/>
           </w:p>
         </w:tc>
         <w:tc>
@@ -10607,11 +9585,9 @@
               <w:ind w:right="-1"/>
               <w:jc w:val="center"/>
             </w:pPr>
-            <w:proofErr w:type="spellStart"/>
             <w:r>
               <w:t>Q_greenhouse_in</w:t>
             </w:r>
-            <w:proofErr w:type="spellEnd"/>
           </w:p>
         </w:tc>
         <w:tc>
@@ -10699,11 +9675,9 @@
               <w:ind w:right="-1"/>
               <w:jc w:val="center"/>
             </w:pPr>
-            <w:proofErr w:type="spellStart"/>
             <w:r>
               <w:t>Q_tank_in</w:t>
             </w:r>
-            <w:proofErr w:type="spellEnd"/>
           </w:p>
         </w:tc>
         <w:tc>
@@ -10791,11 +9765,9 @@
               <w:ind w:right="-1"/>
               <w:jc w:val="center"/>
             </w:pPr>
-            <w:proofErr w:type="spellStart"/>
             <w:r>
               <w:t>Q_prod</w:t>
             </w:r>
-            <w:proofErr w:type="spellEnd"/>
           </w:p>
         </w:tc>
         <w:tc>
@@ -10942,21 +9914,7 @@
         <w:rPr>
           <w:lang w:val="en-GB"/>
         </w:rPr>
-        <w:t xml:space="preserve">This obviously needs to be </w:t>
-      </w:r>
-      <w:proofErr w:type="gramStart"/>
-      <w:r>
-        <w:rPr>
-          <w:lang w:val="en-GB"/>
-        </w:rPr>
-        <w:t>digitalized,</w:t>
-      </w:r>
-      <w:proofErr w:type="gramEnd"/>
-      <w:r>
-        <w:rPr>
-          <w:lang w:val="en-GB"/>
-        </w:rPr>
-        <w:t xml:space="preserve"> it</w:t>
+        <w:t>This obviously needs to be digitalized, it</w:t>
       </w:r>
       <w:r>
         <w:rPr>
@@ -11016,21 +9974,7 @@
         <w:rPr>
           <w:lang w:val="en-GB"/>
         </w:rPr>
-        <w:t xml:space="preserve">Each equation is represented in a part of the model. The variable names are not the same as in the model, to make the equations more easily recognizable </w:t>
-      </w:r>
-      <w:proofErr w:type="gramStart"/>
-      <w:r>
-        <w:rPr>
-          <w:lang w:val="en-GB"/>
-        </w:rPr>
-        <w:t>at a glance</w:t>
-      </w:r>
-      <w:proofErr w:type="gramEnd"/>
-      <w:r>
-        <w:rPr>
-          <w:lang w:val="en-GB"/>
-        </w:rPr>
-        <w:t xml:space="preserve">. The equation is described </w:t>
+        <w:t xml:space="preserve">Each equation is represented in a part of the model. The variable names are not the same as in the model, to make the equations more easily recognizable at a glance. The equation is described </w:t>
       </w:r>
       <w:r>
         <w:rPr>
@@ -11064,12 +10008,10 @@
         <w:ind w:right="-1"/>
       </w:pPr>
       <w:bookmarkStart w:id="15" w:name="_Toc225009480"/>
-      <w:proofErr w:type="spellStart"/>
       <w:r>
         <w:t>Variables</w:t>
       </w:r>
       <w:bookmarkEnd w:id="15"/>
-      <w:proofErr w:type="spellEnd"/>
     </w:p>
     <w:p>
       <w:pPr>
@@ -12202,9 +11144,15 @@
           <w:numId w:val="0"/>
         </w:numPr>
         <w:ind w:right="-1"/>
+        <w:rPr>
+          <w:lang w:val="en-GB"/>
+        </w:rPr>
       </w:pPr>
       <w:bookmarkStart w:id="16" w:name="_Toc225009481"/>
       <w:r>
+        <w:rPr>
+          <w:lang w:val="en-GB"/>
+        </w:rPr>
         <w:lastRenderedPageBreak/>
         <w:t>Hydrogen Production Rate</w:t>
       </w:r>
@@ -12471,9 +11419,15 @@
           <w:numId w:val="0"/>
         </w:numPr>
         <w:ind w:right="-1"/>
+        <w:rPr>
+          <w:lang w:val="en-GB"/>
+        </w:rPr>
       </w:pPr>
       <w:bookmarkStart w:id="17" w:name="_Toc225009482"/>
       <w:r>
+        <w:rPr>
+          <w:lang w:val="en-GB"/>
+        </w:rPr>
         <w:t>Oxygen Production Rate</w:t>
       </w:r>
       <w:bookmarkEnd w:id="17"/>
@@ -12752,12 +11706,14 @@
         <w:ind w:right="-1"/>
         <w:rPr>
           <w:rFonts w:eastAsiaTheme="minorEastAsia"/>
+          <w:lang w:val="en-GB"/>
         </w:rPr>
       </w:pPr>
       <w:bookmarkStart w:id="18" w:name="_Toc225009483"/>
       <w:r>
         <w:rPr>
           <w:rFonts w:eastAsiaTheme="minorEastAsia"/>
+          <w:lang w:val="en-GB"/>
         </w:rPr>
         <w:t>Fish Tank Oxygen Concentration</w:t>
       </w:r>
@@ -13040,13 +11996,16 @@
           <w:numId w:val="0"/>
         </w:numPr>
         <w:ind w:right="-1"/>
+        <w:rPr>
+          <w:lang w:val="en-GB"/>
+        </w:rPr>
       </w:pPr>
       <w:bookmarkStart w:id="19" w:name="_Toc225009484"/>
       <w:r>
-        <w:t>Heat</w:t>
-      </w:r>
-      <w:r>
-        <w:t xml:space="preserve"> Production Rate</w:t>
+        <w:rPr>
+          <w:lang w:val="en-GB"/>
+        </w:rPr>
+        <w:t>Heat Production Rate</w:t>
       </w:r>
       <w:bookmarkEnd w:id="19"/>
     </w:p>
@@ -13182,9 +12141,15 @@
           <w:numId w:val="0"/>
         </w:numPr>
         <w:ind w:right="-1"/>
+        <w:rPr>
+          <w:lang w:val="en-GB"/>
+        </w:rPr>
       </w:pPr>
       <w:bookmarkStart w:id="20" w:name="_Toc225009485"/>
       <w:r>
+        <w:rPr>
+          <w:lang w:val="en-GB"/>
+        </w:rPr>
         <w:t>Greenhouse Temperature</w:t>
       </w:r>
       <w:bookmarkEnd w:id="20"/>
@@ -13449,13 +12414,16 @@
           <w:numId w:val="0"/>
         </w:numPr>
         <w:ind w:right="-1"/>
+        <w:rPr>
+          <w:lang w:val="en-GB"/>
+        </w:rPr>
       </w:pPr>
       <w:bookmarkStart w:id="21" w:name="_Toc225009486"/>
       <w:r>
-        <w:t>Fish Tank</w:t>
-      </w:r>
-      <w:r>
-        <w:t xml:space="preserve"> Temperature</w:t>
+        <w:rPr>
+          <w:lang w:val="en-GB"/>
+        </w:rPr>
+        <w:t>Fish Tank Temperature</w:t>
       </w:r>
       <w:bookmarkEnd w:id="21"/>
     </w:p>
@@ -13801,28 +12769,56 @@
         <w:rPr>
           <w:rFonts w:ascii="Times New Roman" w:hAnsi="Times New Roman" w:cs="Times New Roman"/>
         </w:rPr>
-        <w:t>[1</w:t>
-      </w:r>
-      <w:proofErr w:type="gramStart"/>
+        <w:t>[1]</w:t>
+      </w:r>
       <w:r>
         <w:rPr>
           <w:rFonts w:ascii="Times New Roman" w:hAnsi="Times New Roman" w:cs="Times New Roman"/>
         </w:rPr>
-        <w:t>]</w:t>
-      </w:r>
-      <w:r>
+        <w:tab/>
+        <w:t>‘PowerPoint Presentation’. Accessed: Mar. 06, 2026. [Online]. Available: https://www.hydrogen.no/files/documents/medlemsmoter/h2carrier.pdf</w:t>
+      </w:r>
+    </w:p>
+    <w:p>
+      <w:pPr>
+        <w:pStyle w:val="Literaturverzeichnis"/>
         <w:rPr>
           <w:rFonts w:ascii="Times New Roman" w:hAnsi="Times New Roman" w:cs="Times New Roman"/>
         </w:rPr>
+      </w:pPr>
+      <w:r>
+        <w:rPr>
+          <w:rFonts w:ascii="Times New Roman" w:hAnsi="Times New Roman" w:cs="Times New Roman"/>
+        </w:rPr>
+        <w:t>[2]</w:t>
+      </w:r>
+      <w:r>
+        <w:rPr>
+          <w:rFonts w:ascii="Times New Roman" w:hAnsi="Times New Roman" w:cs="Times New Roman"/>
+        </w:rPr>
         <w:tab/>
-        <w:t>‘</w:t>
-      </w:r>
-      <w:proofErr w:type="gramEnd"/>
-      <w:r>
+        <w:t>‘Download datasets’. Accessed: Mar. 09, 2026. [Online]. Available: https://data.fingrid.fi/en/data?datasets=181</w:t>
+      </w:r>
+    </w:p>
+    <w:p>
+      <w:pPr>
+        <w:pStyle w:val="Literaturverzeichnis"/>
         <w:rPr>
           <w:rFonts w:ascii="Times New Roman" w:hAnsi="Times New Roman" w:cs="Times New Roman"/>
         </w:rPr>
-        <w:t>PowerPoint Presentation’. Accessed: Mar. 06, 2026. [Online]. Available: https://www.hydrogen.no/files/documents/medlemsmoter/h2carrier.pdf</w:t>
+      </w:pPr>
+      <w:r>
+        <w:rPr>
+          <w:rFonts w:ascii="Times New Roman" w:hAnsi="Times New Roman" w:cs="Times New Roman"/>
+        </w:rPr>
+        <w:t>[3]</w:t>
+      </w:r>
+      <w:r>
+        <w:rPr>
+          <w:rFonts w:ascii="Times New Roman" w:hAnsi="Times New Roman" w:cs="Times New Roman"/>
+        </w:rPr>
+        <w:tab/>
+        <w:t>‘NIB lends to Varanger Kraft´s hydrogen and power grid projects’, Nordic Investment Bank. Accessed: Mar. 08, 2026. [Online]. Available: https://www.nib.int/news/nib-lends-to-varanger-krafts-hydrogen-and-power-grid-projects/</w:t>
       </w:r>
     </w:p>
     <w:p>
@@ -13836,224 +12832,56 @@
         <w:rPr>
           <w:rFonts w:ascii="Times New Roman" w:hAnsi="Times New Roman" w:cs="Times New Roman"/>
         </w:rPr>
-        <w:t>[2</w:t>
-      </w:r>
-      <w:proofErr w:type="gramStart"/>
+        <w:t>[4]</w:t>
+      </w:r>
       <w:r>
         <w:rPr>
           <w:rFonts w:ascii="Times New Roman" w:hAnsi="Times New Roman" w:cs="Times New Roman"/>
         </w:rPr>
-        <w:t>]</w:t>
-      </w:r>
-      <w:r>
+        <w:tab/>
+        <w:t>‘Hydrogen-Aeolic Energy with Optimised eLectrolysers Upstream of Substation | H2020’, CORDIS | European Commission. Accessed: Mar. 08, 2026. [Online]. Available: https://cordis.europa.eu/project/id/779469/reporting</w:t>
+      </w:r>
+    </w:p>
+    <w:p>
+      <w:pPr>
+        <w:pStyle w:val="Literaturverzeichnis"/>
         <w:rPr>
           <w:rFonts w:ascii="Times New Roman" w:hAnsi="Times New Roman" w:cs="Times New Roman"/>
         </w:rPr>
+      </w:pPr>
+      <w:r>
+        <w:rPr>
+          <w:rFonts w:ascii="Times New Roman" w:hAnsi="Times New Roman" w:cs="Times New Roman"/>
+        </w:rPr>
+        <w:t>[5]</w:t>
+      </w:r>
+      <w:r>
+        <w:rPr>
+          <w:rFonts w:ascii="Times New Roman" w:hAnsi="Times New Roman" w:cs="Times New Roman"/>
+        </w:rPr>
         <w:tab/>
-        <w:t>‘</w:t>
-      </w:r>
-      <w:proofErr w:type="gramEnd"/>
-      <w:r>
+        <w:t>‘Dissolved oxygen requirements in aquatic animal respiration - Responsible Seafood Advocate’, Global Seafood Alliance. Accessed: Mar. 06, 2026. [Online]. Available: https://www.globalseafood.org/advocate/dissolved-oxygen-requirements-in-aquatic-animal-respiration/</w:t>
+      </w:r>
+    </w:p>
+    <w:p>
+      <w:pPr>
+        <w:pStyle w:val="Literaturverzeichnis"/>
         <w:rPr>
           <w:rFonts w:ascii="Times New Roman" w:hAnsi="Times New Roman" w:cs="Times New Roman"/>
         </w:rPr>
-        <w:t xml:space="preserve">Download </w:t>
-      </w:r>
-      <w:proofErr w:type="gramStart"/>
+      </w:pPr>
       <w:r>
         <w:rPr>
           <w:rFonts w:ascii="Times New Roman" w:hAnsi="Times New Roman" w:cs="Times New Roman"/>
         </w:rPr>
-        <w:t>datasets’</w:t>
-      </w:r>
-      <w:proofErr w:type="gramEnd"/>
+        <w:t>[6]</w:t>
+      </w:r>
       <w:r>
         <w:rPr>
           <w:rFonts w:ascii="Times New Roman" w:hAnsi="Times New Roman" w:cs="Times New Roman"/>
         </w:rPr>
-        <w:t>. Accessed: Mar. 09, 2026. [Online]. Available: https://data.fingrid.fi/en/data?datasets=181</w:t>
-      </w:r>
-    </w:p>
-    <w:p>
-      <w:pPr>
-        <w:pStyle w:val="Literaturverzeichnis"/>
-        <w:rPr>
-          <w:rFonts w:ascii="Times New Roman" w:hAnsi="Times New Roman" w:cs="Times New Roman"/>
-        </w:rPr>
-      </w:pPr>
-      <w:r>
-        <w:rPr>
-          <w:rFonts w:ascii="Times New Roman" w:hAnsi="Times New Roman" w:cs="Times New Roman"/>
-        </w:rPr>
-        <w:t>[3</w:t>
-      </w:r>
-      <w:proofErr w:type="gramStart"/>
-      <w:r>
-        <w:rPr>
-          <w:rFonts w:ascii="Times New Roman" w:hAnsi="Times New Roman" w:cs="Times New Roman"/>
-        </w:rPr>
-        <w:t>]</w:t>
-      </w:r>
-      <w:r>
-        <w:rPr>
-          <w:rFonts w:ascii="Times New Roman" w:hAnsi="Times New Roman" w:cs="Times New Roman"/>
-        </w:rPr>
         <w:tab/>
-        <w:t>‘</w:t>
-      </w:r>
-      <w:proofErr w:type="gramEnd"/>
-      <w:r>
-        <w:rPr>
-          <w:rFonts w:ascii="Times New Roman" w:hAnsi="Times New Roman" w:cs="Times New Roman"/>
-        </w:rPr>
-        <w:t xml:space="preserve">NIB lends to </w:t>
-      </w:r>
-      <w:proofErr w:type="spellStart"/>
-      <w:r>
-        <w:rPr>
-          <w:rFonts w:ascii="Times New Roman" w:hAnsi="Times New Roman" w:cs="Times New Roman"/>
-        </w:rPr>
-        <w:t>Varanger</w:t>
-      </w:r>
-      <w:proofErr w:type="spellEnd"/>
-      <w:r>
-        <w:rPr>
-          <w:rFonts w:ascii="Times New Roman" w:hAnsi="Times New Roman" w:cs="Times New Roman"/>
-        </w:rPr>
-        <w:t xml:space="preserve"> Kraft´s hydrogen and power grid projects’, Nordic Investment Bank. Accessed: Mar. 08, 2026. [Online]. Available: https://www.nib.int/news/nib-lends-to-varanger-krafts-hydrogen-and-power-grid-projects/</w:t>
-      </w:r>
-    </w:p>
-    <w:p>
-      <w:pPr>
-        <w:pStyle w:val="Literaturverzeichnis"/>
-        <w:rPr>
-          <w:rFonts w:ascii="Times New Roman" w:hAnsi="Times New Roman" w:cs="Times New Roman"/>
-        </w:rPr>
-      </w:pPr>
-      <w:r>
-        <w:rPr>
-          <w:rFonts w:ascii="Times New Roman" w:hAnsi="Times New Roman" w:cs="Times New Roman"/>
-        </w:rPr>
-        <w:t>[4</w:t>
-      </w:r>
-      <w:proofErr w:type="gramStart"/>
-      <w:r>
-        <w:rPr>
-          <w:rFonts w:ascii="Times New Roman" w:hAnsi="Times New Roman" w:cs="Times New Roman"/>
-        </w:rPr>
-        <w:t>]</w:t>
-      </w:r>
-      <w:r>
-        <w:rPr>
-          <w:rFonts w:ascii="Times New Roman" w:hAnsi="Times New Roman" w:cs="Times New Roman"/>
-        </w:rPr>
-        <w:tab/>
-        <w:t>‘</w:t>
-      </w:r>
-      <w:proofErr w:type="gramEnd"/>
-      <w:r>
-        <w:rPr>
-          <w:rFonts w:ascii="Times New Roman" w:hAnsi="Times New Roman" w:cs="Times New Roman"/>
-        </w:rPr>
-        <w:t xml:space="preserve">Hydrogen-Aeolic Energy with </w:t>
-      </w:r>
-      <w:proofErr w:type="spellStart"/>
-      <w:r>
-        <w:rPr>
-          <w:rFonts w:ascii="Times New Roman" w:hAnsi="Times New Roman" w:cs="Times New Roman"/>
-        </w:rPr>
-        <w:t>Optimised</w:t>
-      </w:r>
-      <w:proofErr w:type="spellEnd"/>
-      <w:r>
-        <w:rPr>
-          <w:rFonts w:ascii="Times New Roman" w:hAnsi="Times New Roman" w:cs="Times New Roman"/>
-        </w:rPr>
-        <w:t xml:space="preserve"> </w:t>
-      </w:r>
-      <w:proofErr w:type="spellStart"/>
-      <w:r>
-        <w:rPr>
-          <w:rFonts w:ascii="Times New Roman" w:hAnsi="Times New Roman" w:cs="Times New Roman"/>
-        </w:rPr>
-        <w:t>eLectrolysers</w:t>
-      </w:r>
-      <w:proofErr w:type="spellEnd"/>
-      <w:r>
-        <w:rPr>
-          <w:rFonts w:ascii="Times New Roman" w:hAnsi="Times New Roman" w:cs="Times New Roman"/>
-        </w:rPr>
-        <w:t xml:space="preserve"> Upstream of Substation | H2020’, CORDIS | European Commission. Accessed: Mar. 08, 2026. [Online]. Available: https://cordis.europa.eu/project/id/779469/reporting</w:t>
-      </w:r>
-    </w:p>
-    <w:p>
-      <w:pPr>
-        <w:pStyle w:val="Literaturverzeichnis"/>
-        <w:rPr>
-          <w:rFonts w:ascii="Times New Roman" w:hAnsi="Times New Roman" w:cs="Times New Roman"/>
-        </w:rPr>
-      </w:pPr>
-      <w:r>
-        <w:rPr>
-          <w:rFonts w:ascii="Times New Roman" w:hAnsi="Times New Roman" w:cs="Times New Roman"/>
-        </w:rPr>
-        <w:t>[5</w:t>
-      </w:r>
-      <w:proofErr w:type="gramStart"/>
-      <w:r>
-        <w:rPr>
-          <w:rFonts w:ascii="Times New Roman" w:hAnsi="Times New Roman" w:cs="Times New Roman"/>
-        </w:rPr>
-        <w:t>]</w:t>
-      </w:r>
-      <w:r>
-        <w:rPr>
-          <w:rFonts w:ascii="Times New Roman" w:hAnsi="Times New Roman" w:cs="Times New Roman"/>
-        </w:rPr>
-        <w:tab/>
-        <w:t>‘</w:t>
-      </w:r>
-      <w:proofErr w:type="gramEnd"/>
-      <w:r>
-        <w:rPr>
-          <w:rFonts w:ascii="Times New Roman" w:hAnsi="Times New Roman" w:cs="Times New Roman"/>
-        </w:rPr>
-        <w:t>Dissolved oxygen requirements in aquatic animal respiration - Responsible Seafood Advocate’, Global Seafood Alliance. Accessed: Mar. 06, 2026. [Online]. Available: https://www.globalseafood.org/advocate/dissolved-oxygen-requirements-in-aquatic-animal-respiration/</w:t>
-      </w:r>
-    </w:p>
-    <w:p>
-      <w:pPr>
-        <w:pStyle w:val="Literaturverzeichnis"/>
-        <w:rPr>
-          <w:rFonts w:ascii="Times New Roman" w:hAnsi="Times New Roman" w:cs="Times New Roman"/>
-        </w:rPr>
-      </w:pPr>
-      <w:r>
-        <w:rPr>
-          <w:rFonts w:ascii="Times New Roman" w:hAnsi="Times New Roman" w:cs="Times New Roman"/>
-        </w:rPr>
-        <w:t>[6</w:t>
-      </w:r>
-      <w:proofErr w:type="gramStart"/>
-      <w:r>
-        <w:rPr>
-          <w:rFonts w:ascii="Times New Roman" w:hAnsi="Times New Roman" w:cs="Times New Roman"/>
-        </w:rPr>
-        <w:t>]</w:t>
-      </w:r>
-      <w:r>
-        <w:rPr>
-          <w:rFonts w:ascii="Times New Roman" w:hAnsi="Times New Roman" w:cs="Times New Roman"/>
-        </w:rPr>
-        <w:tab/>
-        <w:t>‘</w:t>
-      </w:r>
-      <w:proofErr w:type="gramEnd"/>
-      <w:r>
-        <w:rPr>
-          <w:rFonts w:ascii="Times New Roman" w:hAnsi="Times New Roman" w:cs="Times New Roman"/>
-        </w:rPr>
-        <w:t>Fish density on our farms’. Accessed: Mar. 07, 2026. [Online]. Available: https://griegseafood.com/our-impact-fish-density-on-our-farms</w:t>
+        <w:t>‘Fish density on our farms’. Accessed: Mar. 07, 2026. [Online]. Available: https://griegseafood.com/our-impact-fish-density-on-our-farms</w:t>
       </w:r>
     </w:p>
     <w:p>
@@ -14088,42 +12916,56 @@
         <w:rPr>
           <w:rFonts w:ascii="Times New Roman" w:hAnsi="Times New Roman" w:cs="Times New Roman"/>
         </w:rPr>
-        <w:t>[8</w:t>
-      </w:r>
-      <w:proofErr w:type="gramStart"/>
+        <w:t>[8]</w:t>
+      </w:r>
       <w:r>
         <w:rPr>
           <w:rFonts w:ascii="Times New Roman" w:hAnsi="Times New Roman" w:cs="Times New Roman"/>
         </w:rPr>
-        <w:t>]</w:t>
-      </w:r>
-      <w:r>
+        <w:tab/>
+        <w:t>‘Green Mountain and Hima Seafood launch groundbreaking heat reuse project’, Mynewsdesk. Accessed: Mar. 21, 2026. [Online]. Available: https://www.mynewsdesk.com/green-mountain/pressreleases/green-mountain-and-hima-seafood-launch-groundbreaking-heat-reuse-project-3430566</w:t>
+      </w:r>
+    </w:p>
+    <w:p>
+      <w:pPr>
+        <w:pStyle w:val="Literaturverzeichnis"/>
         <w:rPr>
           <w:rFonts w:ascii="Times New Roman" w:hAnsi="Times New Roman" w:cs="Times New Roman"/>
         </w:rPr>
+      </w:pPr>
+      <w:r>
+        <w:rPr>
+          <w:rFonts w:ascii="Times New Roman" w:hAnsi="Times New Roman" w:cs="Times New Roman"/>
+        </w:rPr>
+        <w:t>[9]</w:t>
+      </w:r>
+      <w:r>
+        <w:rPr>
+          <w:rFonts w:ascii="Times New Roman" w:hAnsi="Times New Roman" w:cs="Times New Roman"/>
+        </w:rPr>
         <w:tab/>
-        <w:t>‘</w:t>
-      </w:r>
-      <w:proofErr w:type="gramEnd"/>
-      <w:r>
+        <w:t>A. Furuset, ‘“The only thing that can save the planet”: Hima Seafood’s bold bet on land-based trout farming’, intrafish.com. Accessed: Mar. 21, 2026. [Online]. Available: https://www.intrafish.com/aquaculture/-the-only-thing-that-can-save-the-planet-hima-seafood-s-bold-bet-on-land-based-trout-farming/2-1-1879098</w:t>
+      </w:r>
+    </w:p>
+    <w:p>
+      <w:pPr>
+        <w:pStyle w:val="Literaturverzeichnis"/>
         <w:rPr>
           <w:rFonts w:ascii="Times New Roman" w:hAnsi="Times New Roman" w:cs="Times New Roman"/>
         </w:rPr>
-        <w:t xml:space="preserve">Green Mountain and Hima Seafood launch groundbreaking heat reuse project’, </w:t>
-      </w:r>
-      <w:proofErr w:type="spellStart"/>
+      </w:pPr>
       <w:r>
         <w:rPr>
           <w:rFonts w:ascii="Times New Roman" w:hAnsi="Times New Roman" w:cs="Times New Roman"/>
         </w:rPr>
-        <w:t>Mynewsdesk</w:t>
-      </w:r>
-      <w:proofErr w:type="spellEnd"/>
+        <w:t>[10]</w:t>
+      </w:r>
       <w:r>
         <w:rPr>
           <w:rFonts w:ascii="Times New Roman" w:hAnsi="Times New Roman" w:cs="Times New Roman"/>
         </w:rPr>
-        <w:t>. Accessed: Mar. 21, 2026. [Online]. Available: https://www.mynewsdesk.com/green-mountain/pressreleases/green-mountain-and-hima-seafood-launch-groundbreaking-heat-reuse-project-3430566</w:t>
+        <w:tab/>
+        <w:t>‘7. FRP Tanks 2’. Accessed: Mar. 21, 2026. [Online]. Available: https://almfiberglass.com/wp-content/uploads/2024/07/7.-FRP-Tanks-2.pdf</w:t>
       </w:r>
     </w:p>
     <w:p>
@@ -14137,28 +12979,35 @@
         <w:rPr>
           <w:rFonts w:ascii="Times New Roman" w:hAnsi="Times New Roman" w:cs="Times New Roman"/>
         </w:rPr>
-        <w:t>[9]</w:t>
+        <w:t>[11]</w:t>
       </w:r>
       <w:r>
         <w:rPr>
           <w:rFonts w:ascii="Times New Roman" w:hAnsi="Times New Roman" w:cs="Times New Roman"/>
         </w:rPr>
         <w:tab/>
-        <w:t xml:space="preserve">A. </w:t>
-      </w:r>
-      <w:proofErr w:type="spellStart"/>
-      <w:r>
+        <w:t>‘U-values’. Accessed: Mar. 21, 2026. [Online]. Available: https://www.designingbuildings.co.uk/wiki/U-values</w:t>
+      </w:r>
+    </w:p>
+    <w:p>
+      <w:pPr>
+        <w:pStyle w:val="Literaturverzeichnis"/>
         <w:rPr>
           <w:rFonts w:ascii="Times New Roman" w:hAnsi="Times New Roman" w:cs="Times New Roman"/>
         </w:rPr>
-        <w:t>Furuset</w:t>
-      </w:r>
-      <w:proofErr w:type="spellEnd"/>
+      </w:pPr>
       <w:r>
         <w:rPr>
           <w:rFonts w:ascii="Times New Roman" w:hAnsi="Times New Roman" w:cs="Times New Roman"/>
         </w:rPr>
-        <w:t>, ‘“The only thing that can save the planet”: Hima Seafood’s bold bet on land-based trout farming’, intrafish.com. Accessed: Mar. 21, 2026. [Online]. Available: https://www.intrafish.com/aquaculture/-the-only-thing-that-can-save-the-planet-hima-seafood-s-bold-bet-on-land-based-trout-farming/2-1-1879098</w:t>
+        <w:t>[12]</w:t>
+      </w:r>
+      <w:r>
+        <w:rPr>
+          <w:rFonts w:ascii="Times New Roman" w:hAnsi="Times New Roman" w:cs="Times New Roman"/>
+        </w:rPr>
+        <w:tab/>
+        <w:t>‘GRP sectional tanks’, Balmoral Tanks. Accessed: Mar. 21, 2026. [Online]. Available: https://www.balmoraltanks.com/solutions/grp-sectional-tanks</w:t>
       </w:r>
     </w:p>
     <w:p>
@@ -14172,28 +13021,56 @@
         <w:rPr>
           <w:rFonts w:ascii="Times New Roman" w:hAnsi="Times New Roman" w:cs="Times New Roman"/>
         </w:rPr>
-        <w:t>[10</w:t>
-      </w:r>
-      <w:proofErr w:type="gramStart"/>
+        <w:t>[13]</w:t>
+      </w:r>
       <w:r>
         <w:rPr>
           <w:rFonts w:ascii="Times New Roman" w:hAnsi="Times New Roman" w:cs="Times New Roman"/>
         </w:rPr>
-        <w:t>]</w:t>
-      </w:r>
-      <w:r>
+        <w:tab/>
+        <w:t>‘Small Scale Rainbow Trout Farming - Ideal Temperature For Rainbow Trout Farming’. Accessed: Mar. 21, 2026. [Online]. Available: https://sites.google.com/view/smallscalerainbowtroutfarm/ideal-temperature-for-rainbow-trout-farming</w:t>
+      </w:r>
+    </w:p>
+    <w:p>
+      <w:pPr>
+        <w:pStyle w:val="Literaturverzeichnis"/>
         <w:rPr>
           <w:rFonts w:ascii="Times New Roman" w:hAnsi="Times New Roman" w:cs="Times New Roman"/>
         </w:rPr>
+      </w:pPr>
+      <w:r>
+        <w:rPr>
+          <w:rFonts w:ascii="Times New Roman" w:hAnsi="Times New Roman" w:cs="Times New Roman"/>
+        </w:rPr>
+        <w:t>[14]</w:t>
+      </w:r>
+      <w:r>
+        <w:rPr>
+          <w:rFonts w:ascii="Times New Roman" w:hAnsi="Times New Roman" w:cs="Times New Roman"/>
+        </w:rPr>
         <w:tab/>
-        <w:t>‘</w:t>
-      </w:r>
-      <w:proofErr w:type="gramEnd"/>
-      <w:r>
+        <w:t>‘5. Marine aquaculture in the Nordics - Nordic Oceans 2050’. Accessed: Mar. 21, 2026. [Online]. Available: https://pub.norden.org/nordicinnovation2025-05/5-marine-aquaculture-in-the-nordics.html</w:t>
+      </w:r>
+    </w:p>
+    <w:p>
+      <w:pPr>
+        <w:pStyle w:val="Literaturverzeichnis"/>
         <w:rPr>
           <w:rFonts w:ascii="Times New Roman" w:hAnsi="Times New Roman" w:cs="Times New Roman"/>
         </w:rPr>
-        <w:t>7. FRP Tanks 2’. Accessed: Mar. 21, 2026. [Online]. Available: https://almfiberglass.com/wp-content/uploads/2024/07/7.-FRP-Tanks-2.pdf</w:t>
+      </w:pPr>
+      <w:r>
+        <w:rPr>
+          <w:rFonts w:ascii="Times New Roman" w:hAnsi="Times New Roman" w:cs="Times New Roman"/>
+        </w:rPr>
+        <w:t>[15]</w:t>
+      </w:r>
+      <w:r>
+        <w:rPr>
+          <w:rFonts w:ascii="Times New Roman" w:hAnsi="Times New Roman" w:cs="Times New Roman"/>
+        </w:rPr>
+        <w:tab/>
+        <w:t>‘Berlevåg Climate, Weather By Month, Average Temperature (Norway) - Weather Spark’. Accessed: Mar. 22, 2026. [Online]. Available: https://weatherspark.com/y/96283/Average-Weather-in-Berlev%C3%A5g-Norway-Year-Round</w:t>
       </w:r>
     </w:p>
     <w:p>
@@ -14207,266 +13084,35 @@
         <w:rPr>
           <w:rFonts w:ascii="Times New Roman" w:hAnsi="Times New Roman" w:cs="Times New Roman"/>
         </w:rPr>
-        <w:t>[11</w:t>
-      </w:r>
-      <w:proofErr w:type="gramStart"/>
+        <w:t>[16]</w:t>
+      </w:r>
       <w:r>
         <w:rPr>
           <w:rFonts w:ascii="Times New Roman" w:hAnsi="Times New Roman" w:cs="Times New Roman"/>
         </w:rPr>
-        <w:t>]</w:t>
-      </w:r>
-      <w:r>
+        <w:tab/>
+        <w:t>‘Visiting Berlevåg: Winds of Change’, Arctic Economic Council. Accessed: Mar. 22, 2026. [Online]. Available: https://arcticeconomiccouncil.com/news/winds-of-change/</w:t>
+      </w:r>
+    </w:p>
+    <w:p>
+      <w:pPr>
+        <w:pStyle w:val="Literaturverzeichnis"/>
         <w:rPr>
           <w:rFonts w:ascii="Times New Roman" w:hAnsi="Times New Roman" w:cs="Times New Roman"/>
         </w:rPr>
+      </w:pPr>
+      <w:r>
+        <w:rPr>
+          <w:rFonts w:ascii="Times New Roman" w:hAnsi="Times New Roman" w:cs="Times New Roman"/>
+        </w:rPr>
+        <w:t>[17]</w:t>
+      </w:r>
+      <w:r>
+        <w:rPr>
+          <w:rFonts w:ascii="Times New Roman" w:hAnsi="Times New Roman" w:cs="Times New Roman"/>
+        </w:rPr>
         <w:tab/>
-        <w:t>‘</w:t>
-      </w:r>
-      <w:proofErr w:type="gramEnd"/>
-      <w:r>
-        <w:rPr>
-          <w:rFonts w:ascii="Times New Roman" w:hAnsi="Times New Roman" w:cs="Times New Roman"/>
-        </w:rPr>
-        <w:t>U-values’. Accessed: Mar. 21, 2026. [Online]. Available: https://www.designingbuildings.co.uk/wiki/U-values</w:t>
-      </w:r>
-    </w:p>
-    <w:p>
-      <w:pPr>
-        <w:pStyle w:val="Literaturverzeichnis"/>
-        <w:rPr>
-          <w:rFonts w:ascii="Times New Roman" w:hAnsi="Times New Roman" w:cs="Times New Roman"/>
-        </w:rPr>
-      </w:pPr>
-      <w:r>
-        <w:rPr>
-          <w:rFonts w:ascii="Times New Roman" w:hAnsi="Times New Roman" w:cs="Times New Roman"/>
-        </w:rPr>
-        <w:t>[12</w:t>
-      </w:r>
-      <w:proofErr w:type="gramStart"/>
-      <w:r>
-        <w:rPr>
-          <w:rFonts w:ascii="Times New Roman" w:hAnsi="Times New Roman" w:cs="Times New Roman"/>
-        </w:rPr>
-        <w:t>]</w:t>
-      </w:r>
-      <w:r>
-        <w:rPr>
-          <w:rFonts w:ascii="Times New Roman" w:hAnsi="Times New Roman" w:cs="Times New Roman"/>
-        </w:rPr>
-        <w:tab/>
-        <w:t>‘</w:t>
-      </w:r>
-      <w:proofErr w:type="gramEnd"/>
-      <w:r>
-        <w:rPr>
-          <w:rFonts w:ascii="Times New Roman" w:hAnsi="Times New Roman" w:cs="Times New Roman"/>
-        </w:rPr>
-        <w:t>GRP sectional tanks’, Balmoral Tanks. Accessed: Mar. 21, 2026. [Online]. Available: https://www.balmoraltanks.com/solutions/grp-sectional-tanks</w:t>
-      </w:r>
-    </w:p>
-    <w:p>
-      <w:pPr>
-        <w:pStyle w:val="Literaturverzeichnis"/>
-        <w:rPr>
-          <w:rFonts w:ascii="Times New Roman" w:hAnsi="Times New Roman" w:cs="Times New Roman"/>
-        </w:rPr>
-      </w:pPr>
-      <w:r>
-        <w:rPr>
-          <w:rFonts w:ascii="Times New Roman" w:hAnsi="Times New Roman" w:cs="Times New Roman"/>
-        </w:rPr>
-        <w:t>[13</w:t>
-      </w:r>
-      <w:proofErr w:type="gramStart"/>
-      <w:r>
-        <w:rPr>
-          <w:rFonts w:ascii="Times New Roman" w:hAnsi="Times New Roman" w:cs="Times New Roman"/>
-        </w:rPr>
-        <w:t>]</w:t>
-      </w:r>
-      <w:r>
-        <w:rPr>
-          <w:rFonts w:ascii="Times New Roman" w:hAnsi="Times New Roman" w:cs="Times New Roman"/>
-        </w:rPr>
-        <w:tab/>
-        <w:t>‘</w:t>
-      </w:r>
-      <w:proofErr w:type="gramEnd"/>
-      <w:r>
-        <w:rPr>
-          <w:rFonts w:ascii="Times New Roman" w:hAnsi="Times New Roman" w:cs="Times New Roman"/>
-        </w:rPr>
-        <w:t xml:space="preserve">Small Scale Rainbow Trout Farming - Ideal Temperature </w:t>
-      </w:r>
-      <w:proofErr w:type="gramStart"/>
-      <w:r>
-        <w:rPr>
-          <w:rFonts w:ascii="Times New Roman" w:hAnsi="Times New Roman" w:cs="Times New Roman"/>
-        </w:rPr>
-        <w:t>For</w:t>
-      </w:r>
-      <w:proofErr w:type="gramEnd"/>
-      <w:r>
-        <w:rPr>
-          <w:rFonts w:ascii="Times New Roman" w:hAnsi="Times New Roman" w:cs="Times New Roman"/>
-        </w:rPr>
-        <w:t xml:space="preserve"> Rainbow Trout Farming’. Accessed: Mar. 21, 2026. [Online]. Available: https://sites.google.com/view/smallscalerainbowtroutfarm/ideal-temperature-for-rainbow-trout-farming</w:t>
-      </w:r>
-    </w:p>
-    <w:p>
-      <w:pPr>
-        <w:pStyle w:val="Literaturverzeichnis"/>
-        <w:rPr>
-          <w:rFonts w:ascii="Times New Roman" w:hAnsi="Times New Roman" w:cs="Times New Roman"/>
-        </w:rPr>
-      </w:pPr>
-      <w:r>
-        <w:rPr>
-          <w:rFonts w:ascii="Times New Roman" w:hAnsi="Times New Roman" w:cs="Times New Roman"/>
-        </w:rPr>
-        <w:t>[14</w:t>
-      </w:r>
-      <w:proofErr w:type="gramStart"/>
-      <w:r>
-        <w:rPr>
-          <w:rFonts w:ascii="Times New Roman" w:hAnsi="Times New Roman" w:cs="Times New Roman"/>
-        </w:rPr>
-        <w:t>]</w:t>
-      </w:r>
-      <w:r>
-        <w:rPr>
-          <w:rFonts w:ascii="Times New Roman" w:hAnsi="Times New Roman" w:cs="Times New Roman"/>
-        </w:rPr>
-        <w:tab/>
-        <w:t>‘</w:t>
-      </w:r>
-      <w:proofErr w:type="gramEnd"/>
-      <w:r>
-        <w:rPr>
-          <w:rFonts w:ascii="Times New Roman" w:hAnsi="Times New Roman" w:cs="Times New Roman"/>
-        </w:rPr>
-        <w:t>5. Marine aquaculture in the Nordics - Nordic Oceans 2050’. Accessed: Mar. 21, 2026. [Online]. Available: https://pub.norden.org/nordicinnovation2025-05/5-marine-aquaculture-in-the-nordics.html</w:t>
-      </w:r>
-    </w:p>
-    <w:p>
-      <w:pPr>
-        <w:pStyle w:val="Literaturverzeichnis"/>
-        <w:rPr>
-          <w:rFonts w:ascii="Times New Roman" w:hAnsi="Times New Roman" w:cs="Times New Roman"/>
-        </w:rPr>
-      </w:pPr>
-      <w:r>
-        <w:rPr>
-          <w:rFonts w:ascii="Times New Roman" w:hAnsi="Times New Roman" w:cs="Times New Roman"/>
-        </w:rPr>
-        <w:t>[15]</w:t>
-      </w:r>
-      <w:r>
-        <w:rPr>
-          <w:rFonts w:ascii="Times New Roman" w:hAnsi="Times New Roman" w:cs="Times New Roman"/>
-        </w:rPr>
-        <w:tab/>
-        <w:t>‘</w:t>
-      </w:r>
-      <w:proofErr w:type="spellStart"/>
-      <w:r>
-        <w:rPr>
-          <w:rFonts w:ascii="Times New Roman" w:hAnsi="Times New Roman" w:cs="Times New Roman"/>
-        </w:rPr>
-        <w:t>Berlevåg</w:t>
-      </w:r>
-      <w:proofErr w:type="spellEnd"/>
-      <w:r>
-        <w:rPr>
-          <w:rFonts w:ascii="Times New Roman" w:hAnsi="Times New Roman" w:cs="Times New Roman"/>
-        </w:rPr>
-        <w:t xml:space="preserve"> Climate, Weather </w:t>
-      </w:r>
-      <w:proofErr w:type="gramStart"/>
-      <w:r>
-        <w:rPr>
-          <w:rFonts w:ascii="Times New Roman" w:hAnsi="Times New Roman" w:cs="Times New Roman"/>
-        </w:rPr>
-        <w:t>By</w:t>
-      </w:r>
-      <w:proofErr w:type="gramEnd"/>
-      <w:r>
-        <w:rPr>
-          <w:rFonts w:ascii="Times New Roman" w:hAnsi="Times New Roman" w:cs="Times New Roman"/>
-        </w:rPr>
-        <w:t xml:space="preserve"> Month, Average Temperature (Norway) - Weather Spark’. Accessed: Mar. 22, 2026. [Online]. Available: https://weatherspark.com/y/96283/Average-Weather-in-Berlev%C3%A5g-Norway-Year-Round</w:t>
-      </w:r>
-    </w:p>
-    <w:p>
-      <w:pPr>
-        <w:pStyle w:val="Literaturverzeichnis"/>
-        <w:rPr>
-          <w:rFonts w:ascii="Times New Roman" w:hAnsi="Times New Roman" w:cs="Times New Roman"/>
-        </w:rPr>
-      </w:pPr>
-      <w:r>
-        <w:rPr>
-          <w:rFonts w:ascii="Times New Roman" w:hAnsi="Times New Roman" w:cs="Times New Roman"/>
-        </w:rPr>
-        <w:t>[16]</w:t>
-      </w:r>
-      <w:r>
-        <w:rPr>
-          <w:rFonts w:ascii="Times New Roman" w:hAnsi="Times New Roman" w:cs="Times New Roman"/>
-        </w:rPr>
-        <w:tab/>
-        <w:t xml:space="preserve">‘Visiting </w:t>
-      </w:r>
-      <w:proofErr w:type="spellStart"/>
-      <w:r>
-        <w:rPr>
-          <w:rFonts w:ascii="Times New Roman" w:hAnsi="Times New Roman" w:cs="Times New Roman"/>
-        </w:rPr>
-        <w:t>Berlevåg</w:t>
-      </w:r>
-      <w:proofErr w:type="spellEnd"/>
-      <w:r>
-        <w:rPr>
-          <w:rFonts w:ascii="Times New Roman" w:hAnsi="Times New Roman" w:cs="Times New Roman"/>
-        </w:rPr>
-        <w:t>: Winds of Change’, Arctic Economic Council. Accessed: Mar. 22, 2026. [Online]. Available: https://arcticeconomiccouncil.com/news/winds-of-change/</w:t>
-      </w:r>
-    </w:p>
-    <w:p>
-      <w:pPr>
-        <w:pStyle w:val="Literaturverzeichnis"/>
-        <w:rPr>
-          <w:rFonts w:ascii="Times New Roman" w:hAnsi="Times New Roman" w:cs="Times New Roman"/>
-        </w:rPr>
-      </w:pPr>
-      <w:r>
-        <w:rPr>
-          <w:rFonts w:ascii="Times New Roman" w:hAnsi="Times New Roman" w:cs="Times New Roman"/>
-        </w:rPr>
-        <w:t>[17</w:t>
-      </w:r>
-      <w:proofErr w:type="gramStart"/>
-      <w:r>
-        <w:rPr>
-          <w:rFonts w:ascii="Times New Roman" w:hAnsi="Times New Roman" w:cs="Times New Roman"/>
-        </w:rPr>
-        <w:t>]</w:t>
-      </w:r>
-      <w:r>
-        <w:rPr>
-          <w:rFonts w:ascii="Times New Roman" w:hAnsi="Times New Roman" w:cs="Times New Roman"/>
-        </w:rPr>
-        <w:tab/>
-        <w:t>‘</w:t>
-      </w:r>
-      <w:proofErr w:type="gramEnd"/>
-      <w:r>
-        <w:rPr>
-          <w:rFonts w:ascii="Times New Roman" w:hAnsi="Times New Roman" w:cs="Times New Roman"/>
-        </w:rPr>
-        <w:t>Lettuce Growing Guide’, Southern Exposure Seed Exchange. Accessed: Mar. 22, 2026. [Online]. Available: https://www.southernexposure.com/lettuce-growing-guide/</w:t>
+        <w:t>‘Lettuce Growing Guide’, Southern Exposure Seed Exchange. Accessed: Mar. 22, 2026. [Online]. Available: https://www.southernexposure.com/lettuce-growing-guide/</w:t>
       </w:r>
     </w:p>
     <w:p>
@@ -14515,21 +13161,29 @@
         <w:rPr>
           <w:rFonts w:ascii="Times New Roman" w:hAnsi="Times New Roman" w:cs="Times New Roman"/>
         </w:rPr>
-        <w:t xml:space="preserve">, vol. 279, p. 127623, Nov. 2025, </w:t>
-      </w:r>
-      <w:proofErr w:type="spellStart"/>
-      <w:r>
+        <w:t>, vol. 279, p. 127623, Nov. 2025, doi: 10.1016/j.applthermaleng.2025.127623.</w:t>
+      </w:r>
+    </w:p>
+    <w:p>
+      <w:pPr>
+        <w:pStyle w:val="Literaturverzeichnis"/>
         <w:rPr>
           <w:rFonts w:ascii="Times New Roman" w:hAnsi="Times New Roman" w:cs="Times New Roman"/>
         </w:rPr>
-        <w:t>doi</w:t>
-      </w:r>
-      <w:proofErr w:type="spellEnd"/>
+      </w:pPr>
       <w:r>
         <w:rPr>
           <w:rFonts w:ascii="Times New Roman" w:hAnsi="Times New Roman" w:cs="Times New Roman"/>
         </w:rPr>
-        <w:t>: 10.1016/j.applthermaleng.2025.127623.</w:t>
+        <w:lastRenderedPageBreak/>
+        <w:t>[19]</w:t>
+      </w:r>
+      <w:r>
+        <w:rPr>
+          <w:rFonts w:ascii="Times New Roman" w:hAnsi="Times New Roman" w:cs="Times New Roman"/>
+        </w:rPr>
+        <w:tab/>
+        <w:t>‘U-Value Calculator : ChangePlan’. Accessed: Mar. 22, 2026. [Online]. Available: https://www.changeplan.co.uk/u_value_calculator.php</w:t>
       </w:r>
     </w:p>
     <w:p>
@@ -14543,106 +13197,14 @@
         <w:rPr>
           <w:rFonts w:ascii="Times New Roman" w:hAnsi="Times New Roman" w:cs="Times New Roman"/>
         </w:rPr>
-        <w:lastRenderedPageBreak/>
-        <w:t>[19</w:t>
-      </w:r>
-      <w:proofErr w:type="gramStart"/>
+        <w:t>[20]</w:t>
+      </w:r>
       <w:r>
         <w:rPr>
           <w:rFonts w:ascii="Times New Roman" w:hAnsi="Times New Roman" w:cs="Times New Roman"/>
         </w:rPr>
-        <w:t>]</w:t>
-      </w:r>
-      <w:r>
-        <w:rPr>
-          <w:rFonts w:ascii="Times New Roman" w:hAnsi="Times New Roman" w:cs="Times New Roman"/>
-        </w:rPr>
         <w:tab/>
-        <w:t>‘</w:t>
-      </w:r>
-      <w:proofErr w:type="gramEnd"/>
-      <w:r>
-        <w:rPr>
-          <w:rFonts w:ascii="Times New Roman" w:hAnsi="Times New Roman" w:cs="Times New Roman"/>
-        </w:rPr>
-        <w:t xml:space="preserve">U-Value </w:t>
-      </w:r>
-      <w:proofErr w:type="gramStart"/>
-      <w:r>
-        <w:rPr>
-          <w:rFonts w:ascii="Times New Roman" w:hAnsi="Times New Roman" w:cs="Times New Roman"/>
-        </w:rPr>
-        <w:t>Calculator :</w:t>
-      </w:r>
-      <w:proofErr w:type="gramEnd"/>
-      <w:r>
-        <w:rPr>
-          <w:rFonts w:ascii="Times New Roman" w:hAnsi="Times New Roman" w:cs="Times New Roman"/>
-        </w:rPr>
-        <w:t xml:space="preserve"> </w:t>
-      </w:r>
-      <w:proofErr w:type="spellStart"/>
-      <w:r>
-        <w:rPr>
-          <w:rFonts w:ascii="Times New Roman" w:hAnsi="Times New Roman" w:cs="Times New Roman"/>
-        </w:rPr>
-        <w:t>ChangePlan</w:t>
-      </w:r>
-      <w:proofErr w:type="spellEnd"/>
-      <w:r>
-        <w:rPr>
-          <w:rFonts w:ascii="Times New Roman" w:hAnsi="Times New Roman" w:cs="Times New Roman"/>
-        </w:rPr>
-        <w:t>’. Accessed: Mar. 22, 2026. [Online]. Available: https://www.changeplan.co.uk/u_value_calculator.php</w:t>
-      </w:r>
-    </w:p>
-    <w:p>
-      <w:pPr>
-        <w:pStyle w:val="Literaturverzeichnis"/>
-        <w:rPr>
-          <w:rFonts w:ascii="Times New Roman" w:hAnsi="Times New Roman" w:cs="Times New Roman"/>
-        </w:rPr>
-      </w:pPr>
-      <w:r>
-        <w:rPr>
-          <w:rFonts w:ascii="Times New Roman" w:hAnsi="Times New Roman" w:cs="Times New Roman"/>
-        </w:rPr>
-        <w:t>[20</w:t>
-      </w:r>
-      <w:proofErr w:type="gramStart"/>
-      <w:r>
-        <w:rPr>
-          <w:rFonts w:ascii="Times New Roman" w:hAnsi="Times New Roman" w:cs="Times New Roman"/>
-        </w:rPr>
-        <w:t>]</w:t>
-      </w:r>
-      <w:r>
-        <w:rPr>
-          <w:rFonts w:ascii="Times New Roman" w:hAnsi="Times New Roman" w:cs="Times New Roman"/>
-        </w:rPr>
-        <w:tab/>
-        <w:t>‘</w:t>
-      </w:r>
-      <w:proofErr w:type="gramEnd"/>
-      <w:r>
-        <w:rPr>
-          <w:rFonts w:ascii="Times New Roman" w:hAnsi="Times New Roman" w:cs="Times New Roman"/>
-        </w:rPr>
-        <w:t xml:space="preserve">Home’, </w:t>
-      </w:r>
-      <w:proofErr w:type="spellStart"/>
-      <w:r>
-        <w:rPr>
-          <w:rFonts w:ascii="Times New Roman" w:hAnsi="Times New Roman" w:cs="Times New Roman"/>
-        </w:rPr>
-        <w:t>Greenphyto</w:t>
-      </w:r>
-      <w:proofErr w:type="spellEnd"/>
-      <w:r>
-        <w:rPr>
-          <w:rFonts w:ascii="Times New Roman" w:hAnsi="Times New Roman" w:cs="Times New Roman"/>
-        </w:rPr>
-        <w:t>. Accessed: Mar. 25, 2026. [Online]. Available: https://greenphyto.com/</w:t>
+        <w:t>‘Home’, Greenphyto. Accessed: Mar. 25, 2026. [Online]. Available: https://greenphyto.com/</w:t>
       </w:r>
     </w:p>
     <w:p>
@@ -14697,21 +13259,28 @@
           <w:rFonts w:ascii="Times New Roman" w:hAnsi="Times New Roman" w:cs="Times New Roman"/>
         </w:rPr>
         <w:tab/>
-        <w:t xml:space="preserve">A. </w:t>
-      </w:r>
-      <w:proofErr w:type="gramStart"/>
-      <w:r>
+        <w:t>A. Dmitry, ‘Effect of water quality on rainbow trout performance’.</w:t>
+      </w:r>
+    </w:p>
+    <w:p>
+      <w:pPr>
+        <w:pStyle w:val="Literaturverzeichnis"/>
         <w:rPr>
           <w:rFonts w:ascii="Times New Roman" w:hAnsi="Times New Roman" w:cs="Times New Roman"/>
         </w:rPr>
-        <w:t>Dmitry, ‘</w:t>
-      </w:r>
-      <w:proofErr w:type="gramEnd"/>
+      </w:pPr>
       <w:r>
         <w:rPr>
           <w:rFonts w:ascii="Times New Roman" w:hAnsi="Times New Roman" w:cs="Times New Roman"/>
         </w:rPr>
-        <w:t>Effect of water quality on rainbow trout performance’.</w:t>
+        <w:t>[23]</w:t>
+      </w:r>
+      <w:r>
+        <w:rPr>
+          <w:rFonts w:ascii="Times New Roman" w:hAnsi="Times New Roman" w:cs="Times New Roman"/>
+        </w:rPr>
+        <w:tab/>
+        <w:t>‘Haeolus – Hydrogen-Aeolic Energy with Optimised eLectrolysers Upstream of Substation’. Accessed: Mar. 06, 2026. [Online]. Available: https://haeolus.eu/</w:t>
       </w:r>
     </w:p>
     <w:p>
@@ -14725,119 +13294,14 @@
         <w:rPr>
           <w:rFonts w:ascii="Times New Roman" w:hAnsi="Times New Roman" w:cs="Times New Roman"/>
         </w:rPr>
-        <w:t>[23]</w:t>
+        <w:t>[24]</w:t>
       </w:r>
       <w:r>
         <w:rPr>
           <w:rFonts w:ascii="Times New Roman" w:hAnsi="Times New Roman" w:cs="Times New Roman"/>
         </w:rPr>
         <w:tab/>
-        <w:t>‘</w:t>
-      </w:r>
-      <w:proofErr w:type="spellStart"/>
-      <w:r>
-        <w:rPr>
-          <w:rFonts w:ascii="Times New Roman" w:hAnsi="Times New Roman" w:cs="Times New Roman"/>
-        </w:rPr>
-        <w:t>Haeolus</w:t>
-      </w:r>
-      <w:proofErr w:type="spellEnd"/>
-      <w:r>
-        <w:rPr>
-          <w:rFonts w:ascii="Times New Roman" w:hAnsi="Times New Roman" w:cs="Times New Roman"/>
-        </w:rPr>
-        <w:t xml:space="preserve"> – Hydrogen-Aeolic Energy with </w:t>
-      </w:r>
-      <w:proofErr w:type="spellStart"/>
-      <w:r>
-        <w:rPr>
-          <w:rFonts w:ascii="Times New Roman" w:hAnsi="Times New Roman" w:cs="Times New Roman"/>
-        </w:rPr>
-        <w:t>Optimised</w:t>
-      </w:r>
-      <w:proofErr w:type="spellEnd"/>
-      <w:r>
-        <w:rPr>
-          <w:rFonts w:ascii="Times New Roman" w:hAnsi="Times New Roman" w:cs="Times New Roman"/>
-        </w:rPr>
-        <w:t xml:space="preserve"> </w:t>
-      </w:r>
-      <w:proofErr w:type="spellStart"/>
-      <w:r>
-        <w:rPr>
-          <w:rFonts w:ascii="Times New Roman" w:hAnsi="Times New Roman" w:cs="Times New Roman"/>
-        </w:rPr>
-        <w:t>eLectrolysers</w:t>
-      </w:r>
-      <w:proofErr w:type="spellEnd"/>
-      <w:r>
-        <w:rPr>
-          <w:rFonts w:ascii="Times New Roman" w:hAnsi="Times New Roman" w:cs="Times New Roman"/>
-        </w:rPr>
-        <w:t xml:space="preserve"> Upstream of Substation’. Accessed: Mar. 06, 2026. [Online]. Available: https://haeolus.eu/</w:t>
-      </w:r>
-    </w:p>
-    <w:p>
-      <w:pPr>
-        <w:pStyle w:val="Literaturverzeichnis"/>
-        <w:rPr>
-          <w:rFonts w:ascii="Times New Roman" w:hAnsi="Times New Roman" w:cs="Times New Roman"/>
-        </w:rPr>
-      </w:pPr>
-      <w:r>
-        <w:rPr>
-          <w:rFonts w:ascii="Times New Roman" w:hAnsi="Times New Roman" w:cs="Times New Roman"/>
-        </w:rPr>
-        <w:t>[24]</w:t>
-      </w:r>
-      <w:r>
-        <w:rPr>
-          <w:rFonts w:ascii="Times New Roman" w:hAnsi="Times New Roman" w:cs="Times New Roman"/>
-        </w:rPr>
-        <w:tab/>
-        <w:t xml:space="preserve">D. </w:t>
-      </w:r>
-      <w:proofErr w:type="spellStart"/>
-      <w:r>
-        <w:rPr>
-          <w:rFonts w:ascii="Times New Roman" w:hAnsi="Times New Roman" w:cs="Times New Roman"/>
-        </w:rPr>
-        <w:t>Virah</w:t>
-      </w:r>
-      <w:proofErr w:type="spellEnd"/>
-      <w:r>
-        <w:rPr>
-          <w:rFonts w:ascii="Times New Roman" w:hAnsi="Times New Roman" w:cs="Times New Roman"/>
-        </w:rPr>
-        <w:t xml:space="preserve">-Sawmy, F. J. Beck, and B. </w:t>
-      </w:r>
-      <w:proofErr w:type="spellStart"/>
-      <w:r>
-        <w:rPr>
-          <w:rFonts w:ascii="Times New Roman" w:hAnsi="Times New Roman" w:cs="Times New Roman"/>
-        </w:rPr>
-        <w:t>Sturmberg</w:t>
-      </w:r>
-      <w:proofErr w:type="spellEnd"/>
-      <w:r>
-        <w:rPr>
-          <w:rFonts w:ascii="Times New Roman" w:hAnsi="Times New Roman" w:cs="Times New Roman"/>
-        </w:rPr>
-        <w:t xml:space="preserve">, ‘Ignore variability, overestimate hydrogen production – Quantifying the effects of </w:t>
-      </w:r>
-      <w:proofErr w:type="spellStart"/>
-      <w:r>
-        <w:rPr>
-          <w:rFonts w:ascii="Times New Roman" w:hAnsi="Times New Roman" w:cs="Times New Roman"/>
-        </w:rPr>
-        <w:t>electrolyzer</w:t>
-      </w:r>
-      <w:proofErr w:type="spellEnd"/>
-      <w:r>
-        <w:rPr>
-          <w:rFonts w:ascii="Times New Roman" w:hAnsi="Times New Roman" w:cs="Times New Roman"/>
-        </w:rPr>
-        <w:t xml:space="preserve"> efficiency curves on hydrogen production from renewable energy sources’, </w:t>
+        <w:t xml:space="preserve">D. Virah-Sawmy, F. J. Beck, and B. Sturmberg, ‘Ignore variability, overestimate hydrogen production – Quantifying the effects of electrolyzer efficiency curves on hydrogen production from renewable energy sources’, </w:t>
       </w:r>
       <w:r>
         <w:rPr>
@@ -14845,80 +13309,34 @@
           <w:i/>
           <w:iCs/>
         </w:rPr>
-        <w:t xml:space="preserve">Int. J. </w:t>
-      </w:r>
-      <w:proofErr w:type="spellStart"/>
+        <w:t>Int. J. Hydrog. Energy</w:t>
+      </w:r>
       <w:r>
         <w:rPr>
           <w:rFonts w:ascii="Times New Roman" w:hAnsi="Times New Roman" w:cs="Times New Roman"/>
-          <w:i/>
-          <w:iCs/>
-        </w:rPr>
-        <w:t>Hydrog</w:t>
-      </w:r>
-      <w:proofErr w:type="spellEnd"/>
-      <w:r>
+        </w:rPr>
+        <w:t>, vol. 72, pp. 49–59, Jun. 2024, doi: 10.1016/j.ijhydene.2024.05.360.</w:t>
+      </w:r>
+    </w:p>
+    <w:p>
+      <w:pPr>
+        <w:pStyle w:val="Literaturverzeichnis"/>
         <w:rPr>
           <w:rFonts w:ascii="Times New Roman" w:hAnsi="Times New Roman" w:cs="Times New Roman"/>
-          <w:i/>
-          <w:iCs/>
-        </w:rPr>
-        <w:t>. Energy</w:t>
-      </w:r>
+        </w:rPr>
+      </w:pPr>
       <w:r>
         <w:rPr>
           <w:rFonts w:ascii="Times New Roman" w:hAnsi="Times New Roman" w:cs="Times New Roman"/>
         </w:rPr>
-        <w:t xml:space="preserve">, vol. 72, pp. 49–59, Jun. 2024, </w:t>
-      </w:r>
-      <w:proofErr w:type="spellStart"/>
+        <w:t>[25]</w:t>
+      </w:r>
       <w:r>
         <w:rPr>
           <w:rFonts w:ascii="Times New Roman" w:hAnsi="Times New Roman" w:cs="Times New Roman"/>
         </w:rPr>
-        <w:t>doi</w:t>
-      </w:r>
-      <w:proofErr w:type="spellEnd"/>
-      <w:r>
-        <w:rPr>
-          <w:rFonts w:ascii="Times New Roman" w:hAnsi="Times New Roman" w:cs="Times New Roman"/>
-        </w:rPr>
-        <w:t>: 10.1016/j.ijhydene.2024.05.360.</w:t>
-      </w:r>
-    </w:p>
-    <w:p>
-      <w:pPr>
-        <w:pStyle w:val="Literaturverzeichnis"/>
-        <w:rPr>
-          <w:rFonts w:ascii="Times New Roman" w:hAnsi="Times New Roman" w:cs="Times New Roman"/>
-        </w:rPr>
-      </w:pPr>
-      <w:r>
-        <w:rPr>
-          <w:rFonts w:ascii="Times New Roman" w:hAnsi="Times New Roman" w:cs="Times New Roman"/>
-        </w:rPr>
-        <w:t>[25]</w:t>
-      </w:r>
-      <w:r>
-        <w:rPr>
-          <w:rFonts w:ascii="Times New Roman" w:hAnsi="Times New Roman" w:cs="Times New Roman"/>
-        </w:rPr>
         <w:tab/>
-        <w:t xml:space="preserve">A. </w:t>
-      </w:r>
-      <w:proofErr w:type="spellStart"/>
-      <w:r>
-        <w:rPr>
-          <w:rFonts w:ascii="Times New Roman" w:hAnsi="Times New Roman" w:cs="Times New Roman"/>
-        </w:rPr>
-        <w:t>Godula</w:t>
-      </w:r>
-      <w:proofErr w:type="spellEnd"/>
-      <w:r>
-        <w:rPr>
-          <w:rFonts w:ascii="Times New Roman" w:hAnsi="Times New Roman" w:cs="Times New Roman"/>
-        </w:rPr>
-        <w:t xml:space="preserve">-Jopek, </w:t>
+        <w:t xml:space="preserve">A. Godula-Jopek, </w:t>
       </w:r>
       <w:r>
         <w:rPr>
@@ -19222,6 +17640,7 @@
   <w:style w:type="character" w:default="1" w:styleId="Absatz-Standardschriftart">
     <w:name w:val="Default Paragraph Font"/>
     <w:uiPriority w:val="1"/>
+    <w:semiHidden/>
     <w:unhideWhenUsed/>
   </w:style>
   <w:style w:type="table" w:default="1" w:styleId="NormaleTabelle">

</xml_diff>